<commit_message>
Update build progress log for Phase 3
</commit_message>
<xml_diff>
--- a/docs/Build-Progress-Log.docx
+++ b/docs/Build-Progress-Log.docx
@@ -86,7 +86,7 @@
           <w:sz w:val="22"/>
           <w:szCs w:val="22"/>
         </w:rPr>
-        <w:t xml:space="preserve">Status: Phases 0, 1, 2 complete  —  next: Phase 3 (Synthetic referral documents)</w:t>
+        <w:t xml:space="preserve">Status: Phases 0, 1, 2, 3 complete  —  next: Phase 4 (Extraction &amp; Agentic AI service)</w:t>
       </w:r>
     </w:p>
     <w:p>
@@ -1607,6 +1607,17 @@
         </w:rPr>
         <w:t xml:space="preserve">docs/testing/phase2-acceptance.md</w:t>
       </w:r>
+      <w:r>
+        <w:t xml:space="preserve">  ·  </w:t>
+      </w:r>
+      <w:r>
+        <w:rPr>
+          <w:rFonts w:ascii="Consolas" w:cs="Consolas" w:eastAsia="Consolas" w:hAnsi="Consolas"/>
+          <w:sz w:val="20"/>
+          <w:szCs w:val="20"/>
+        </w:rPr>
+        <w:t xml:space="preserve">docs/testing/phase3-acceptance.md</w:t>
+      </w:r>
     </w:p>
     <w:p>
       <w:r>
@@ -3936,6 +3947,1716 @@
       </w:pPr>
       <w:r>
         <w:t xml:space="preserve">The duplicate-target patient (Arthur Reed) needs a pre-existing Referral encounter to be detectable as a duplicate. That is seeded in Phase 6/8 once the Referral encounter type + concepts exist.</w:t>
+      </w:r>
+    </w:p>
+    <w:p>
+      <w:r>
+        <w:br w:type="page"/>
+      </w:r>
+    </w:p>
+    <w:p>
+      <w:pPr>
+        <w:pStyle w:val="Heading1"/>
+      </w:pPr>
+      <w:r>
+        <w:t xml:space="preserve">Phase 3 — Synthetic Referral Documents &amp; Expected Outcomes</w:t>
+      </w:r>
+    </w:p>
+    <w:p>
+      <w:pPr>
+        <w:pStyle w:val="Heading3"/>
+      </w:pPr>
+      <w:r>
+        <w:t xml:space="preserve">What was built</w:t>
+      </w:r>
+    </w:p>
+    <w:p>
+      <w:pPr>
+        <w:pStyle w:val="ListParagraph"/>
+        <w:numPr>
+          <w:ilvl w:val="0"/>
+          <w:numId w:val="3"/>
+        </w:numPr>
+        <w:spacing w:after="60"/>
+      </w:pPr>
+      <w:r>
+        <w:t xml:space="preserve">15 synthetic GP referral documents (REF-001…REF-015) in data/input-referrals/ — the 'incoming letters' the bot will process. 14 are realistic referral letters (.txt) with a 'SYNTHETIC TEST DATA' banner; REF-015 is a deliberately corrupt PDF.</w:t>
+      </w:r>
+    </w:p>
+    <w:p>
+      <w:pPr>
+        <w:pStyle w:val="ListParagraph"/>
+        <w:numPr>
+          <w:ilvl w:val="0"/>
+          <w:numId w:val="3"/>
+        </w:numPr>
+        <w:spacing w:after="60"/>
+      </w:pPr>
+      <w:r>
+        <w:t xml:space="preserve">15 machine-readable expected-outcome files (data/expected-outcomes/REF-NNN.expected.json) — the test oracle that says, for each referral, what the correct extraction, patient-match result, safety flags, decision and final status should be.</w:t>
+      </w:r>
+    </w:p>
+    <w:p>
+      <w:pPr>
+        <w:pStyle w:val="ListParagraph"/>
+        <w:numPr>
+          <w:ilvl w:val="0"/>
+          <w:numId w:val="3"/>
+        </w:numPr>
+        <w:spacing w:after="60"/>
+      </w:pPr>
+      <w:r>
+        <w:t xml:space="preserve">Every referral is wired to a real Phase-2 seeded patient (or a reserved no-match fixture), so the scenarios exercise the actual data already in OpenMRS.</w:t>
+      </w:r>
+    </w:p>
+    <w:p>
+      <w:pPr>
+        <w:pStyle w:val="ListParagraph"/>
+        <w:numPr>
+          <w:ilvl w:val="0"/>
+          <w:numId w:val="3"/>
+        </w:numPr>
+        <w:spacing w:after="60"/>
+      </w:pPr>
+      <w:r>
+        <w:t xml:space="preserve">Expected-outcome files live OUTSIDE input-referrals/ on purpose, so the Phase 8 dispatcher never mistakes an oracle file for a referral to ingest.</w:t>
+      </w:r>
+    </w:p>
+    <w:p>
+      <w:pPr>
+        <w:pStyle w:val="Heading3"/>
+      </w:pPr>
+      <w:r>
+        <w:t xml:space="preserve">Files created</w:t>
+      </w:r>
+    </w:p>
+    <w:tbl>
+      <w:tblPr>
+        <w:tblW w:type="dxa" w:w="9360"/>
+        <w:tblBorders>
+          <w:top w:val="single" w:color="auto" w:sz="4"/>
+          <w:left w:val="single" w:color="auto" w:sz="4"/>
+          <w:bottom w:val="single" w:color="auto" w:sz="4"/>
+          <w:right w:val="single" w:color="auto" w:sz="4"/>
+          <w:insideH w:val="single" w:color="auto" w:sz="4"/>
+          <w:insideV w:val="single" w:color="auto" w:sz="4"/>
+        </w:tblBorders>
+      </w:tblPr>
+      <w:tblGrid>
+        <w:gridCol w:w="4900"/>
+        <w:gridCol w:w="4460"/>
+      </w:tblGrid>
+      <w:tr>
+        <w:trPr>
+          <w:tblHeader/>
+        </w:trPr>
+        <w:tc>
+          <w:tcPr>
+            <w:tcW w:type="dxa" w:w="4900"/>
+            <w:tcBorders>
+              <w:top w:val="single" w:color="BBBBBB" w:sz="1"/>
+              <w:left w:val="single" w:color="BBBBBB" w:sz="1"/>
+              <w:bottom w:val="single" w:color="BBBBBB" w:sz="1"/>
+              <w:right w:val="single" w:color="BBBBBB" w:sz="1"/>
+            </w:tcBorders>
+            <w:shd w:fill="D5E8F0" w:val="clear"/>
+            <w:tcMar>
+              <w:top w:type="dxa" w:w="60"/>
+              <w:left w:type="dxa" w:w="110"/>
+              <w:bottom w:type="dxa" w:w="60"/>
+              <w:right w:type="dxa" w:w="110"/>
+            </w:tcMar>
+          </w:tcPr>
+          <w:p>
+            <w:r>
+              <w:rPr>
+                <w:b/>
+                <w:bCs/>
+                <w:sz w:val="20"/>
+                <w:szCs w:val="20"/>
+              </w:rPr>
+              <w:t xml:space="preserve">File</w:t>
+            </w:r>
+          </w:p>
+        </w:tc>
+        <w:tc>
+          <w:tcPr>
+            <w:tcW w:type="dxa" w:w="4460"/>
+            <w:tcBorders>
+              <w:top w:val="single" w:color="BBBBBB" w:sz="1"/>
+              <w:left w:val="single" w:color="BBBBBB" w:sz="1"/>
+              <w:bottom w:val="single" w:color="BBBBBB" w:sz="1"/>
+              <w:right w:val="single" w:color="BBBBBB" w:sz="1"/>
+            </w:tcBorders>
+            <w:shd w:fill="D5E8F0" w:val="clear"/>
+            <w:tcMar>
+              <w:top w:type="dxa" w:w="60"/>
+              <w:left w:type="dxa" w:w="110"/>
+              <w:bottom w:type="dxa" w:w="60"/>
+              <w:right w:type="dxa" w:w="110"/>
+            </w:tcMar>
+          </w:tcPr>
+          <w:p>
+            <w:r>
+              <w:rPr>
+                <w:b/>
+                <w:bCs/>
+                <w:sz w:val="20"/>
+                <w:szCs w:val="20"/>
+              </w:rPr>
+              <w:t xml:space="preserve">Purpose</w:t>
+            </w:r>
+          </w:p>
+        </w:tc>
+      </w:tr>
+      <w:tr>
+        <w:trPr>
+          <w:tblHeader w:val="false"/>
+        </w:trPr>
+        <w:tc>
+          <w:tcPr>
+            <w:tcW w:type="dxa" w:w="4900"/>
+            <w:tcBorders>
+              <w:top w:val="single" w:color="BBBBBB" w:sz="1"/>
+              <w:left w:val="single" w:color="BBBBBB" w:sz="1"/>
+              <w:bottom w:val="single" w:color="BBBBBB" w:sz="1"/>
+              <w:right w:val="single" w:color="BBBBBB" w:sz="1"/>
+            </w:tcBorders>
+            <w:tcMar>
+              <w:top w:type="dxa" w:w="60"/>
+              <w:left w:type="dxa" w:w="110"/>
+              <w:bottom w:type="dxa" w:w="60"/>
+              <w:right w:type="dxa" w:w="110"/>
+            </w:tcMar>
+          </w:tcPr>
+          <w:p>
+            <w:r>
+              <w:rPr>
+                <w:sz w:val="20"/>
+                <w:szCs w:val="20"/>
+              </w:rPr>
+              <w:t xml:space="preserve">data/input-referrals/REF-001…015 (.txt/.pdf)</w:t>
+            </w:r>
+          </w:p>
+        </w:tc>
+        <w:tc>
+          <w:tcPr>
+            <w:tcW w:type="dxa" w:w="4460"/>
+            <w:tcBorders>
+              <w:top w:val="single" w:color="BBBBBB" w:sz="1"/>
+              <w:left w:val="single" w:color="BBBBBB" w:sz="1"/>
+              <w:bottom w:val="single" w:color="BBBBBB" w:sz="1"/>
+              <w:right w:val="single" w:color="BBBBBB" w:sz="1"/>
+            </w:tcBorders>
+            <w:tcMar>
+              <w:top w:type="dxa" w:w="60"/>
+              <w:left w:type="dxa" w:w="110"/>
+              <w:bottom w:type="dxa" w:w="60"/>
+              <w:right w:type="dxa" w:w="110"/>
+            </w:tcMar>
+          </w:tcPr>
+          <w:p>
+            <w:r>
+              <w:rPr>
+                <w:sz w:val="20"/>
+                <w:szCs w:val="20"/>
+              </w:rPr>
+              <w:t xml:space="preserve">The 15 synthetic referral documents</w:t>
+            </w:r>
+          </w:p>
+        </w:tc>
+      </w:tr>
+      <w:tr>
+        <w:trPr>
+          <w:tblHeader w:val="false"/>
+        </w:trPr>
+        <w:tc>
+          <w:tcPr>
+            <w:tcW w:type="dxa" w:w="4900"/>
+            <w:tcBorders>
+              <w:top w:val="single" w:color="BBBBBB" w:sz="1"/>
+              <w:left w:val="single" w:color="BBBBBB" w:sz="1"/>
+              <w:bottom w:val="single" w:color="BBBBBB" w:sz="1"/>
+              <w:right w:val="single" w:color="BBBBBB" w:sz="1"/>
+            </w:tcBorders>
+            <w:tcMar>
+              <w:top w:type="dxa" w:w="60"/>
+              <w:left w:type="dxa" w:w="110"/>
+              <w:bottom w:type="dxa" w:w="60"/>
+              <w:right w:type="dxa" w:w="110"/>
+            </w:tcMar>
+          </w:tcPr>
+          <w:p>
+            <w:r>
+              <w:rPr>
+                <w:sz w:val="20"/>
+                <w:szCs w:val="20"/>
+              </w:rPr>
+              <w:t xml:space="preserve">data/expected-outcomes/REF-001…015.expected.json</w:t>
+            </w:r>
+          </w:p>
+        </w:tc>
+        <w:tc>
+          <w:tcPr>
+            <w:tcW w:type="dxa" w:w="4460"/>
+            <w:tcBorders>
+              <w:top w:val="single" w:color="BBBBBB" w:sz="1"/>
+              <w:left w:val="single" w:color="BBBBBB" w:sz="1"/>
+              <w:bottom w:val="single" w:color="BBBBBB" w:sz="1"/>
+              <w:right w:val="single" w:color="BBBBBB" w:sz="1"/>
+            </w:tcBorders>
+            <w:tcMar>
+              <w:top w:type="dxa" w:w="60"/>
+              <w:left w:type="dxa" w:w="110"/>
+              <w:bottom w:type="dxa" w:w="60"/>
+              <w:right w:type="dxa" w:w="110"/>
+            </w:tcMar>
+          </w:tcPr>
+          <w:p>
+            <w:r>
+              <w:rPr>
+                <w:sz w:val="20"/>
+                <w:szCs w:val="20"/>
+              </w:rPr>
+              <w:t xml:space="preserve">Per-referral expected result (test oracle)</w:t>
+            </w:r>
+          </w:p>
+        </w:tc>
+      </w:tr>
+      <w:tr>
+        <w:trPr>
+          <w:tblHeader w:val="false"/>
+        </w:trPr>
+        <w:tc>
+          <w:tcPr>
+            <w:tcW w:type="dxa" w:w="4900"/>
+            <w:tcBorders>
+              <w:top w:val="single" w:color="BBBBBB" w:sz="1"/>
+              <w:left w:val="single" w:color="BBBBBB" w:sz="1"/>
+              <w:bottom w:val="single" w:color="BBBBBB" w:sz="1"/>
+              <w:right w:val="single" w:color="BBBBBB" w:sz="1"/>
+            </w:tcBorders>
+            <w:tcMar>
+              <w:top w:type="dxa" w:w="60"/>
+              <w:left w:type="dxa" w:w="110"/>
+              <w:bottom w:type="dxa" w:w="60"/>
+              <w:right w:type="dxa" w:w="110"/>
+            </w:tcMar>
+          </w:tcPr>
+          <w:p>
+            <w:r>
+              <w:rPr>
+                <w:sz w:val="20"/>
+                <w:szCs w:val="20"/>
+              </w:rPr>
+              <w:t xml:space="preserve">data/expected-outcomes/README.md</w:t>
+            </w:r>
+          </w:p>
+        </w:tc>
+        <w:tc>
+          <w:tcPr>
+            <w:tcW w:type="dxa" w:w="4460"/>
+            <w:tcBorders>
+              <w:top w:val="single" w:color="BBBBBB" w:sz="1"/>
+              <w:left w:val="single" w:color="BBBBBB" w:sz="1"/>
+              <w:bottom w:val="single" w:color="BBBBBB" w:sz="1"/>
+              <w:right w:val="single" w:color="BBBBBB" w:sz="1"/>
+            </w:tcBorders>
+            <w:tcMar>
+              <w:top w:type="dxa" w:w="60"/>
+              <w:left w:type="dxa" w:w="110"/>
+              <w:bottom w:type="dxa" w:w="60"/>
+              <w:right w:type="dxa" w:w="110"/>
+            </w:tcMar>
+          </w:tcPr>
+          <w:p>
+            <w:r>
+              <w:rPr>
+                <w:sz w:val="20"/>
+                <w:szCs w:val="20"/>
+              </w:rPr>
+              <w:t xml:space="preserve">Oracle schema + full scenario matrix + coverage</w:t>
+            </w:r>
+          </w:p>
+        </w:tc>
+      </w:tr>
+      <w:tr>
+        <w:trPr>
+          <w:tblHeader w:val="false"/>
+        </w:trPr>
+        <w:tc>
+          <w:tcPr>
+            <w:tcW w:type="dxa" w:w="4900"/>
+            <w:tcBorders>
+              <w:top w:val="single" w:color="BBBBBB" w:sz="1"/>
+              <w:left w:val="single" w:color="BBBBBB" w:sz="1"/>
+              <w:bottom w:val="single" w:color="BBBBBB" w:sz="1"/>
+              <w:right w:val="single" w:color="BBBBBB" w:sz="1"/>
+            </w:tcBorders>
+            <w:tcMar>
+              <w:top w:type="dxa" w:w="60"/>
+              <w:left w:type="dxa" w:w="110"/>
+              <w:bottom w:type="dxa" w:w="60"/>
+              <w:right w:type="dxa" w:w="110"/>
+            </w:tcMar>
+          </w:tcPr>
+          <w:p>
+            <w:r>
+              <w:rPr>
+                <w:sz w:val="20"/>
+                <w:szCs w:val="20"/>
+              </w:rPr>
+              <w:t xml:space="preserve">docs/testing/phase3-acceptance.md</w:t>
+            </w:r>
+          </w:p>
+        </w:tc>
+        <w:tc>
+          <w:tcPr>
+            <w:tcW w:type="dxa" w:w="4460"/>
+            <w:tcBorders>
+              <w:top w:val="single" w:color="BBBBBB" w:sz="1"/>
+              <w:left w:val="single" w:color="BBBBBB" w:sz="1"/>
+              <w:bottom w:val="single" w:color="BBBBBB" w:sz="1"/>
+              <w:right w:val="single" w:color="BBBBBB" w:sz="1"/>
+            </w:tcBorders>
+            <w:tcMar>
+              <w:top w:type="dxa" w:w="60"/>
+              <w:left w:type="dxa" w:w="110"/>
+              <w:bottom w:type="dxa" w:w="60"/>
+              <w:right w:type="dxa" w:w="110"/>
+            </w:tcMar>
+          </w:tcPr>
+          <w:p>
+            <w:r>
+              <w:rPr>
+                <w:sz w:val="20"/>
+                <w:szCs w:val="20"/>
+              </w:rPr>
+              <w:t xml:space="preserve">Acceptance evidence</w:t>
+            </w:r>
+          </w:p>
+        </w:tc>
+      </w:tr>
+    </w:tbl>
+    <w:p>
+      <w:pPr>
+        <w:pStyle w:val="Heading3"/>
+      </w:pPr>
+      <w:r>
+        <w:t xml:space="preserve">Scenario coverage (the 15 cases)</w:t>
+      </w:r>
+    </w:p>
+    <w:p>
+      <w:pPr>
+        <w:spacing w:after="120"/>
+      </w:pPr>
+      <w:r>
+        <w:t xml:space="preserve">Spread across all four bot decisions and every safety routing reason:</w:t>
+      </w:r>
+    </w:p>
+    <w:tbl>
+      <w:tblPr>
+        <w:tblW w:type="dxa" w:w="9360"/>
+        <w:tblBorders>
+          <w:top w:val="single" w:color="auto" w:sz="4"/>
+          <w:left w:val="single" w:color="auto" w:sz="4"/>
+          <w:bottom w:val="single" w:color="auto" w:sz="4"/>
+          <w:right w:val="single" w:color="auto" w:sz="4"/>
+          <w:insideH w:val="single" w:color="auto" w:sz="4"/>
+          <w:insideV w:val="single" w:color="auto" w:sz="4"/>
+        </w:tblBorders>
+      </w:tblPr>
+      <w:tblGrid>
+        <w:gridCol w:w="1500"/>
+        <w:gridCol w:w="6360"/>
+        <w:gridCol w:w="1500"/>
+      </w:tblGrid>
+      <w:tr>
+        <w:trPr>
+          <w:tblHeader/>
+        </w:trPr>
+        <w:tc>
+          <w:tcPr>
+            <w:tcW w:type="dxa" w:w="1500"/>
+            <w:tcBorders>
+              <w:top w:val="single" w:color="BBBBBB" w:sz="1"/>
+              <w:left w:val="single" w:color="BBBBBB" w:sz="1"/>
+              <w:bottom w:val="single" w:color="BBBBBB" w:sz="1"/>
+              <w:right w:val="single" w:color="BBBBBB" w:sz="1"/>
+            </w:tcBorders>
+            <w:shd w:fill="D5E8F0" w:val="clear"/>
+            <w:tcMar>
+              <w:top w:type="dxa" w:w="60"/>
+              <w:left w:type="dxa" w:w="110"/>
+              <w:bottom w:type="dxa" w:w="60"/>
+              <w:right w:type="dxa" w:w="110"/>
+            </w:tcMar>
+          </w:tcPr>
+          <w:p>
+            <w:r>
+              <w:rPr>
+                <w:b/>
+                <w:bCs/>
+                <w:sz w:val="20"/>
+                <w:szCs w:val="20"/>
+              </w:rPr>
+              <w:t xml:space="preserve">Ref</w:t>
+            </w:r>
+          </w:p>
+        </w:tc>
+        <w:tc>
+          <w:tcPr>
+            <w:tcW w:type="dxa" w:w="6360"/>
+            <w:tcBorders>
+              <w:top w:val="single" w:color="BBBBBB" w:sz="1"/>
+              <w:left w:val="single" w:color="BBBBBB" w:sz="1"/>
+              <w:bottom w:val="single" w:color="BBBBBB" w:sz="1"/>
+              <w:right w:val="single" w:color="BBBBBB" w:sz="1"/>
+            </w:tcBorders>
+            <w:shd w:fill="D5E8F0" w:val="clear"/>
+            <w:tcMar>
+              <w:top w:type="dxa" w:w="60"/>
+              <w:left w:type="dxa" w:w="110"/>
+              <w:bottom w:type="dxa" w:w="60"/>
+              <w:right w:type="dxa" w:w="110"/>
+            </w:tcMar>
+          </w:tcPr>
+          <w:p>
+            <w:r>
+              <w:rPr>
+                <w:b/>
+                <w:bCs/>
+                <w:sz w:val="20"/>
+                <w:szCs w:val="20"/>
+              </w:rPr>
+              <w:t xml:space="preserve">Scenario</w:t>
+            </w:r>
+          </w:p>
+        </w:tc>
+        <w:tc>
+          <w:tcPr>
+            <w:tcW w:type="dxa" w:w="1500"/>
+            <w:tcBorders>
+              <w:top w:val="single" w:color="BBBBBB" w:sz="1"/>
+              <w:left w:val="single" w:color="BBBBBB" w:sz="1"/>
+              <w:bottom w:val="single" w:color="BBBBBB" w:sz="1"/>
+              <w:right w:val="single" w:color="BBBBBB" w:sz="1"/>
+            </w:tcBorders>
+            <w:shd w:fill="D5E8F0" w:val="clear"/>
+            <w:tcMar>
+              <w:top w:type="dxa" w:w="60"/>
+              <w:left w:type="dxa" w:w="110"/>
+              <w:bottom w:type="dxa" w:w="60"/>
+              <w:right w:type="dxa" w:w="110"/>
+            </w:tcMar>
+          </w:tcPr>
+          <w:p>
+            <w:r>
+              <w:rPr>
+                <w:b/>
+                <w:bCs/>
+                <w:sz w:val="20"/>
+                <w:szCs w:val="20"/>
+              </w:rPr>
+              <w:t xml:space="preserve">Bot decision</w:t>
+            </w:r>
+          </w:p>
+        </w:tc>
+      </w:tr>
+      <w:tr>
+        <w:trPr>
+          <w:tblHeader w:val="false"/>
+        </w:trPr>
+        <w:tc>
+          <w:tcPr>
+            <w:tcW w:type="dxa" w:w="1500"/>
+            <w:tcBorders>
+              <w:top w:val="single" w:color="BBBBBB" w:sz="1"/>
+              <w:left w:val="single" w:color="BBBBBB" w:sz="1"/>
+              <w:bottom w:val="single" w:color="BBBBBB" w:sz="1"/>
+              <w:right w:val="single" w:color="BBBBBB" w:sz="1"/>
+            </w:tcBorders>
+            <w:tcMar>
+              <w:top w:type="dxa" w:w="60"/>
+              <w:left w:type="dxa" w:w="110"/>
+              <w:bottom w:type="dxa" w:w="60"/>
+              <w:right w:type="dxa" w:w="110"/>
+            </w:tcMar>
+          </w:tcPr>
+          <w:p>
+            <w:r>
+              <w:rPr>
+                <w:sz w:val="20"/>
+                <w:szCs w:val="20"/>
+              </w:rPr>
+              <w:t xml:space="preserve">001 / 002 / 003</w:t>
+            </w:r>
+          </w:p>
+        </w:tc>
+        <w:tc>
+          <w:tcPr>
+            <w:tcW w:type="dxa" w:w="6360"/>
+            <w:tcBorders>
+              <w:top w:val="single" w:color="BBBBBB" w:sz="1"/>
+              <w:left w:val="single" w:color="BBBBBB" w:sz="1"/>
+              <w:bottom w:val="single" w:color="BBBBBB" w:sz="1"/>
+              <w:right w:val="single" w:color="BBBBBB" w:sz="1"/>
+            </w:tcBorders>
+            <w:tcMar>
+              <w:top w:type="dxa" w:w="60"/>
+              <w:left w:type="dxa" w:w="110"/>
+              <w:bottom w:type="dxa" w:w="60"/>
+              <w:right w:type="dxa" w:w="110"/>
+            </w:tcMar>
+          </w:tcPr>
+          <w:p>
+            <w:r>
+              <w:rPr>
+                <w:sz w:val="20"/>
+                <w:szCs w:val="20"/>
+              </w:rPr>
+              <w:t xml:space="preserve">Clean exact match, complete, routine (Bennett / Davies / Clarke)</w:t>
+            </w:r>
+          </w:p>
+        </w:tc>
+        <w:tc>
+          <w:tcPr>
+            <w:tcW w:type="dxa" w:w="1500"/>
+            <w:tcBorders>
+              <w:top w:val="single" w:color="BBBBBB" w:sz="1"/>
+              <w:left w:val="single" w:color="BBBBBB" w:sz="1"/>
+              <w:bottom w:val="single" w:color="BBBBBB" w:sz="1"/>
+              <w:right w:val="single" w:color="BBBBBB" w:sz="1"/>
+            </w:tcBorders>
+            <w:tcMar>
+              <w:top w:type="dxa" w:w="60"/>
+              <w:left w:type="dxa" w:w="110"/>
+              <w:bottom w:type="dxa" w:w="60"/>
+              <w:right w:type="dxa" w:w="110"/>
+            </w:tcMar>
+          </w:tcPr>
+          <w:p>
+            <w:r>
+              <w:rPr>
+                <w:sz w:val="20"/>
+                <w:szCs w:val="20"/>
+              </w:rPr>
+              <w:t xml:space="preserve">AUTO_CREATE_REFERRAL_RECORD</w:t>
+            </w:r>
+          </w:p>
+        </w:tc>
+      </w:tr>
+      <w:tr>
+        <w:trPr>
+          <w:tblHeader w:val="false"/>
+        </w:trPr>
+        <w:tc>
+          <w:tcPr>
+            <w:tcW w:type="dxa" w:w="1500"/>
+            <w:tcBorders>
+              <w:top w:val="single" w:color="BBBBBB" w:sz="1"/>
+              <w:left w:val="single" w:color="BBBBBB" w:sz="1"/>
+              <w:bottom w:val="single" w:color="BBBBBB" w:sz="1"/>
+              <w:right w:val="single" w:color="BBBBBB" w:sz="1"/>
+            </w:tcBorders>
+            <w:tcMar>
+              <w:top w:type="dxa" w:w="60"/>
+              <w:left w:type="dxa" w:w="110"/>
+              <w:bottom w:type="dxa" w:w="60"/>
+              <w:right w:type="dxa" w:w="110"/>
+            </w:tcMar>
+          </w:tcPr>
+          <w:p>
+            <w:r>
+              <w:rPr>
+                <w:sz w:val="20"/>
+                <w:szCs w:val="20"/>
+              </w:rPr>
+              <w:t xml:space="preserve">004</w:t>
+            </w:r>
+          </w:p>
+        </w:tc>
+        <w:tc>
+          <w:tcPr>
+            <w:tcW w:type="dxa" w:w="6360"/>
+            <w:tcBorders>
+              <w:top w:val="single" w:color="BBBBBB" w:sz="1"/>
+              <w:left w:val="single" w:color="BBBBBB" w:sz="1"/>
+              <w:bottom w:val="single" w:color="BBBBBB" w:sz="1"/>
+              <w:right w:val="single" w:color="BBBBBB" w:sz="1"/>
+            </w:tcBorders>
+            <w:tcMar>
+              <w:top w:type="dxa" w:w="60"/>
+              <w:left w:type="dxa" w:w="110"/>
+              <w:bottom w:type="dxa" w:w="60"/>
+              <w:right w:type="dxa" w:w="110"/>
+            </w:tcMar>
+          </w:tcPr>
+          <w:p>
+            <w:r>
+              <w:rPr>
+                <w:sz w:val="20"/>
+                <w:szCs w:val="20"/>
+              </w:rPr>
+              <w:t xml:space="preserve">DOB mismatch (Ruby Shaw — NHS matches, DOB differs)</w:t>
+            </w:r>
+          </w:p>
+        </w:tc>
+        <w:tc>
+          <w:tcPr>
+            <w:tcW w:type="dxa" w:w="1500"/>
+            <w:tcBorders>
+              <w:top w:val="single" w:color="BBBBBB" w:sz="1"/>
+              <w:left w:val="single" w:color="BBBBBB" w:sz="1"/>
+              <w:bottom w:val="single" w:color="BBBBBB" w:sz="1"/>
+              <w:right w:val="single" w:color="BBBBBB" w:sz="1"/>
+            </w:tcBorders>
+            <w:tcMar>
+              <w:top w:type="dxa" w:w="60"/>
+              <w:left w:type="dxa" w:w="110"/>
+              <w:bottom w:type="dxa" w:w="60"/>
+              <w:right w:type="dxa" w:w="110"/>
+            </w:tcMar>
+          </w:tcPr>
+          <w:p>
+            <w:r>
+              <w:rPr>
+                <w:sz w:val="20"/>
+                <w:szCs w:val="20"/>
+              </w:rPr>
+              <w:t xml:space="preserve">HUMAN_REVIEW_REQUIRED</w:t>
+            </w:r>
+          </w:p>
+        </w:tc>
+      </w:tr>
+      <w:tr>
+        <w:trPr>
+          <w:tblHeader w:val="false"/>
+        </w:trPr>
+        <w:tc>
+          <w:tcPr>
+            <w:tcW w:type="dxa" w:w="1500"/>
+            <w:tcBorders>
+              <w:top w:val="single" w:color="BBBBBB" w:sz="1"/>
+              <w:left w:val="single" w:color="BBBBBB" w:sz="1"/>
+              <w:bottom w:val="single" w:color="BBBBBB" w:sz="1"/>
+              <w:right w:val="single" w:color="BBBBBB" w:sz="1"/>
+            </w:tcBorders>
+            <w:tcMar>
+              <w:top w:type="dxa" w:w="60"/>
+              <w:left w:type="dxa" w:w="110"/>
+              <w:bottom w:type="dxa" w:w="60"/>
+              <w:right w:type="dxa" w:w="110"/>
+            </w:tcMar>
+          </w:tcPr>
+          <w:p>
+            <w:r>
+              <w:rPr>
+                <w:sz w:val="20"/>
+                <w:szCs w:val="20"/>
+              </w:rPr>
+              <w:t xml:space="preserve">005</w:t>
+            </w:r>
+          </w:p>
+        </w:tc>
+        <w:tc>
+          <w:tcPr>
+            <w:tcW w:type="dxa" w:w="6360"/>
+            <w:tcBorders>
+              <w:top w:val="single" w:color="BBBBBB" w:sz="1"/>
+              <w:left w:val="single" w:color="BBBBBB" w:sz="1"/>
+              <w:bottom w:val="single" w:color="BBBBBB" w:sz="1"/>
+              <w:right w:val="single" w:color="BBBBBB" w:sz="1"/>
+            </w:tcBorders>
+            <w:tcMar>
+              <w:top w:type="dxa" w:w="60"/>
+              <w:left w:type="dxa" w:w="110"/>
+              <w:bottom w:type="dxa" w:w="60"/>
+              <w:right w:type="dxa" w:w="110"/>
+            </w:tcMar>
+          </w:tcPr>
+          <w:p>
+            <w:r>
+              <w:rPr>
+                <w:sz w:val="20"/>
+                <w:szCs w:val="20"/>
+              </w:rPr>
+              <w:t xml:space="preserve">Partial match (Leo Hamilton — no NHS number, demographic discrepancy)</w:t>
+            </w:r>
+          </w:p>
+        </w:tc>
+        <w:tc>
+          <w:tcPr>
+            <w:tcW w:type="dxa" w:w="1500"/>
+            <w:tcBorders>
+              <w:top w:val="single" w:color="BBBBBB" w:sz="1"/>
+              <w:left w:val="single" w:color="BBBBBB" w:sz="1"/>
+              <w:bottom w:val="single" w:color="BBBBBB" w:sz="1"/>
+              <w:right w:val="single" w:color="BBBBBB" w:sz="1"/>
+            </w:tcBorders>
+            <w:tcMar>
+              <w:top w:type="dxa" w:w="60"/>
+              <w:left w:type="dxa" w:w="110"/>
+              <w:bottom w:type="dxa" w:w="60"/>
+              <w:right w:type="dxa" w:w="110"/>
+            </w:tcMar>
+          </w:tcPr>
+          <w:p>
+            <w:r>
+              <w:rPr>
+                <w:sz w:val="20"/>
+                <w:szCs w:val="20"/>
+              </w:rPr>
+              <w:t xml:space="preserve">HUMAN_REVIEW_REQUIRED</w:t>
+            </w:r>
+          </w:p>
+        </w:tc>
+      </w:tr>
+      <w:tr>
+        <w:trPr>
+          <w:tblHeader w:val="false"/>
+        </w:trPr>
+        <w:tc>
+          <w:tcPr>
+            <w:tcW w:type="dxa" w:w="1500"/>
+            <w:tcBorders>
+              <w:top w:val="single" w:color="BBBBBB" w:sz="1"/>
+              <w:left w:val="single" w:color="BBBBBB" w:sz="1"/>
+              <w:bottom w:val="single" w:color="BBBBBB" w:sz="1"/>
+              <w:right w:val="single" w:color="BBBBBB" w:sz="1"/>
+            </w:tcBorders>
+            <w:tcMar>
+              <w:top w:type="dxa" w:w="60"/>
+              <w:left w:type="dxa" w:w="110"/>
+              <w:bottom w:type="dxa" w:w="60"/>
+              <w:right w:type="dxa" w:w="110"/>
+            </w:tcMar>
+          </w:tcPr>
+          <w:p>
+            <w:r>
+              <w:rPr>
+                <w:sz w:val="20"/>
+                <w:szCs w:val="20"/>
+              </w:rPr>
+              <w:t xml:space="preserve">006</w:t>
+            </w:r>
+          </w:p>
+        </w:tc>
+        <w:tc>
+          <w:tcPr>
+            <w:tcW w:type="dxa" w:w="6360"/>
+            <w:tcBorders>
+              <w:top w:val="single" w:color="BBBBBB" w:sz="1"/>
+              <w:left w:val="single" w:color="BBBBBB" w:sz="1"/>
+              <w:bottom w:val="single" w:color="BBBBBB" w:sz="1"/>
+              <w:right w:val="single" w:color="BBBBBB" w:sz="1"/>
+            </w:tcBorders>
+            <w:tcMar>
+              <w:top w:type="dxa" w:w="60"/>
+              <w:left w:type="dxa" w:w="110"/>
+              <w:bottom w:type="dxa" w:w="60"/>
+              <w:right w:type="dxa" w:w="110"/>
+            </w:tcMar>
+          </w:tcPr>
+          <w:p>
+            <w:r>
+              <w:rPr>
+                <w:sz w:val="20"/>
+                <w:szCs w:val="20"/>
+              </w:rPr>
+              <w:t xml:space="preserve">Multiple candidates (two 'Helen Walsh', same DOB)</w:t>
+            </w:r>
+          </w:p>
+        </w:tc>
+        <w:tc>
+          <w:tcPr>
+            <w:tcW w:type="dxa" w:w="1500"/>
+            <w:tcBorders>
+              <w:top w:val="single" w:color="BBBBBB" w:sz="1"/>
+              <w:left w:val="single" w:color="BBBBBB" w:sz="1"/>
+              <w:bottom w:val="single" w:color="BBBBBB" w:sz="1"/>
+              <w:right w:val="single" w:color="BBBBBB" w:sz="1"/>
+            </w:tcBorders>
+            <w:tcMar>
+              <w:top w:type="dxa" w:w="60"/>
+              <w:left w:type="dxa" w:w="110"/>
+              <w:bottom w:type="dxa" w:w="60"/>
+              <w:right w:type="dxa" w:w="110"/>
+            </w:tcMar>
+          </w:tcPr>
+          <w:p>
+            <w:r>
+              <w:rPr>
+                <w:sz w:val="20"/>
+                <w:szCs w:val="20"/>
+              </w:rPr>
+              <w:t xml:space="preserve">HUMAN_REVIEW_REQUIRED</w:t>
+            </w:r>
+          </w:p>
+        </w:tc>
+      </w:tr>
+      <w:tr>
+        <w:trPr>
+          <w:tblHeader w:val="false"/>
+        </w:trPr>
+        <w:tc>
+          <w:tcPr>
+            <w:tcW w:type="dxa" w:w="1500"/>
+            <w:tcBorders>
+              <w:top w:val="single" w:color="BBBBBB" w:sz="1"/>
+              <w:left w:val="single" w:color="BBBBBB" w:sz="1"/>
+              <w:bottom w:val="single" w:color="BBBBBB" w:sz="1"/>
+              <w:right w:val="single" w:color="BBBBBB" w:sz="1"/>
+            </w:tcBorders>
+            <w:tcMar>
+              <w:top w:type="dxa" w:w="60"/>
+              <w:left w:type="dxa" w:w="110"/>
+              <w:bottom w:type="dxa" w:w="60"/>
+              <w:right w:type="dxa" w:w="110"/>
+            </w:tcMar>
+          </w:tcPr>
+          <w:p>
+            <w:r>
+              <w:rPr>
+                <w:sz w:val="20"/>
+                <w:szCs w:val="20"/>
+              </w:rPr>
+              <w:t xml:space="preserve">007</w:t>
+            </w:r>
+          </w:p>
+        </w:tc>
+        <w:tc>
+          <w:tcPr>
+            <w:tcW w:type="dxa" w:w="6360"/>
+            <w:tcBorders>
+              <w:top w:val="single" w:color="BBBBBB" w:sz="1"/>
+              <w:left w:val="single" w:color="BBBBBB" w:sz="1"/>
+              <w:bottom w:val="single" w:color="BBBBBB" w:sz="1"/>
+              <w:right w:val="single" w:color="BBBBBB" w:sz="1"/>
+            </w:tcBorders>
+            <w:tcMar>
+              <w:top w:type="dxa" w:w="60"/>
+              <w:left w:type="dxa" w:w="110"/>
+              <w:bottom w:type="dxa" w:w="60"/>
+              <w:right w:type="dxa" w:w="110"/>
+            </w:tcMar>
+          </w:tcPr>
+          <w:p>
+            <w:r>
+              <w:rPr>
+                <w:sz w:val="20"/>
+                <w:szCs w:val="20"/>
+              </w:rPr>
+              <w:t xml:space="preserve">Duplicate referral (Arthur Reed — existing active Cardiology)</w:t>
+            </w:r>
+          </w:p>
+        </w:tc>
+        <w:tc>
+          <w:tcPr>
+            <w:tcW w:type="dxa" w:w="1500"/>
+            <w:tcBorders>
+              <w:top w:val="single" w:color="BBBBBB" w:sz="1"/>
+              <w:left w:val="single" w:color="BBBBBB" w:sz="1"/>
+              <w:bottom w:val="single" w:color="BBBBBB" w:sz="1"/>
+              <w:right w:val="single" w:color="BBBBBB" w:sz="1"/>
+            </w:tcBorders>
+            <w:tcMar>
+              <w:top w:type="dxa" w:w="60"/>
+              <w:left w:type="dxa" w:w="110"/>
+              <w:bottom w:type="dxa" w:w="60"/>
+              <w:right w:type="dxa" w:w="110"/>
+            </w:tcMar>
+          </w:tcPr>
+          <w:p>
+            <w:r>
+              <w:rPr>
+                <w:sz w:val="20"/>
+                <w:szCs w:val="20"/>
+              </w:rPr>
+              <w:t xml:space="preserve">HUMAN_REVIEW_REQUIRED</w:t>
+            </w:r>
+          </w:p>
+        </w:tc>
+      </w:tr>
+      <w:tr>
+        <w:trPr>
+          <w:tblHeader w:val="false"/>
+        </w:trPr>
+        <w:tc>
+          <w:tcPr>
+            <w:tcW w:type="dxa" w:w="1500"/>
+            <w:tcBorders>
+              <w:top w:val="single" w:color="BBBBBB" w:sz="1"/>
+              <w:left w:val="single" w:color="BBBBBB" w:sz="1"/>
+              <w:bottom w:val="single" w:color="BBBBBB" w:sz="1"/>
+              <w:right w:val="single" w:color="BBBBBB" w:sz="1"/>
+            </w:tcBorders>
+            <w:tcMar>
+              <w:top w:type="dxa" w:w="60"/>
+              <w:left w:type="dxa" w:w="110"/>
+              <w:bottom w:type="dxa" w:w="60"/>
+              <w:right w:type="dxa" w:w="110"/>
+            </w:tcMar>
+          </w:tcPr>
+          <w:p>
+            <w:r>
+              <w:rPr>
+                <w:sz w:val="20"/>
+                <w:szCs w:val="20"/>
+              </w:rPr>
+              <w:t xml:space="preserve">008</w:t>
+            </w:r>
+          </w:p>
+        </w:tc>
+        <w:tc>
+          <w:tcPr>
+            <w:tcW w:type="dxa" w:w="6360"/>
+            <w:tcBorders>
+              <w:top w:val="single" w:color="BBBBBB" w:sz="1"/>
+              <w:left w:val="single" w:color="BBBBBB" w:sz="1"/>
+              <w:bottom w:val="single" w:color="BBBBBB" w:sz="1"/>
+              <w:right w:val="single" w:color="BBBBBB" w:sz="1"/>
+            </w:tcBorders>
+            <w:tcMar>
+              <w:top w:type="dxa" w:w="60"/>
+              <w:left w:type="dxa" w:w="110"/>
+              <w:bottom w:type="dxa" w:w="60"/>
+              <w:right w:type="dxa" w:w="110"/>
+            </w:tcMar>
+          </w:tcPr>
+          <w:p>
+            <w:r>
+              <w:rPr>
+                <w:sz w:val="20"/>
+                <w:szCs w:val="20"/>
+              </w:rPr>
+              <w:t xml:space="preserve">Urgent 2-week-wait suspected cancer (Stanley Knight)</w:t>
+            </w:r>
+          </w:p>
+        </w:tc>
+        <w:tc>
+          <w:tcPr>
+            <w:tcW w:type="dxa" w:w="1500"/>
+            <w:tcBorders>
+              <w:top w:val="single" w:color="BBBBBB" w:sz="1"/>
+              <w:left w:val="single" w:color="BBBBBB" w:sz="1"/>
+              <w:bottom w:val="single" w:color="BBBBBB" w:sz="1"/>
+              <w:right w:val="single" w:color="BBBBBB" w:sz="1"/>
+            </w:tcBorders>
+            <w:tcMar>
+              <w:top w:type="dxa" w:w="60"/>
+              <w:left w:type="dxa" w:w="110"/>
+              <w:bottom w:type="dxa" w:w="60"/>
+              <w:right w:type="dxa" w:w="110"/>
+            </w:tcMar>
+          </w:tcPr>
+          <w:p>
+            <w:r>
+              <w:rPr>
+                <w:sz w:val="20"/>
+                <w:szCs w:val="20"/>
+              </w:rPr>
+              <w:t xml:space="preserve">HUMAN_REVIEW_REQUIRED</w:t>
+            </w:r>
+          </w:p>
+        </w:tc>
+      </w:tr>
+      <w:tr>
+        <w:trPr>
+          <w:tblHeader w:val="false"/>
+        </w:trPr>
+        <w:tc>
+          <w:tcPr>
+            <w:tcW w:type="dxa" w:w="1500"/>
+            <w:tcBorders>
+              <w:top w:val="single" w:color="BBBBBB" w:sz="1"/>
+              <w:left w:val="single" w:color="BBBBBB" w:sz="1"/>
+              <w:bottom w:val="single" w:color="BBBBBB" w:sz="1"/>
+              <w:right w:val="single" w:color="BBBBBB" w:sz="1"/>
+            </w:tcBorders>
+            <w:tcMar>
+              <w:top w:type="dxa" w:w="60"/>
+              <w:left w:type="dxa" w:w="110"/>
+              <w:bottom w:type="dxa" w:w="60"/>
+              <w:right w:type="dxa" w:w="110"/>
+            </w:tcMar>
+          </w:tcPr>
+          <w:p>
+            <w:r>
+              <w:rPr>
+                <w:sz w:val="20"/>
+                <w:szCs w:val="20"/>
+              </w:rPr>
+              <w:t xml:space="preserve">009</w:t>
+            </w:r>
+          </w:p>
+        </w:tc>
+        <w:tc>
+          <w:tcPr>
+            <w:tcW w:type="dxa" w:w="6360"/>
+            <w:tcBorders>
+              <w:top w:val="single" w:color="BBBBBB" w:sz="1"/>
+              <w:left w:val="single" w:color="BBBBBB" w:sz="1"/>
+              <w:bottom w:val="single" w:color="BBBBBB" w:sz="1"/>
+              <w:right w:val="single" w:color="BBBBBB" w:sz="1"/>
+            </w:tcBorders>
+            <w:tcMar>
+              <w:top w:type="dxa" w:w="60"/>
+              <w:left w:type="dxa" w:w="110"/>
+              <w:bottom w:type="dxa" w:w="60"/>
+              <w:right w:type="dxa" w:w="110"/>
+            </w:tcMar>
+          </w:tcPr>
+          <w:p>
+            <w:r>
+              <w:rPr>
+                <w:sz w:val="20"/>
+                <w:szCs w:val="20"/>
+              </w:rPr>
+              <w:t xml:space="preserve">Safeguarding / child (Florence Cole, DOB 2018)</w:t>
+            </w:r>
+          </w:p>
+        </w:tc>
+        <w:tc>
+          <w:tcPr>
+            <w:tcW w:type="dxa" w:w="1500"/>
+            <w:tcBorders>
+              <w:top w:val="single" w:color="BBBBBB" w:sz="1"/>
+              <w:left w:val="single" w:color="BBBBBB" w:sz="1"/>
+              <w:bottom w:val="single" w:color="BBBBBB" w:sz="1"/>
+              <w:right w:val="single" w:color="BBBBBB" w:sz="1"/>
+            </w:tcBorders>
+            <w:tcMar>
+              <w:top w:type="dxa" w:w="60"/>
+              <w:left w:type="dxa" w:w="110"/>
+              <w:bottom w:type="dxa" w:w="60"/>
+              <w:right w:type="dxa" w:w="110"/>
+            </w:tcMar>
+          </w:tcPr>
+          <w:p>
+            <w:r>
+              <w:rPr>
+                <w:sz w:val="20"/>
+                <w:szCs w:val="20"/>
+              </w:rPr>
+              <w:t xml:space="preserve">HUMAN_REVIEW_REQUIRED</w:t>
+            </w:r>
+          </w:p>
+        </w:tc>
+      </w:tr>
+      <w:tr>
+        <w:trPr>
+          <w:tblHeader w:val="false"/>
+        </w:trPr>
+        <w:tc>
+          <w:tcPr>
+            <w:tcW w:type="dxa" w:w="1500"/>
+            <w:tcBorders>
+              <w:top w:val="single" w:color="BBBBBB" w:sz="1"/>
+              <w:left w:val="single" w:color="BBBBBB" w:sz="1"/>
+              <w:bottom w:val="single" w:color="BBBBBB" w:sz="1"/>
+              <w:right w:val="single" w:color="BBBBBB" w:sz="1"/>
+            </w:tcBorders>
+            <w:tcMar>
+              <w:top w:type="dxa" w:w="60"/>
+              <w:left w:type="dxa" w:w="110"/>
+              <w:bottom w:type="dxa" w:w="60"/>
+              <w:right w:type="dxa" w:w="110"/>
+            </w:tcMar>
+          </w:tcPr>
+          <w:p>
+            <w:r>
+              <w:rPr>
+                <w:sz w:val="20"/>
+                <w:szCs w:val="20"/>
+              </w:rPr>
+              <w:t xml:space="preserve">010 / 011</w:t>
+            </w:r>
+          </w:p>
+        </w:tc>
+        <w:tc>
+          <w:tcPr>
+            <w:tcW w:type="dxa" w:w="6360"/>
+            <w:tcBorders>
+              <w:top w:val="single" w:color="BBBBBB" w:sz="1"/>
+              <w:left w:val="single" w:color="BBBBBB" w:sz="1"/>
+              <w:bottom w:val="single" w:color="BBBBBB" w:sz="1"/>
+              <w:right w:val="single" w:color="BBBBBB" w:sz="1"/>
+            </w:tcBorders>
+            <w:tcMar>
+              <w:top w:type="dxa" w:w="60"/>
+              <w:left w:type="dxa" w:w="110"/>
+              <w:bottom w:type="dxa" w:w="60"/>
+              <w:right w:type="dxa" w:w="110"/>
+            </w:tcMar>
+          </w:tcPr>
+          <w:p>
+            <w:r>
+              <w:rPr>
+                <w:sz w:val="20"/>
+                <w:szCs w:val="20"/>
+              </w:rPr>
+              <w:t xml:space="preserve">No match — not in OpenMRS (Maria Fernandes / Ibrahim Osei)</w:t>
+            </w:r>
+          </w:p>
+        </w:tc>
+        <w:tc>
+          <w:tcPr>
+            <w:tcW w:type="dxa" w:w="1500"/>
+            <w:tcBorders>
+              <w:top w:val="single" w:color="BBBBBB" w:sz="1"/>
+              <w:left w:val="single" w:color="BBBBBB" w:sz="1"/>
+              <w:bottom w:val="single" w:color="BBBBBB" w:sz="1"/>
+              <w:right w:val="single" w:color="BBBBBB" w:sz="1"/>
+            </w:tcBorders>
+            <w:tcMar>
+              <w:top w:type="dxa" w:w="60"/>
+              <w:left w:type="dxa" w:w="110"/>
+              <w:bottom w:type="dxa" w:w="60"/>
+              <w:right w:type="dxa" w:w="110"/>
+            </w:tcMar>
+          </w:tcPr>
+          <w:p>
+            <w:r>
+              <w:rPr>
+                <w:sz w:val="20"/>
+                <w:szCs w:val="20"/>
+              </w:rPr>
+              <w:t xml:space="preserve">HUMAN_REVIEW_REQUIRED</w:t>
+            </w:r>
+          </w:p>
+        </w:tc>
+      </w:tr>
+      <w:tr>
+        <w:trPr>
+          <w:tblHeader w:val="false"/>
+        </w:trPr>
+        <w:tc>
+          <w:tcPr>
+            <w:tcW w:type="dxa" w:w="1500"/>
+            <w:tcBorders>
+              <w:top w:val="single" w:color="BBBBBB" w:sz="1"/>
+              <w:left w:val="single" w:color="BBBBBB" w:sz="1"/>
+              <w:bottom w:val="single" w:color="BBBBBB" w:sz="1"/>
+              <w:right w:val="single" w:color="BBBBBB" w:sz="1"/>
+            </w:tcBorders>
+            <w:tcMar>
+              <w:top w:type="dxa" w:w="60"/>
+              <w:left w:type="dxa" w:w="110"/>
+              <w:bottom w:type="dxa" w:w="60"/>
+              <w:right w:type="dxa" w:w="110"/>
+            </w:tcMar>
+          </w:tcPr>
+          <w:p>
+            <w:r>
+              <w:rPr>
+                <w:sz w:val="20"/>
+                <w:szCs w:val="20"/>
+              </w:rPr>
+              <w:t xml:space="preserve">012</w:t>
+            </w:r>
+          </w:p>
+        </w:tc>
+        <w:tc>
+          <w:tcPr>
+            <w:tcW w:type="dxa" w:w="6360"/>
+            <w:tcBorders>
+              <w:top w:val="single" w:color="BBBBBB" w:sz="1"/>
+              <w:left w:val="single" w:color="BBBBBB" w:sz="1"/>
+              <w:bottom w:val="single" w:color="BBBBBB" w:sz="1"/>
+              <w:right w:val="single" w:color="BBBBBB" w:sz="1"/>
+            </w:tcBorders>
+            <w:tcMar>
+              <w:top w:type="dxa" w:w="60"/>
+              <w:left w:type="dxa" w:w="110"/>
+              <w:bottom w:type="dxa" w:w="60"/>
+              <w:right w:type="dxa" w:w="110"/>
+            </w:tcMar>
+          </w:tcPr>
+          <w:p>
+            <w:r>
+              <w:rPr>
+                <w:sz w:val="20"/>
+                <w:szCs w:val="20"/>
+              </w:rPr>
+              <w:t xml:space="preserve">Incomplete — missing speciality/priority/reason (Daniel Owen)</w:t>
+            </w:r>
+          </w:p>
+        </w:tc>
+        <w:tc>
+          <w:tcPr>
+            <w:tcW w:type="dxa" w:w="1500"/>
+            <w:tcBorders>
+              <w:top w:val="single" w:color="BBBBBB" w:sz="1"/>
+              <w:left w:val="single" w:color="BBBBBB" w:sz="1"/>
+              <w:bottom w:val="single" w:color="BBBBBB" w:sz="1"/>
+              <w:right w:val="single" w:color="BBBBBB" w:sz="1"/>
+            </w:tcBorders>
+            <w:tcMar>
+              <w:top w:type="dxa" w:w="60"/>
+              <w:left w:type="dxa" w:w="110"/>
+              <w:bottom w:type="dxa" w:w="60"/>
+              <w:right w:type="dxa" w:w="110"/>
+            </w:tcMar>
+          </w:tcPr>
+          <w:p>
+            <w:r>
+              <w:rPr>
+                <w:sz w:val="20"/>
+                <w:szCs w:val="20"/>
+              </w:rPr>
+              <w:t xml:space="preserve">HUMAN_REVIEW_REQUIRED</w:t>
+            </w:r>
+          </w:p>
+        </w:tc>
+      </w:tr>
+      <w:tr>
+        <w:trPr>
+          <w:tblHeader w:val="false"/>
+        </w:trPr>
+        <w:tc>
+          <w:tcPr>
+            <w:tcW w:type="dxa" w:w="1500"/>
+            <w:tcBorders>
+              <w:top w:val="single" w:color="BBBBBB" w:sz="1"/>
+              <w:left w:val="single" w:color="BBBBBB" w:sz="1"/>
+              <w:bottom w:val="single" w:color="BBBBBB" w:sz="1"/>
+              <w:right w:val="single" w:color="BBBBBB" w:sz="1"/>
+            </w:tcBorders>
+            <w:tcMar>
+              <w:top w:type="dxa" w:w="60"/>
+              <w:left w:type="dxa" w:w="110"/>
+              <w:bottom w:type="dxa" w:w="60"/>
+              <w:right w:type="dxa" w:w="110"/>
+            </w:tcMar>
+          </w:tcPr>
+          <w:p>
+            <w:r>
+              <w:rPr>
+                <w:sz w:val="20"/>
+                <w:szCs w:val="20"/>
+              </w:rPr>
+              <w:t xml:space="preserve">013</w:t>
+            </w:r>
+          </w:p>
+        </w:tc>
+        <w:tc>
+          <w:tcPr>
+            <w:tcW w:type="dxa" w:w="6360"/>
+            <w:tcBorders>
+              <w:top w:val="single" w:color="BBBBBB" w:sz="1"/>
+              <w:left w:val="single" w:color="BBBBBB" w:sz="1"/>
+              <w:bottom w:val="single" w:color="BBBBBB" w:sz="1"/>
+              <w:right w:val="single" w:color="BBBBBB" w:sz="1"/>
+            </w:tcBorders>
+            <w:tcMar>
+              <w:top w:type="dxa" w:w="60"/>
+              <w:left w:type="dxa" w:w="110"/>
+              <w:bottom w:type="dxa" w:w="60"/>
+              <w:right w:type="dxa" w:w="110"/>
+            </w:tcMar>
+          </w:tcPr>
+          <w:p>
+            <w:r>
+              <w:rPr>
+                <w:sz w:val="20"/>
+                <w:szCs w:val="20"/>
+              </w:rPr>
+              <w:t xml:space="preserve">Low extraction confidence — garbled scan/fax (Mia Roberts)</w:t>
+            </w:r>
+          </w:p>
+        </w:tc>
+        <w:tc>
+          <w:tcPr>
+            <w:tcW w:type="dxa" w:w="1500"/>
+            <w:tcBorders>
+              <w:top w:val="single" w:color="BBBBBB" w:sz="1"/>
+              <w:left w:val="single" w:color="BBBBBB" w:sz="1"/>
+              <w:bottom w:val="single" w:color="BBBBBB" w:sz="1"/>
+              <w:right w:val="single" w:color="BBBBBB" w:sz="1"/>
+            </w:tcBorders>
+            <w:tcMar>
+              <w:top w:type="dxa" w:w="60"/>
+              <w:left w:type="dxa" w:w="110"/>
+              <w:bottom w:type="dxa" w:w="60"/>
+              <w:right w:type="dxa" w:w="110"/>
+            </w:tcMar>
+          </w:tcPr>
+          <w:p>
+            <w:r>
+              <w:rPr>
+                <w:sz w:val="20"/>
+                <w:szCs w:val="20"/>
+              </w:rPr>
+              <w:t xml:space="preserve">HUMAN_REVIEW_REQUIRED</w:t>
+            </w:r>
+          </w:p>
+        </w:tc>
+      </w:tr>
+      <w:tr>
+        <w:trPr>
+          <w:tblHeader w:val="false"/>
+        </w:trPr>
+        <w:tc>
+          <w:tcPr>
+            <w:tcW w:type="dxa" w:w="1500"/>
+            <w:tcBorders>
+              <w:top w:val="single" w:color="BBBBBB" w:sz="1"/>
+              <w:left w:val="single" w:color="BBBBBB" w:sz="1"/>
+              <w:bottom w:val="single" w:color="BBBBBB" w:sz="1"/>
+              <w:right w:val="single" w:color="BBBBBB" w:sz="1"/>
+            </w:tcBorders>
+            <w:tcMar>
+              <w:top w:type="dxa" w:w="60"/>
+              <w:left w:type="dxa" w:w="110"/>
+              <w:bottom w:type="dxa" w:w="60"/>
+              <w:right w:type="dxa" w:w="110"/>
+            </w:tcMar>
+          </w:tcPr>
+          <w:p>
+            <w:r>
+              <w:rPr>
+                <w:sz w:val="20"/>
+                <w:szCs w:val="20"/>
+              </w:rPr>
+              <w:t xml:space="preserve">014</w:t>
+            </w:r>
+          </w:p>
+        </w:tc>
+        <w:tc>
+          <w:tcPr>
+            <w:tcW w:type="dxa" w:w="6360"/>
+            <w:tcBorders>
+              <w:top w:val="single" w:color="BBBBBB" w:sz="1"/>
+              <w:left w:val="single" w:color="BBBBBB" w:sz="1"/>
+              <w:bottom w:val="single" w:color="BBBBBB" w:sz="1"/>
+              <w:right w:val="single" w:color="BBBBBB" w:sz="1"/>
+            </w:tcBorders>
+            <w:tcMar>
+              <w:top w:type="dxa" w:w="60"/>
+              <w:left w:type="dxa" w:w="110"/>
+              <w:bottom w:type="dxa" w:w="60"/>
+              <w:right w:type="dxa" w:w="110"/>
+            </w:tcMar>
+          </w:tcPr>
+          <w:p>
+            <w:r>
+              <w:rPr>
+                <w:sz w:val="20"/>
+                <w:szCs w:val="20"/>
+              </w:rPr>
+              <w:t xml:space="preserve">Not a referral — appointment reminder (bad input)</w:t>
+            </w:r>
+          </w:p>
+        </w:tc>
+        <w:tc>
+          <w:tcPr>
+            <w:tcW w:type="dxa" w:w="1500"/>
+            <w:tcBorders>
+              <w:top w:val="single" w:color="BBBBBB" w:sz="1"/>
+              <w:left w:val="single" w:color="BBBBBB" w:sz="1"/>
+              <w:bottom w:val="single" w:color="BBBBBB" w:sz="1"/>
+              <w:right w:val="single" w:color="BBBBBB" w:sz="1"/>
+            </w:tcBorders>
+            <w:tcMar>
+              <w:top w:type="dxa" w:w="60"/>
+              <w:left w:type="dxa" w:w="110"/>
+              <w:bottom w:type="dxa" w:w="60"/>
+              <w:right w:type="dxa" w:w="110"/>
+            </w:tcMar>
+          </w:tcPr>
+          <w:p>
+            <w:r>
+              <w:rPr>
+                <w:sz w:val="20"/>
+                <w:szCs w:val="20"/>
+              </w:rPr>
+              <w:t xml:space="preserve">BUSINESS_EXCEPTION</w:t>
+            </w:r>
+          </w:p>
+        </w:tc>
+      </w:tr>
+      <w:tr>
+        <w:trPr>
+          <w:tblHeader w:val="false"/>
+        </w:trPr>
+        <w:tc>
+          <w:tcPr>
+            <w:tcW w:type="dxa" w:w="1500"/>
+            <w:tcBorders>
+              <w:top w:val="single" w:color="BBBBBB" w:sz="1"/>
+              <w:left w:val="single" w:color="BBBBBB" w:sz="1"/>
+              <w:bottom w:val="single" w:color="BBBBBB" w:sz="1"/>
+              <w:right w:val="single" w:color="BBBBBB" w:sz="1"/>
+            </w:tcBorders>
+            <w:tcMar>
+              <w:top w:type="dxa" w:w="60"/>
+              <w:left w:type="dxa" w:w="110"/>
+              <w:bottom w:type="dxa" w:w="60"/>
+              <w:right w:type="dxa" w:w="110"/>
+            </w:tcMar>
+          </w:tcPr>
+          <w:p>
+            <w:r>
+              <w:rPr>
+                <w:sz w:val="20"/>
+                <w:szCs w:val="20"/>
+              </w:rPr>
+              <w:t xml:space="preserve">015</w:t>
+            </w:r>
+          </w:p>
+        </w:tc>
+        <w:tc>
+          <w:tcPr>
+            <w:tcW w:type="dxa" w:w="6360"/>
+            <w:tcBorders>
+              <w:top w:val="single" w:color="BBBBBB" w:sz="1"/>
+              <w:left w:val="single" w:color="BBBBBB" w:sz="1"/>
+              <w:bottom w:val="single" w:color="BBBBBB" w:sz="1"/>
+              <w:right w:val="single" w:color="BBBBBB" w:sz="1"/>
+            </w:tcBorders>
+            <w:tcMar>
+              <w:top w:type="dxa" w:w="60"/>
+              <w:left w:type="dxa" w:w="110"/>
+              <w:bottom w:type="dxa" w:w="60"/>
+              <w:right w:type="dxa" w:w="110"/>
+            </w:tcMar>
+          </w:tcPr>
+          <w:p>
+            <w:r>
+              <w:rPr>
+                <w:sz w:val="20"/>
+                <w:szCs w:val="20"/>
+              </w:rPr>
+              <w:t xml:space="preserve">Corrupt / unreadable PDF (technical fault)</w:t>
+            </w:r>
+          </w:p>
+        </w:tc>
+        <w:tc>
+          <w:tcPr>
+            <w:tcW w:type="dxa" w:w="1500"/>
+            <w:tcBorders>
+              <w:top w:val="single" w:color="BBBBBB" w:sz="1"/>
+              <w:left w:val="single" w:color="BBBBBB" w:sz="1"/>
+              <w:bottom w:val="single" w:color="BBBBBB" w:sz="1"/>
+              <w:right w:val="single" w:color="BBBBBB" w:sz="1"/>
+            </w:tcBorders>
+            <w:tcMar>
+              <w:top w:type="dxa" w:w="60"/>
+              <w:left w:type="dxa" w:w="110"/>
+              <w:bottom w:type="dxa" w:w="60"/>
+              <w:right w:type="dxa" w:w="110"/>
+            </w:tcMar>
+          </w:tcPr>
+          <w:p>
+            <w:r>
+              <w:rPr>
+                <w:sz w:val="20"/>
+                <w:szCs w:val="20"/>
+              </w:rPr>
+              <w:t xml:space="preserve">SYSTEM_EXCEPTION</w:t>
+            </w:r>
+          </w:p>
+        </w:tc>
+      </w:tr>
+    </w:tbl>
+    <w:p>
+      <w:pPr>
+        <w:pStyle w:val="Heading3"/>
+      </w:pPr>
+      <w:r>
+        <w:t xml:space="preserve">Decision vocabulary established (feeds Phase 5)</w:t>
+      </w:r>
+    </w:p>
+    <w:p>
+      <w:pPr>
+        <w:pStyle w:val="ListParagraph"/>
+        <w:numPr>
+          <w:ilvl w:val="0"/>
+          <w:numId w:val="3"/>
+        </w:numPr>
+        <w:spacing w:after="60"/>
+      </w:pPr>
+      <w:r>
+        <w:t xml:space="preserve">match_result: EXACT_MATCH · DOB_MISMATCH · PARTIAL_MATCH · MULTIPLE_CANDIDATES · NO_MATCH · NOT_APPLICABLE</w:t>
+      </w:r>
+    </w:p>
+    <w:p>
+      <w:pPr>
+        <w:pStyle w:val="ListParagraph"/>
+        <w:numPr>
+          <w:ilvl w:val="0"/>
+          <w:numId w:val="3"/>
+        </w:numPr>
+        <w:spacing w:after="60"/>
+      </w:pPr>
+      <w:r>
+        <w:t xml:space="preserve">bot_decision: AUTO_CREATE_REFERRAL_RECORD · HUMAN_REVIEW_REQUIRED · BUSINESS_EXCEPTION · SYSTEM_EXCEPTION</w:t>
+      </w:r>
+    </w:p>
+    <w:p>
+      <w:pPr>
+        <w:pStyle w:val="ListParagraph"/>
+        <w:numPr>
+          <w:ilvl w:val="0"/>
+          <w:numId w:val="3"/>
+        </w:numPr>
+        <w:spacing w:after="60"/>
+      </w:pPr>
+      <w:r>
+        <w:t xml:space="preserve">final_status: REFERRAL_CREATED_IN_OPENMRS · ROUTED_TO_HUMAN_REVIEW · BUSINESS_EXCEPTION_FAILED · SYSTEM_EXCEPTION_ESCALATED</w:t>
+      </w:r>
+    </w:p>
+    <w:p>
+      <w:pPr>
+        <w:pStyle w:val="ListParagraph"/>
+        <w:numPr>
+          <w:ilvl w:val="0"/>
+          <w:numId w:val="3"/>
+        </w:numPr>
+        <w:spacing w:after="60"/>
+      </w:pPr>
+      <w:r>
+        <w:t xml:space="preserve">BE vs SE distinguished on one axis: REF-014 reads fine but is the wrong document type (business); REF-015 cannot be read at all (technical → retry then escalate).</w:t>
+      </w:r>
+    </w:p>
+    <w:p>
+      <w:pPr>
+        <w:pStyle w:val="Heading3"/>
+      </w:pPr>
+      <w:r>
+        <w:t xml:space="preserve">Results (all PASS)</w:t>
+      </w:r>
+    </w:p>
+    <w:p>
+      <w:pPr>
+        <w:pStyle w:val="ListParagraph"/>
+        <w:numPr>
+          <w:ilvl w:val="0"/>
+          <w:numId w:val="3"/>
+        </w:numPr>
+        <w:spacing w:after="60"/>
+      </w:pPr>
+      <w:r>
+        <w:t xml:space="preserve">15 referral inputs present; 15 expected-outcome JSON files, all validated (json.load over all 15 → 0 invalid).</w:t>
+      </w:r>
+    </w:p>
+    <w:p>
+      <w:pPr>
+        <w:pStyle w:val="ListParagraph"/>
+        <w:numPr>
+          <w:ilvl w:val="0"/>
+          <w:numId w:val="3"/>
+        </w:numPr>
+        <w:spacing w:after="60"/>
+      </w:pPr>
+      <w:r>
+        <w:t xml:space="preserve">All match scenarios and all four bot decisions covered (AUTO_CREATE ×3, HUMAN_REVIEW ×10, BUSINESS_EXCEPTION ×1, SYSTEM_EXCEPTION ×1).</w:t>
+      </w:r>
+    </w:p>
+    <w:p>
+      <w:pPr>
+        <w:pStyle w:val="ListParagraph"/>
+        <w:numPr>
+          <w:ilvl w:val="0"/>
+          <w:numId w:val="3"/>
+        </w:numPr>
+        <w:spacing w:after="60"/>
+      </w:pPr>
+      <w:r>
+        <w:t xml:space="preserve">Synthetic-by-construction throughout: 999-range NHS numbers, Ofcom 07700 900xxx phones, synthetic banner on every letter.</w:t>
+      </w:r>
+    </w:p>
+    <w:p>
+      <w:pPr>
+        <w:pStyle w:val="Heading3"/>
+      </w:pPr>
+      <w:r>
+        <w:t xml:space="preserve">Screenshots to capture</w:t>
+      </w:r>
+    </w:p>
+    <w:p>
+      <w:pPr>
+        <w:pStyle w:val="ListParagraph"/>
+        <w:numPr>
+          <w:ilvl w:val="0"/>
+          <w:numId w:val="3"/>
+        </w:numPr>
+        <w:spacing w:after="60"/>
+      </w:pPr>
+      <w:r>
+        <w:t xml:space="preserve">data/input-referrals/ folder showing the 15 referral files.</w:t>
+      </w:r>
+    </w:p>
+    <w:p>
+      <w:pPr>
+        <w:pStyle w:val="ListParagraph"/>
+        <w:numPr>
+          <w:ilvl w:val="0"/>
+          <w:numId w:val="3"/>
+        </w:numPr>
+        <w:spacing w:after="60"/>
+      </w:pPr>
+      <w:r>
+        <w:t xml:space="preserve">A clean referral (REF-001) and a tricky one (REF-006 Walsh / REF-008 2WW) opened side by side.</w:t>
+      </w:r>
+    </w:p>
+    <w:p>
+      <w:pPr>
+        <w:pStyle w:val="ListParagraph"/>
+        <w:numPr>
+          <w:ilvl w:val="0"/>
+          <w:numId w:val="3"/>
+        </w:numPr>
+        <w:spacing w:after="60"/>
+      </w:pPr>
+      <w:r>
+        <w:t xml:space="preserve">An expected-outcome JSON (e.g. REF-004.expected.json) showing the DOB-mismatch oracle.</w:t>
+      </w:r>
+    </w:p>
+    <w:p>
+      <w:pPr>
+        <w:pStyle w:val="ListParagraph"/>
+        <w:numPr>
+          <w:ilvl w:val="0"/>
+          <w:numId w:val="3"/>
+        </w:numPr>
+        <w:spacing w:after="60"/>
+      </w:pPr>
+      <w:r>
+        <w:t xml:space="preserve">data/expected-outcomes/README.md scenario matrix table.</w:t>
+      </w:r>
+    </w:p>
+    <w:p>
+      <w:pPr>
+        <w:pStyle w:val="Heading3"/>
+      </w:pPr>
+      <w:r>
+        <w:t xml:space="preserve">What to commit</w:t>
+      </w:r>
+    </w:p>
+    <w:p>
+      <w:pPr>
+        <w:spacing w:after="120"/>
+      </w:pPr>
+      <w:r>
+        <w:t xml:space="preserve">data/input-referrals/REF-* (synthetic fixtures), data/expected-outcomes/ (oracles + README), docs/testing/phase3-acceptance.md, README + this build log.</w:t>
+      </w:r>
+    </w:p>
+    <w:p>
+      <w:pPr>
+        <w:pStyle w:val="Heading3"/>
+      </w:pPr>
+      <w:r>
+        <w:t xml:space="preserve">Deferred (tracked)</w:t>
+      </w:r>
+    </w:p>
+    <w:p>
+      <w:pPr>
+        <w:spacing w:after="120"/>
+      </w:pPr>
+      <w:r>
+        <w:t xml:space="preserve">REF-007 duplicate needs the pre-existing Cardiology Referral encounter for Arthur Reed (seeded Phase 6/8). A few .txt referrals may optionally be re-rendered as real .pdf in Phase 4 to exercise the PDF→text path on valid PDFs.</w:t>
       </w:r>
     </w:p>
     <w:p>
@@ -5394,7 +7115,7 @@
                 <w:sz w:val="20"/>
                 <w:szCs w:val="20"/>
               </w:rPr>
-              <w:t xml:space="preserve">⬜ Next</w:t>
+              <w:t xml:space="preserve">✅ Done</w:t>
             </w:r>
           </w:p>
         </w:tc>
@@ -5477,7 +7198,7 @@
                 <w:sz w:val="20"/>
                 <w:szCs w:val="20"/>
               </w:rPr>
-              <w:t xml:space="preserve">⬜</w:t>
+              <w:t xml:space="preserve">⬜ Next</w:t>
             </w:r>
           </w:p>
         </w:tc>

</xml_diff>

<commit_message>
Add extraction service: LLM + regex + schema validation (Phase 4)
Turns each synthetic referral into a schema-validated JSON record
(fields, missing_fields, confidence). Deterministic regex extractor is
the default guardrail path (no deps/key/internet, fully reproducible);
optional Groq/OpenAI-compatible LLM path falls back to regex on any
failure; both share the same normalisers and Draft-07 schema. Reads
TXT/PDF and separates System (FILE_UNREADABLE) from Business
(NOT_A_REFERRAL) exceptions. Advisory signals (cancer/urgent/
safeguarding/child) are hints for Phase 5 only — no matching, no
decision here.

Acceptance: validate_against_oracles.py compares every output to the
Phase 3 oracles — 15/15 pass (is_referral, missing_fields, confidence,
normalisation, exception type). REF-013 (degraded scan) is the
documented regex-vs-LLM boundary.

Also adds a stdlib HTTP service (app.py) for the UiPath performer,
phase4-acceptance.md, README status, and the build-progress log.
</commit_message>
<xml_diff>
--- a/docs/Build-Progress-Log.docx
+++ b/docs/Build-Progress-Log.docx
@@ -86,7 +86,7 @@
           <w:sz w:val="22"/>
           <w:szCs w:val="22"/>
         </w:rPr>
-        <w:t xml:space="preserve">Status: Phases 0, 1, 2, 3 complete  —  next: Phase 4 (Extraction &amp; Agentic AI service)</w:t>
+        <w:t xml:space="preserve">Status: Phases 0–4 complete  —  next: Phase 5 (Business rules &amp; safety decision engine)</w:t>
       </w:r>
     </w:p>
     <w:p>
@@ -5669,6 +5669,380 @@
         <w:pStyle w:val="Heading1"/>
       </w:pPr>
       <w:r>
+        <w:t xml:space="preserve">Phase 4 — Extraction Service (LLM + Regex + Validation)</w:t>
+      </w:r>
+    </w:p>
+    <w:p>
+      <w:pPr>
+        <w:pStyle w:val="Heading3"/>
+      </w:pPr>
+      <w:r>
+        <w:t xml:space="preserve">What was built</w:t>
+      </w:r>
+    </w:p>
+    <w:p>
+      <w:pPr>
+        <w:pStyle w:val="ListParagraph"/>
+        <w:numPr>
+          <w:ilvl w:val="0"/>
+          <w:numId w:val="3"/>
+        </w:numPr>
+        <w:spacing w:after="60"/>
+      </w:pPr>
+      <w:r>
+        <w:t xml:space="preserve">A Python extraction service (services/extraction-service/) that turns each referral document into a schema-validated JSON record: the structured referral fields, a completeness report (missing_fields), and a confidence rating (high / medium / low / n-a).</w:t>
+      </w:r>
+    </w:p>
+    <w:p>
+      <w:pPr>
+        <w:pStyle w:val="ListParagraph"/>
+        <w:numPr>
+          <w:ilvl w:val="0"/>
+          <w:numId w:val="3"/>
+        </w:numPr>
+        <w:spacing w:after="60"/>
+      </w:pPr>
+      <w:r>
+        <w:t xml:space="preserve">A deterministic regex extractor is the default 'guardrail' path — no model, no API key, no internet — so its output is fully reproducible and auditable. An optional LLM path (Groq / OpenAI-compatible) runs only when USE_LLM=true and a key is configured, and any LLM failure falls back to regex. Both paths share the same normalisers and the same schema validation.</w:t>
+      </w:r>
+    </w:p>
+    <w:p>
+      <w:pPr>
+        <w:pStyle w:val="ListParagraph"/>
+        <w:numPr>
+          <w:ilvl w:val="0"/>
+          <w:numId w:val="3"/>
+        </w:numPr>
+        <w:spacing w:after="60"/>
+      </w:pPr>
+      <w:r>
+        <w:t xml:space="preserve">Normalisers clean the messy realities of referral letters: NHS number '999 000 0018' to '9990000018', dates dd/mm/yyyy to ISO (1979-04-12), 'Male' to 'M', and priority 'URGENT — 2-WEEK WAIT' to '2WW'.</w:t>
+      </w:r>
+    </w:p>
+    <w:p>
+      <w:pPr>
+        <w:pStyle w:val="ListParagraph"/>
+        <w:numPr>
+          <w:ilvl w:val="0"/>
+          <w:numId w:val="3"/>
+        </w:numPr>
+        <w:spacing w:after="60"/>
+      </w:pPr>
+      <w:r>
+        <w:t xml:space="preserve">Reads TXT and PDF, and correctly distinguishes a System Exception (corrupt/unreadable file → FILE_UNREADABLE) from a Business Exception (readable but not a referral → NOT_A_REFERRAL).</w:t>
+      </w:r>
+    </w:p>
+    <w:p>
+      <w:pPr>
+        <w:pStyle w:val="ListParagraph"/>
+        <w:numPr>
+          <w:ilvl w:val="0"/>
+          <w:numId w:val="3"/>
+        </w:numPr>
+        <w:spacing w:after="60"/>
+      </w:pPr>
+      <w:r>
+        <w:t xml:space="preserve">Advisory text signals (suspected cancer, urgent red-flag, safeguarding, child patient) are surfaced as hints for the Phase 5 rules engine — the extractor flags them but never routes or decides on them. The AI stays strictly advisory.</w:t>
+      </w:r>
+    </w:p>
+    <w:p>
+      <w:pPr>
+        <w:pStyle w:val="ListParagraph"/>
+        <w:numPr>
+          <w:ilvl w:val="0"/>
+          <w:numId w:val="3"/>
+        </w:numPr>
+        <w:spacing w:after="60"/>
+      </w:pPr>
+      <w:r>
+        <w:t xml:space="preserve">Scope guardrail: extraction only. No patient matching against OpenMRS and no clinical/routing decision — those are Phase 5/6 and are deliberately absent from the output schema (no match_result, bot_decision or final_status).</w:t>
+      </w:r>
+    </w:p>
+    <w:p>
+      <w:pPr>
+        <w:pStyle w:val="Heading3"/>
+      </w:pPr>
+      <w:r>
+        <w:t xml:space="preserve">Files created</w:t>
+      </w:r>
+    </w:p>
+    <w:p>
+      <w:pPr>
+        <w:pStyle w:val="ListParagraph"/>
+        <w:numPr>
+          <w:ilvl w:val="0"/>
+          <w:numId w:val="3"/>
+        </w:numPr>
+        <w:spacing w:after="60"/>
+      </w:pPr>
+      <w:r>
+        <w:t xml:space="preserve">services/extraction-service/src/ — regex_extractor.py, llm_extractor.py, text_reader.py, confidence.py, validate.py, extractor.py (orchestrator).</w:t>
+      </w:r>
+    </w:p>
+    <w:p>
+      <w:pPr>
+        <w:pStyle w:val="ListParagraph"/>
+        <w:numPr>
+          <w:ilvl w:val="0"/>
+          <w:numId w:val="3"/>
+        </w:numPr>
+        <w:spacing w:after="60"/>
+      </w:pPr>
+      <w:r>
+        <w:t xml:space="preserve">services/extraction-service/schema/extraction.schema.json — Draft-07 output schema.</w:t>
+      </w:r>
+    </w:p>
+    <w:p>
+      <w:pPr>
+        <w:pStyle w:val="ListParagraph"/>
+        <w:numPr>
+          <w:ilvl w:val="0"/>
+          <w:numId w:val="3"/>
+        </w:numPr>
+        <w:spacing w:after="60"/>
+      </w:pPr>
+      <w:r>
+        <w:t xml:space="preserve">run_extraction.py (CLI), validate_against_oracles.py (acceptance harness), app.py (stdlib HTTP service — no Flask), requirements.txt (all optional), README.md.</w:t>
+      </w:r>
+    </w:p>
+    <w:p>
+      <w:pPr>
+        <w:pStyle w:val="ListParagraph"/>
+        <w:numPr>
+          <w:ilvl w:val="0"/>
+          <w:numId w:val="3"/>
+        </w:numPr>
+        <w:spacing w:after="60"/>
+      </w:pPr>
+      <w:r>
+        <w:t xml:space="preserve">data/extracted-json/REF-001…REF-015.extracted.json — the 15 extraction outputs.</w:t>
+      </w:r>
+    </w:p>
+    <w:p>
+      <w:pPr>
+        <w:pStyle w:val="ListParagraph"/>
+        <w:numPr>
+          <w:ilvl w:val="0"/>
+          <w:numId w:val="3"/>
+        </w:numPr>
+        <w:spacing w:after="60"/>
+      </w:pPr>
+      <w:r>
+        <w:t xml:space="preserve">docs/testing/phase4-acceptance.md — acceptance evidence.</w:t>
+      </w:r>
+    </w:p>
+    <w:p>
+      <w:pPr>
+        <w:pStyle w:val="Heading3"/>
+      </w:pPr>
+      <w:r>
+        <w:t xml:space="preserve">How to run / test</w:t>
+      </w:r>
+    </w:p>
+    <w:p>
+      <w:pPr>
+        <w:pStyle w:val="ListParagraph"/>
+        <w:numPr>
+          <w:ilvl w:val="0"/>
+          <w:numId w:val="3"/>
+        </w:numPr>
+        <w:spacing w:after="60"/>
+      </w:pPr>
+      <w:r>
+        <w:t xml:space="preserve">cd services/extraction-service</w:t>
+      </w:r>
+    </w:p>
+    <w:p>
+      <w:pPr>
+        <w:pStyle w:val="ListParagraph"/>
+        <w:numPr>
+          <w:ilvl w:val="0"/>
+          <w:numId w:val="3"/>
+        </w:numPr>
+        <w:spacing w:after="60"/>
+      </w:pPr>
+      <w:r>
+        <w:t xml:space="preserve">python run_extraction.py — extracts every referral to data/extracted-json/. Runs offline on the regex path with no dependencies or keys.</w:t>
+      </w:r>
+    </w:p>
+    <w:p>
+      <w:pPr>
+        <w:pStyle w:val="ListParagraph"/>
+        <w:numPr>
+          <w:ilvl w:val="0"/>
+          <w:numId w:val="3"/>
+        </w:numPr>
+        <w:spacing w:after="60"/>
+      </w:pPr>
+      <w:r>
+        <w:t xml:space="preserve">python validate_against_oracles.py — the Phase 4 acceptance gate: compares every output to the Phase 3 oracles. Exit code 0 = all pass.</w:t>
+      </w:r>
+    </w:p>
+    <w:p>
+      <w:pPr>
+        <w:pStyle w:val="ListParagraph"/>
+        <w:numPr>
+          <w:ilvl w:val="0"/>
+          <w:numId w:val="3"/>
+        </w:numPr>
+        <w:spacing w:after="60"/>
+      </w:pPr>
+      <w:r>
+        <w:t xml:space="preserve">python app.py — optional: run as an HTTP service (GET /health, POST /extract) the UiPath performer can call.</w:t>
+      </w:r>
+    </w:p>
+    <w:p>
+      <w:pPr>
+        <w:pStyle w:val="Heading3"/>
+      </w:pPr>
+      <w:r>
+        <w:t xml:space="preserve">Expected output / result</w:t>
+      </w:r>
+    </w:p>
+    <w:p>
+      <w:pPr>
+        <w:pStyle w:val="ListParagraph"/>
+        <w:numPr>
+          <w:ilvl w:val="0"/>
+          <w:numId w:val="3"/>
+        </w:numPr>
+        <w:spacing w:after="60"/>
+      </w:pPr>
+      <w:r>
+        <w:t xml:space="preserve">GATE RESULT: 15/15 referrals pass extraction acceptance.</w:t>
+      </w:r>
+    </w:p>
+    <w:p>
+      <w:pPr>
+        <w:pStyle w:val="ListParagraph"/>
+        <w:numPr>
+          <w:ilvl w:val="0"/>
+          <w:numId w:val="3"/>
+        </w:numPr>
+        <w:spacing w:after="60"/>
+      </w:pPr>
+      <w:r>
+        <w:t xml:space="preserve">Confidence: high ×9 (clean referrals), medium ×2 (no NHS number — REF-005/006), low ×1 (degraded scan — REF-013), n-a ×2 (REF-014 not-a-referral, REF-015 unreadable).</w:t>
+      </w:r>
+    </w:p>
+    <w:p>
+      <w:pPr>
+        <w:pStyle w:val="ListParagraph"/>
+        <w:numPr>
+          <w:ilvl w:val="0"/>
+          <w:numId w:val="3"/>
+        </w:numPr>
+        <w:spacing w:after="60"/>
+      </w:pPr>
+      <w:r>
+        <w:t xml:space="preserve">is_referral, missing_fields, field normalisation and exception type (Business vs System) are all correct against the oracles.</w:t>
+      </w:r>
+    </w:p>
+    <w:p>
+      <w:pPr>
+        <w:pStyle w:val="Heading3"/>
+      </w:pPr>
+      <w:r>
+        <w:t xml:space="preserve">Regex vs LLM boundary (REF-013)</w:t>
+      </w:r>
+    </w:p>
+    <w:p>
+      <w:pPr>
+        <w:spacing w:after="120"/>
+      </w:pPr>
+      <w:r>
+        <w:t xml:space="preserve">REF-013 is a deliberately degraded 'scanned/faxed' letter. The regex guardrail does the safe thing: it flags it low-confidence, gets the identity-critical fields right (cleans '9 9 9 0 0 0 0 0 8 5' to '9990000085', 'Rob3rts' to 'Roberts', plus DOB and gender) and leaves the illegible speciality/priority/reason blank for a human. The full field reconstruction shown in that oracle is the optional LLM path's target, so the harness reports those few fields as INFO, not FAIL. This is the project thesis in miniature: AI assists, deterministic guardrails own safety.</w:t>
+      </w:r>
+    </w:p>
+    <w:p>
+      <w:pPr>
+        <w:pStyle w:val="Heading3"/>
+      </w:pPr>
+      <w:r>
+        <w:t xml:space="preserve">Screenshots to capture</w:t>
+      </w:r>
+    </w:p>
+    <w:p>
+      <w:pPr>
+        <w:pStyle w:val="ListParagraph"/>
+        <w:numPr>
+          <w:ilvl w:val="0"/>
+          <w:numId w:val="3"/>
+        </w:numPr>
+        <w:spacing w:after="60"/>
+      </w:pPr>
+      <w:r>
+        <w:t xml:space="preserve">The validate_against_oracles.py run showing GATE RESULT: 15/15.</w:t>
+      </w:r>
+    </w:p>
+    <w:p>
+      <w:pPr>
+        <w:pStyle w:val="ListParagraph"/>
+        <w:numPr>
+          <w:ilvl w:val="0"/>
+          <w:numId w:val="3"/>
+        </w:numPr>
+        <w:spacing w:after="60"/>
+      </w:pPr>
+      <w:r>
+        <w:t xml:space="preserve">Pretty-printed REF-008 (2WW suspected-cancer signal) and REF-013 (low-confidence flag) extracted JSON.</w:t>
+      </w:r>
+    </w:p>
+    <w:p>
+      <w:pPr>
+        <w:pStyle w:val="ListParagraph"/>
+        <w:numPr>
+          <w:ilvl w:val="0"/>
+          <w:numId w:val="3"/>
+        </w:numPr>
+        <w:spacing w:after="60"/>
+      </w:pPr>
+      <w:r>
+        <w:t xml:space="preserve">GET /health and a POST /extract response from the running service.</w:t>
+      </w:r>
+    </w:p>
+    <w:p>
+      <w:pPr>
+        <w:pStyle w:val="Heading3"/>
+      </w:pPr>
+      <w:r>
+        <w:t xml:space="preserve">What to commit</w:t>
+      </w:r>
+    </w:p>
+    <w:p>
+      <w:pPr>
+        <w:spacing w:after="120"/>
+      </w:pPr>
+      <w:r>
+        <w:t xml:space="preserve">services/extraction-service/ (source, schema, CLI, HTTP service, harness, README), data/extracted-json/REF-*.extracted.json, docs/testing/phase4-acceptance.md, README + this build log. No secrets — the LLM key stays in .env (gitignored).</w:t>
+      </w:r>
+    </w:p>
+    <w:p>
+      <w:pPr>
+        <w:pStyle w:val="Heading3"/>
+      </w:pPr>
+      <w:r>
+        <w:t xml:space="preserve">Next — Phase 5</w:t>
+      </w:r>
+    </w:p>
+    <w:p>
+      <w:pPr>
+        <w:spacing w:after="120"/>
+      </w:pPr>
+      <w:r>
+        <w:t xml:space="preserve">Rules &amp; safety decision engine: consume extracted-json/ + the OpenMRS patient match to produce match_result, safety_flags, reason_codes and bot_decision, with a reason code for every decision. The Phase 3 oracles already hold the expected values.</w:t>
+      </w:r>
+    </w:p>
+    <w:p>
+      <w:r>
+        <w:br w:type="page"/>
+      </w:r>
+    </w:p>
+    <w:p>
+      <w:pPr>
+        <w:pStyle w:val="Heading1"/>
+      </w:pPr>
+      <w:r>
         <w:t xml:space="preserve">Appendix A — Key OpenMRS UUIDs</w:t>
       </w:r>
     </w:p>
@@ -7198,7 +7572,7 @@
                 <w:sz w:val="20"/>
                 <w:szCs w:val="20"/>
               </w:rPr>
-              <w:t xml:space="preserve">⬜ Next</w:t>
+              <w:t xml:space="preserve">✅ Done</w:t>
             </w:r>
           </w:p>
         </w:tc>
@@ -7281,7 +7655,7 @@
                 <w:sz w:val="20"/>
                 <w:szCs w:val="20"/>
               </w:rPr>
-              <w:t xml:space="preserve">⬜</w:t>
+              <w:t xml:space="preserve">⬜ Next</w:t>
             </w:r>
           </w:p>
         </w:tc>

</xml_diff>

<commit_message>
Add rules & safety decision engine (Phase 5)
services/rules-engine/ consumes the Phase 4 extraction JSON, matches the
patient (identifier-first + demographic fallback), applies deterministic
clinical-safety rules, and emits one reason-coded routing decision per
referral. The LLM never reaches this layer: rules + human review own safety.

- Two patient-match backends behind one interface: LocalPatientRepository
  (committed synthetic_patients.json, offline/reproducible gate path) and
  OpenmrsPatientRepository (live REST, Phase 8 path).
- Every decision carries >=1 reason code; any safety flag blocks auto-create
  (risky/uncertain/urgent/incomplete/duplicate/match-risk -> human review).
- Acceptance gate checks match_result/bot_decision/final_status EXACTLY vs the
  Phase 3 oracles and flags/reason codes for coverage: 15/15 pass. Oracles
  unchanged.
</commit_message>
<xml_diff>
--- a/docs/Build-Progress-Log.docx
+++ b/docs/Build-Progress-Log.docx
@@ -72,7 +72,7 @@
           <w:sz w:val="22"/>
           <w:szCs w:val="22"/>
         </w:rPr>
-        <w:t xml:space="preserve">Last updated: 9 June 2026</w:t>
+        <w:t xml:space="preserve">Last updated: 10 June 2026</w:t>
       </w:r>
     </w:p>
     <w:p>
@@ -86,7 +86,7 @@
           <w:sz w:val="22"/>
           <w:szCs w:val="22"/>
         </w:rPr>
-        <w:t xml:space="preserve">Status: Phases 0–4 complete  —  next: Phase 5 (Business rules &amp; safety decision engine)</w:t>
+        <w:t xml:space="preserve">Status: Phases 0–5 complete  —  next: Phase 6 (OpenMRS workflow mapping)</w:t>
       </w:r>
     </w:p>
     <w:p>
@@ -6031,6 +6031,367 @@
       </w:pPr>
       <w:r>
         <w:t xml:space="preserve">Rules &amp; safety decision engine: consume extracted-json/ + the OpenMRS patient match to produce match_result, safety_flags, reason_codes and bot_decision, with a reason code for every decision. The Phase 3 oracles already hold the expected values.</w:t>
+      </w:r>
+    </w:p>
+    <w:p>
+      <w:r>
+        <w:br w:type="page"/>
+      </w:r>
+    </w:p>
+    <w:p>
+      <w:pPr>
+        <w:pStyle w:val="Heading1"/>
+      </w:pPr>
+      <w:r>
+        <w:t xml:space="preserve">Phase 5 — Rules &amp; Safety Decision Engine</w:t>
+      </w:r>
+    </w:p>
+    <w:p>
+      <w:pPr>
+        <w:pStyle w:val="Heading3"/>
+      </w:pPr>
+      <w:r>
+        <w:t xml:space="preserve">What was built</w:t>
+      </w:r>
+    </w:p>
+    <w:p>
+      <w:pPr>
+        <w:pStyle w:val="ListParagraph"/>
+        <w:numPr>
+          <w:ilvl w:val="0"/>
+          <w:numId w:val="3"/>
+        </w:numPr>
+        <w:spacing w:after="60"/>
+      </w:pPr>
+      <w:r>
+        <w:t xml:space="preserve">A deterministic rules &amp; safety decision engine (services/rules-engine/) — the layer that owns safety. It consumes a Phase 4 extraction result, matches the patient, applies clinical-safety rules, and produces exactly one routing decision per referral. The LLM never reaches this layer.</w:t>
+      </w:r>
+    </w:p>
+    <w:p>
+      <w:pPr>
+        <w:pStyle w:val="ListParagraph"/>
+        <w:numPr>
+          <w:ilvl w:val="0"/>
+          <w:numId w:val="3"/>
+        </w:numPr>
+        <w:spacing w:after="60"/>
+      </w:pPr>
+      <w:r>
+        <w:t xml:space="preserve">Patient matching is identifier-first with a demographic fallback, producing EXACT_MATCH, DOB_MISMATCH, PARTIAL_MATCH, MULTIPLE_CANDIDATES, NO_MATCH or NOT_APPLICABLE. A missing NHS number is treated as a matching concern (partial / multiple candidates), not as a referral-completeness gap — which is why REF-005/006 are match-risk cases, not incomplete ones.</w:t>
+      </w:r>
+    </w:p>
+    <w:p>
+      <w:pPr>
+        <w:pStyle w:val="ListParagraph"/>
+        <w:numPr>
+          <w:ilvl w:val="0"/>
+          <w:numId w:val="3"/>
+        </w:numPr>
+        <w:spacing w:after="60"/>
+      </w:pPr>
+      <w:r>
+        <w:t xml:space="preserve">The safety rules raise a flag and a machine-readable reason code for each condition detected: patient-match risk, patient-not-found, duplicate referral, urgent / 2WW, safeguarding, child patient, incomplete mandatory fields, low extraction confidence, not-a-referral and unreadable file.</w:t>
+      </w:r>
+    </w:p>
+    <w:p>
+      <w:pPr>
+        <w:pStyle w:val="ListParagraph"/>
+        <w:numPr>
+          <w:ilvl w:val="0"/>
+          <w:numId w:val="3"/>
+        </w:numPr>
+        <w:spacing w:after="60"/>
+      </w:pPr>
+      <w:r>
+        <w:t xml:space="preserve">Two invariants are guaranteed: every decision carries at least one reason code (enforced by the schema), and any safety flag blocks auto-create. Only a clean, complete, exactly-matched, legible, non-urgent, non-duplicate referral is auto-created; everything risky, uncertain, urgent, incomplete, duplicate or match-ambiguous routes to a human.</w:t>
+      </w:r>
+    </w:p>
+    <w:p>
+      <w:pPr>
+        <w:pStyle w:val="ListParagraph"/>
+        <w:numPr>
+          <w:ilvl w:val="0"/>
+          <w:numId w:val="3"/>
+        </w:numPr>
+        <w:spacing w:after="60"/>
+      </w:pPr>
+      <w:r>
+        <w:t xml:space="preserve">Two interchangeable patient-match backends sit behind one interface: a local seed-file backend (the committed synthetic_patients.json) that makes the acceptance gate fully offline and reproducible, and a live OpenMRS REST backend for the Phase 8 performer.</w:t>
+      </w:r>
+    </w:p>
+    <w:p>
+      <w:pPr>
+        <w:pStyle w:val="Heading3"/>
+      </w:pPr>
+      <w:r>
+        <w:t xml:space="preserve">Files created</w:t>
+      </w:r>
+    </w:p>
+    <w:p>
+      <w:pPr>
+        <w:pStyle w:val="ListParagraph"/>
+        <w:numPr>
+          <w:ilvl w:val="0"/>
+          <w:numId w:val="3"/>
+        </w:numPr>
+        <w:spacing w:after="60"/>
+      </w:pPr>
+      <w:r>
+        <w:t xml:space="preserve">services/rules-engine/src/ — patient_repository.py (local + OpenMRS backends), matcher.py, rules.py, decision_engine.py (orchestrator), validate.py.</w:t>
+      </w:r>
+    </w:p>
+    <w:p>
+      <w:pPr>
+        <w:pStyle w:val="ListParagraph"/>
+        <w:numPr>
+          <w:ilvl w:val="0"/>
+          <w:numId w:val="3"/>
+        </w:numPr>
+        <w:spacing w:after="60"/>
+      </w:pPr>
+      <w:r>
+        <w:t xml:space="preserve">services/rules-engine/schema/decision.schema.json — Draft-07 output schema (requires a non-empty reason_codes array).</w:t>
+      </w:r>
+    </w:p>
+    <w:p>
+      <w:pPr>
+        <w:pStyle w:val="ListParagraph"/>
+        <w:numPr>
+          <w:ilvl w:val="0"/>
+          <w:numId w:val="3"/>
+        </w:numPr>
+        <w:spacing w:after="60"/>
+      </w:pPr>
+      <w:r>
+        <w:t xml:space="preserve">run_decisions.py (CLI), validate_against_oracles.py (acceptance harness), app.py (stdlib HTTP service on :8090 — no Flask), requirements.txt (optional), README.md.</w:t>
+      </w:r>
+    </w:p>
+    <w:p>
+      <w:pPr>
+        <w:pStyle w:val="ListParagraph"/>
+        <w:numPr>
+          <w:ilvl w:val="0"/>
+          <w:numId w:val="3"/>
+        </w:numPr>
+        <w:spacing w:after="60"/>
+      </w:pPr>
+      <w:r>
+        <w:t xml:space="preserve">data/decisions/REF-001…REF-015.decision.json — the 15 decision outputs (gitignored runtime output; regenerate anytime).</w:t>
+      </w:r>
+    </w:p>
+    <w:p>
+      <w:pPr>
+        <w:pStyle w:val="ListParagraph"/>
+        <w:numPr>
+          <w:ilvl w:val="0"/>
+          <w:numId w:val="3"/>
+        </w:numPr>
+        <w:spacing w:after="60"/>
+      </w:pPr>
+      <w:r>
+        <w:t xml:space="preserve">docs/testing/phase5-acceptance.md — acceptance evidence.</w:t>
+      </w:r>
+    </w:p>
+    <w:p>
+      <w:pPr>
+        <w:pStyle w:val="Heading3"/>
+      </w:pPr>
+      <w:r>
+        <w:t xml:space="preserve">How to run / test</w:t>
+      </w:r>
+    </w:p>
+    <w:p>
+      <w:pPr>
+        <w:pStyle w:val="ListParagraph"/>
+        <w:numPr>
+          <w:ilvl w:val="0"/>
+          <w:numId w:val="3"/>
+        </w:numPr>
+        <w:spacing w:after="60"/>
+      </w:pPr>
+      <w:r>
+        <w:t xml:space="preserve">cd services/rules-engine</w:t>
+      </w:r>
+    </w:p>
+    <w:p>
+      <w:pPr>
+        <w:pStyle w:val="ListParagraph"/>
+        <w:numPr>
+          <w:ilvl w:val="0"/>
+          <w:numId w:val="3"/>
+        </w:numPr>
+        <w:spacing w:after="60"/>
+      </w:pPr>
+      <w:r>
+        <w:t xml:space="preserve">python run_decisions.py — decides every extracted referral to data/decisions/. Runs fully offline against the synthetic-patient seed file (use --source openmrs to match against live OpenMRS).</w:t>
+      </w:r>
+    </w:p>
+    <w:p>
+      <w:pPr>
+        <w:pStyle w:val="ListParagraph"/>
+        <w:numPr>
+          <w:ilvl w:val="0"/>
+          <w:numId w:val="3"/>
+        </w:numPr>
+        <w:spacing w:after="60"/>
+      </w:pPr>
+      <w:r>
+        <w:t xml:space="preserve">python validate_against_oracles.py — the Phase 5 acceptance gate: re-extracts, decides, and compares to the Phase 3 oracles. Exit code 0 = all pass.</w:t>
+      </w:r>
+    </w:p>
+    <w:p>
+      <w:pPr>
+        <w:pStyle w:val="ListParagraph"/>
+        <w:numPr>
+          <w:ilvl w:val="0"/>
+          <w:numId w:val="3"/>
+        </w:numPr>
+        <w:spacing w:after="60"/>
+      </w:pPr>
+      <w:r>
+        <w:t xml:space="preserve">python app.py — optional: run as an HTTP service (GET /health, POST /decide) the UiPath performer can call.</w:t>
+      </w:r>
+    </w:p>
+    <w:p>
+      <w:pPr>
+        <w:pStyle w:val="Heading3"/>
+      </w:pPr>
+      <w:r>
+        <w:t xml:space="preserve">Expected output / result</w:t>
+      </w:r>
+    </w:p>
+    <w:p>
+      <w:pPr>
+        <w:pStyle w:val="ListParagraph"/>
+        <w:numPr>
+          <w:ilvl w:val="0"/>
+          <w:numId w:val="3"/>
+        </w:numPr>
+        <w:spacing w:after="60"/>
+      </w:pPr>
+      <w:r>
+        <w:t xml:space="preserve">GATE RESULT: 15/15 referrals pass the decision acceptance.</w:t>
+      </w:r>
+    </w:p>
+    <w:p>
+      <w:pPr>
+        <w:pStyle w:val="ListParagraph"/>
+        <w:numPr>
+          <w:ilvl w:val="0"/>
+          <w:numId w:val="3"/>
+        </w:numPr>
+        <w:spacing w:after="60"/>
+      </w:pPr>
+      <w:r>
+        <w:t xml:space="preserve">Decisions: AUTO_CREATE ×3 (clean exact matches — Bennett, Davies, Clarke), HUMAN_REVIEW ×10, BUSINESS_EXCEPTION ×1 (REF-014 not-a-referral), SYSTEM_EXCEPTION ×1 (REF-015 unreadable).</w:t>
+      </w:r>
+    </w:p>
+    <w:p>
+      <w:pPr>
+        <w:pStyle w:val="ListParagraph"/>
+        <w:numPr>
+          <w:ilvl w:val="0"/>
+          <w:numId w:val="3"/>
+        </w:numPr>
+        <w:spacing w:after="60"/>
+      </w:pPr>
+      <w:r>
+        <w:t xml:space="preserve">match_result, bot_decision and final_status match the oracles exactly; every decision carries at least one reason code; every risky case routes to a human.</w:t>
+      </w:r>
+    </w:p>
+    <w:p>
+      <w:pPr>
+        <w:pStyle w:val="Heading3"/>
+      </w:pPr>
+      <w:r>
+        <w:t xml:space="preserve">Gate philosophy — exact where it matters, coverage where the oracle is a headline</w:t>
+      </w:r>
+    </w:p>
+    <w:p>
+      <w:pPr>
+        <w:spacing w:after="120"/>
+      </w:pPr>
+      <w:r>
+        <w:t xml:space="preserve">The three safety-critical categoricals — match_result, bot_decision and final_status — are checked for exact equality against the oracles. The safety flags and reason codes are checked for coverage: every expected one must be present, but the engine derives codes mechanically and is deliberately more thorough than the oracle’s hand-written headline set, so any extra it raises is reported as INFO, not FAIL. For example, it also records URGENT_RED_FLAG on the safeguarding child (REF-009), and INCOMPLETE on the degraded scan whose speciality could not be read (REF-013). This never weakens the gate — an extra flag on a clean case would flip it away from auto-create and fail the exact decision check.</w:t>
+      </w:r>
+    </w:p>
+    <w:p>
+      <w:pPr>
+        <w:pStyle w:val="Heading3"/>
+      </w:pPr>
+      <w:r>
+        <w:t xml:space="preserve">Screenshots to capture</w:t>
+      </w:r>
+    </w:p>
+    <w:p>
+      <w:pPr>
+        <w:pStyle w:val="ListParagraph"/>
+        <w:numPr>
+          <w:ilvl w:val="0"/>
+          <w:numId w:val="3"/>
+        </w:numPr>
+        <w:spacing w:after="60"/>
+      </w:pPr>
+      <w:r>
+        <w:t xml:space="preserve">The validate_against_oracles.py run showing GATE RESULT: 15/15.</w:t>
+      </w:r>
+    </w:p>
+    <w:p>
+      <w:pPr>
+        <w:pStyle w:val="ListParagraph"/>
+        <w:numPr>
+          <w:ilvl w:val="0"/>
+          <w:numId w:val="3"/>
+        </w:numPr>
+        <w:spacing w:after="60"/>
+      </w:pPr>
+      <w:r>
+        <w:t xml:space="preserve">Pretty-printed REF-007 (duplicate-referral risk) and REF-009 (safeguarding child) decision JSON.</w:t>
+      </w:r>
+    </w:p>
+    <w:p>
+      <w:pPr>
+        <w:pStyle w:val="ListParagraph"/>
+        <w:numPr>
+          <w:ilvl w:val="0"/>
+          <w:numId w:val="3"/>
+        </w:numPr>
+        <w:spacing w:after="60"/>
+      </w:pPr>
+      <w:r>
+        <w:t xml:space="preserve">GET /health and a POST /decide response from the running service.</w:t>
+      </w:r>
+    </w:p>
+    <w:p>
+      <w:pPr>
+        <w:pStyle w:val="Heading3"/>
+      </w:pPr>
+      <w:r>
+        <w:t xml:space="preserve">What to commit</w:t>
+      </w:r>
+    </w:p>
+    <w:p>
+      <w:pPr>
+        <w:spacing w:after="120"/>
+      </w:pPr>
+      <w:r>
+        <w:t xml:space="preserve">services/rules-engine/ (source, schema, CLI, HTTP service, harness, README), docs/testing/phase5-acceptance.md, data/decisions/.gitkeep, the .gitignore rule for data/decisions/, the README status table, and this build log. The decision JSON outputs are gitignored runtime artefacts.</w:t>
+      </w:r>
+    </w:p>
+    <w:p>
+      <w:pPr>
+        <w:pStyle w:val="Heading3"/>
+      </w:pPr>
+      <w:r>
+        <w:t xml:space="preserve">Next — Phase 6</w:t>
+      </w:r>
+    </w:p>
+    <w:p>
+      <w:pPr>
+        <w:spacing w:after="120"/>
+      </w:pPr>
+      <w:r>
+        <w:t xml:space="preserve">OpenMRS workflow mapping: define the Referral encounter type and concepts, seed Arthur Reed’s pre-existing active Cardiology referral (which activates the live OpenMRS duplicate check), and specify the concrete REST create + re-read verify the bot performs for an AUTO_CREATE decision.</w:t>
       </w:r>
     </w:p>
     <w:p>

</xml_diff>

<commit_message>
Add human-in-the-loop review loop (Phase 9)
A real SQLite review store, a reviewer decision tool, and a resolver that
re-reads each clinician decision and changes the final outcome: approvals and
amendments are created in OpenMRS via the writeback service, rejections record
nothing. Every action is audited and re-running is idempotent.

A new UiPath ReviewResolver process drives the loop (POST /resolve) and ran live
against the 10 referrals Phase 8 routed to review: 6 created in OpenMRS, 4
rejected. Self-contained acceptance gate passes 8/8.
</commit_message>
<xml_diff>
--- a/docs/Build-Progress-Log.docx
+++ b/docs/Build-Progress-Log.docx
@@ -41,23 +41,7 @@
           <w:i/>
           <w:iCs/>
         </w:rPr>
-        <w:t xml:space="preserve">UiPath REFramework · </w:t>
-      </w:r>
-      <w:proofErr w:type="spellStart"/>
-      <w:r>
-        <w:rPr>
-          <w:i/>
-          <w:iCs/>
-        </w:rPr>
-        <w:t>OpenMRS</w:t>
-      </w:r>
-      <w:proofErr w:type="spellEnd"/>
-      <w:r>
-        <w:rPr>
-          <w:i/>
-          <w:iCs/>
-        </w:rPr>
-        <w:t xml:space="preserve"> EMR · Synthetic Data · Agentic AI · Clinical Safety Controls</w:t>
+        <w:t>UiPath REFramework · OpenMRS EMR · Synthetic Data · Agentic AI · Clinical Safety Controls</w:t>
       </w:r>
     </w:p>
     <w:p>
@@ -92,23 +76,7 @@
           <w:b/>
           <w:bCs/>
         </w:rPr>
-        <w:t xml:space="preserve">Status: Phases 0–6 </w:t>
-      </w:r>
-      <w:proofErr w:type="gramStart"/>
-      <w:r>
-        <w:rPr>
-          <w:b/>
-          <w:bCs/>
-        </w:rPr>
-        <w:t>complete  —</w:t>
-      </w:r>
-      <w:proofErr w:type="gramEnd"/>
-      <w:r>
-        <w:rPr>
-          <w:b/>
-          <w:bCs/>
-        </w:rPr>
-        <w:t xml:space="preserve">  next: Phase 7 (REFramework design spec)</w:t>
+        <w:t>Status: Phases 0–6 complete  —  next: Phase 7 (REFramework design spec)</w:t>
       </w:r>
     </w:p>
     <w:p>
@@ -145,11 +113,7 @@
           </w:pPr>
           <w:r>
             <w:fldChar w:fldCharType="begin"/>
-          </w:r>
-          <w:r>
             <w:instrText>TOC \h \o "1-2"</w:instrText>
-          </w:r>
-          <w:r>
             <w:fldChar w:fldCharType="separate"/>
           </w:r>
           <w:hyperlink w:anchor="_Toc232111784" w:history="1">
@@ -165,40 +129,10 @@
                 <w:noProof/>
               </w:rPr>
               <w:tab/>
-            </w:r>
-            <w:r>
-              <w:rPr>
-                <w:noProof/>
-              </w:rPr>
               <w:fldChar w:fldCharType="begin"/>
-            </w:r>
-            <w:r>
-              <w:rPr>
-                <w:noProof/>
-              </w:rPr>
               <w:instrText xml:space="preserve"> PAGEREF _Toc232111784 \h </w:instrText>
-            </w:r>
-            <w:r>
-              <w:rPr>
-                <w:noProof/>
-              </w:rPr>
-            </w:r>
-            <w:r>
-              <w:rPr>
-                <w:noProof/>
-              </w:rPr>
               <w:fldChar w:fldCharType="separate"/>
-            </w:r>
-            <w:r>
-              <w:rPr>
-                <w:noProof/>
-              </w:rPr>
               <w:t>2</w:t>
-            </w:r>
-            <w:r>
-              <w:rPr>
-                <w:noProof/>
-              </w:rPr>
               <w:fldChar w:fldCharType="end"/>
             </w:r>
           </w:hyperlink>
@@ -226,40 +160,10 @@
                 <w:noProof/>
               </w:rPr>
               <w:tab/>
-            </w:r>
-            <w:r>
-              <w:rPr>
-                <w:noProof/>
-              </w:rPr>
               <w:fldChar w:fldCharType="begin"/>
-            </w:r>
-            <w:r>
-              <w:rPr>
-                <w:noProof/>
-              </w:rPr>
               <w:instrText xml:space="preserve"> PAGEREF _Toc232111785 \h </w:instrText>
-            </w:r>
-            <w:r>
-              <w:rPr>
-                <w:noProof/>
-              </w:rPr>
-            </w:r>
-            <w:r>
-              <w:rPr>
-                <w:noProof/>
-              </w:rPr>
               <w:fldChar w:fldCharType="separate"/>
-            </w:r>
-            <w:r>
-              <w:rPr>
-                <w:noProof/>
-              </w:rPr>
               <w:t>3</w:t>
-            </w:r>
-            <w:r>
-              <w:rPr>
-                <w:noProof/>
-              </w:rPr>
               <w:fldChar w:fldCharType="end"/>
             </w:r>
           </w:hyperlink>
@@ -287,40 +191,10 @@
                 <w:noProof/>
               </w:rPr>
               <w:tab/>
-            </w:r>
-            <w:r>
-              <w:rPr>
-                <w:noProof/>
-              </w:rPr>
               <w:fldChar w:fldCharType="begin"/>
-            </w:r>
-            <w:r>
-              <w:rPr>
-                <w:noProof/>
-              </w:rPr>
               <w:instrText xml:space="preserve"> PAGEREF _Toc232111786 \h </w:instrText>
-            </w:r>
-            <w:r>
-              <w:rPr>
-                <w:noProof/>
-              </w:rPr>
-            </w:r>
-            <w:r>
-              <w:rPr>
-                <w:noProof/>
-              </w:rPr>
               <w:fldChar w:fldCharType="separate"/>
-            </w:r>
-            <w:r>
-              <w:rPr>
-                <w:noProof/>
-              </w:rPr>
               <w:t>4</w:t>
-            </w:r>
-            <w:r>
-              <w:rPr>
-                <w:noProof/>
-              </w:rPr>
               <w:fldChar w:fldCharType="end"/>
             </w:r>
           </w:hyperlink>
@@ -348,40 +222,10 @@
                 <w:noProof/>
               </w:rPr>
               <w:tab/>
-            </w:r>
-            <w:r>
-              <w:rPr>
-                <w:noProof/>
-              </w:rPr>
               <w:fldChar w:fldCharType="begin"/>
-            </w:r>
-            <w:r>
-              <w:rPr>
-                <w:noProof/>
-              </w:rPr>
               <w:instrText xml:space="preserve"> PAGEREF _Toc232111787 \h </w:instrText>
-            </w:r>
-            <w:r>
-              <w:rPr>
-                <w:noProof/>
-              </w:rPr>
-            </w:r>
-            <w:r>
-              <w:rPr>
-                <w:noProof/>
-              </w:rPr>
               <w:fldChar w:fldCharType="separate"/>
-            </w:r>
-            <w:r>
-              <w:rPr>
-                <w:noProof/>
-              </w:rPr>
               <w:t>6</w:t>
-            </w:r>
-            <w:r>
-              <w:rPr>
-                <w:noProof/>
-              </w:rPr>
               <w:fldChar w:fldCharType="end"/>
             </w:r>
           </w:hyperlink>
@@ -409,40 +253,10 @@
                 <w:noProof/>
               </w:rPr>
               <w:tab/>
-            </w:r>
-            <w:r>
-              <w:rPr>
-                <w:noProof/>
-              </w:rPr>
               <w:fldChar w:fldCharType="begin"/>
-            </w:r>
-            <w:r>
-              <w:rPr>
-                <w:noProof/>
-              </w:rPr>
               <w:instrText xml:space="preserve"> PAGEREF _Toc232111788 \h </w:instrText>
-            </w:r>
-            <w:r>
-              <w:rPr>
-                <w:noProof/>
-              </w:rPr>
-            </w:r>
-            <w:r>
-              <w:rPr>
-                <w:noProof/>
-              </w:rPr>
               <w:fldChar w:fldCharType="separate"/>
-            </w:r>
-            <w:r>
-              <w:rPr>
-                <w:noProof/>
-              </w:rPr>
               <w:t>7</w:t>
-            </w:r>
-            <w:r>
-              <w:rPr>
-                <w:noProof/>
-              </w:rPr>
               <w:fldChar w:fldCharType="end"/>
             </w:r>
           </w:hyperlink>
@@ -470,40 +284,10 @@
                 <w:noProof/>
               </w:rPr>
               <w:tab/>
-            </w:r>
-            <w:r>
-              <w:rPr>
-                <w:noProof/>
-              </w:rPr>
               <w:fldChar w:fldCharType="begin"/>
-            </w:r>
-            <w:r>
-              <w:rPr>
-                <w:noProof/>
-              </w:rPr>
               <w:instrText xml:space="preserve"> PAGEREF _Toc232111789 \h </w:instrText>
-            </w:r>
-            <w:r>
-              <w:rPr>
-                <w:noProof/>
-              </w:rPr>
-            </w:r>
-            <w:r>
-              <w:rPr>
-                <w:noProof/>
-              </w:rPr>
               <w:fldChar w:fldCharType="separate"/>
-            </w:r>
-            <w:r>
-              <w:rPr>
-                <w:noProof/>
-              </w:rPr>
               <w:t>8</w:t>
-            </w:r>
-            <w:r>
-              <w:rPr>
-                <w:noProof/>
-              </w:rPr>
               <w:fldChar w:fldCharType="end"/>
             </w:r>
           </w:hyperlink>
@@ -531,40 +315,10 @@
                 <w:noProof/>
               </w:rPr>
               <w:tab/>
-            </w:r>
-            <w:r>
-              <w:rPr>
-                <w:noProof/>
-              </w:rPr>
               <w:fldChar w:fldCharType="begin"/>
-            </w:r>
-            <w:r>
-              <w:rPr>
-                <w:noProof/>
-              </w:rPr>
               <w:instrText xml:space="preserve"> PAGEREF _Toc232111790 \h </w:instrText>
-            </w:r>
-            <w:r>
-              <w:rPr>
-                <w:noProof/>
-              </w:rPr>
-            </w:r>
-            <w:r>
-              <w:rPr>
-                <w:noProof/>
-              </w:rPr>
               <w:fldChar w:fldCharType="separate"/>
-            </w:r>
-            <w:r>
-              <w:rPr>
-                <w:noProof/>
-              </w:rPr>
               <w:t>9</w:t>
-            </w:r>
-            <w:r>
-              <w:rPr>
-                <w:noProof/>
-              </w:rPr>
               <w:fldChar w:fldCharType="end"/>
             </w:r>
           </w:hyperlink>
@@ -592,40 +346,10 @@
                 <w:noProof/>
               </w:rPr>
               <w:tab/>
-            </w:r>
-            <w:r>
-              <w:rPr>
-                <w:noProof/>
-              </w:rPr>
               <w:fldChar w:fldCharType="begin"/>
-            </w:r>
-            <w:r>
-              <w:rPr>
-                <w:noProof/>
-              </w:rPr>
               <w:instrText xml:space="preserve"> PAGEREF _Toc232111791 \h </w:instrText>
-            </w:r>
-            <w:r>
-              <w:rPr>
-                <w:noProof/>
-              </w:rPr>
-            </w:r>
-            <w:r>
-              <w:rPr>
-                <w:noProof/>
-              </w:rPr>
               <w:fldChar w:fldCharType="separate"/>
-            </w:r>
-            <w:r>
-              <w:rPr>
-                <w:noProof/>
-              </w:rPr>
               <w:t>10</w:t>
-            </w:r>
-            <w:r>
-              <w:rPr>
-                <w:noProof/>
-              </w:rPr>
               <w:fldChar w:fldCharType="end"/>
             </w:r>
           </w:hyperlink>
@@ -653,40 +377,10 @@
                 <w:noProof/>
               </w:rPr>
               <w:tab/>
-            </w:r>
-            <w:r>
-              <w:rPr>
-                <w:noProof/>
-              </w:rPr>
               <w:fldChar w:fldCharType="begin"/>
-            </w:r>
-            <w:r>
-              <w:rPr>
-                <w:noProof/>
-              </w:rPr>
               <w:instrText xml:space="preserve"> PAGEREF _Toc232111792 \h </w:instrText>
-            </w:r>
-            <w:r>
-              <w:rPr>
-                <w:noProof/>
-              </w:rPr>
-            </w:r>
-            <w:r>
-              <w:rPr>
-                <w:noProof/>
-              </w:rPr>
               <w:fldChar w:fldCharType="separate"/>
-            </w:r>
-            <w:r>
-              <w:rPr>
-                <w:noProof/>
-              </w:rPr>
               <w:t>12</w:t>
-            </w:r>
-            <w:r>
-              <w:rPr>
-                <w:noProof/>
-              </w:rPr>
               <w:fldChar w:fldCharType="end"/>
             </w:r>
           </w:hyperlink>
@@ -714,40 +408,10 @@
                 <w:noProof/>
               </w:rPr>
               <w:tab/>
-            </w:r>
-            <w:r>
-              <w:rPr>
-                <w:noProof/>
-              </w:rPr>
               <w:fldChar w:fldCharType="begin"/>
-            </w:r>
-            <w:r>
-              <w:rPr>
-                <w:noProof/>
-              </w:rPr>
               <w:instrText xml:space="preserve"> PAGEREF _Toc232111793 \h </w:instrText>
-            </w:r>
-            <w:r>
-              <w:rPr>
-                <w:noProof/>
-              </w:rPr>
-            </w:r>
-            <w:r>
-              <w:rPr>
-                <w:noProof/>
-              </w:rPr>
               <w:fldChar w:fldCharType="separate"/>
-            </w:r>
-            <w:r>
-              <w:rPr>
-                <w:noProof/>
-              </w:rPr>
               <w:t>14</w:t>
-            </w:r>
-            <w:r>
-              <w:rPr>
-                <w:noProof/>
-              </w:rPr>
               <w:fldChar w:fldCharType="end"/>
             </w:r>
           </w:hyperlink>
@@ -775,40 +439,10 @@
                 <w:noProof/>
               </w:rPr>
               <w:tab/>
-            </w:r>
-            <w:r>
-              <w:rPr>
-                <w:noProof/>
-              </w:rPr>
               <w:fldChar w:fldCharType="begin"/>
-            </w:r>
-            <w:r>
-              <w:rPr>
-                <w:noProof/>
-              </w:rPr>
               <w:instrText xml:space="preserve"> PAGEREF _Toc232111794 \h </w:instrText>
-            </w:r>
-            <w:r>
-              <w:rPr>
-                <w:noProof/>
-              </w:rPr>
-            </w:r>
-            <w:r>
-              <w:rPr>
-                <w:noProof/>
-              </w:rPr>
               <w:fldChar w:fldCharType="separate"/>
-            </w:r>
-            <w:r>
-              <w:rPr>
-                <w:noProof/>
-              </w:rPr>
               <w:t>16</w:t>
-            </w:r>
-            <w:r>
-              <w:rPr>
-                <w:noProof/>
-              </w:rPr>
               <w:fldChar w:fldCharType="end"/>
             </w:r>
           </w:hyperlink>
@@ -836,40 +470,10 @@
                 <w:noProof/>
               </w:rPr>
               <w:tab/>
-            </w:r>
-            <w:r>
-              <w:rPr>
-                <w:noProof/>
-              </w:rPr>
               <w:fldChar w:fldCharType="begin"/>
-            </w:r>
-            <w:r>
-              <w:rPr>
-                <w:noProof/>
-              </w:rPr>
               <w:instrText xml:space="preserve"> PAGEREF _Toc232111795 \h </w:instrText>
-            </w:r>
-            <w:r>
-              <w:rPr>
-                <w:noProof/>
-              </w:rPr>
-            </w:r>
-            <w:r>
-              <w:rPr>
-                <w:noProof/>
-              </w:rPr>
               <w:fldChar w:fldCharType="separate"/>
-            </w:r>
-            <w:r>
-              <w:rPr>
-                <w:noProof/>
-              </w:rPr>
               <w:t>18</w:t>
-            </w:r>
-            <w:r>
-              <w:rPr>
-                <w:noProof/>
-              </w:rPr>
               <w:fldChar w:fldCharType="end"/>
             </w:r>
           </w:hyperlink>
@@ -897,40 +501,10 @@
                 <w:noProof/>
               </w:rPr>
               <w:tab/>
-            </w:r>
-            <w:r>
-              <w:rPr>
-                <w:noProof/>
-              </w:rPr>
               <w:fldChar w:fldCharType="begin"/>
-            </w:r>
-            <w:r>
-              <w:rPr>
-                <w:noProof/>
-              </w:rPr>
               <w:instrText xml:space="preserve"> PAGEREF _Toc232111796 \h </w:instrText>
-            </w:r>
-            <w:r>
-              <w:rPr>
-                <w:noProof/>
-              </w:rPr>
-            </w:r>
-            <w:r>
-              <w:rPr>
-                <w:noProof/>
-              </w:rPr>
               <w:fldChar w:fldCharType="separate"/>
-            </w:r>
-            <w:r>
-              <w:rPr>
-                <w:noProof/>
-              </w:rPr>
               <w:t>20</w:t>
-            </w:r>
-            <w:r>
-              <w:rPr>
-                <w:noProof/>
-              </w:rPr>
               <w:fldChar w:fldCharType="end"/>
             </w:r>
           </w:hyperlink>
@@ -958,40 +532,10 @@
                 <w:noProof/>
               </w:rPr>
               <w:tab/>
-            </w:r>
-            <w:r>
-              <w:rPr>
-                <w:noProof/>
-              </w:rPr>
               <w:fldChar w:fldCharType="begin"/>
-            </w:r>
-            <w:r>
-              <w:rPr>
-                <w:noProof/>
-              </w:rPr>
               <w:instrText xml:space="preserve"> PAGEREF _Toc232111797 \h </w:instrText>
-            </w:r>
-            <w:r>
-              <w:rPr>
-                <w:noProof/>
-              </w:rPr>
-            </w:r>
-            <w:r>
-              <w:rPr>
-                <w:noProof/>
-              </w:rPr>
               <w:fldChar w:fldCharType="separate"/>
-            </w:r>
-            <w:r>
-              <w:rPr>
-                <w:noProof/>
-              </w:rPr>
               <w:t>21</w:t>
-            </w:r>
-            <w:r>
-              <w:rPr>
-                <w:noProof/>
-              </w:rPr>
               <w:fldChar w:fldCharType="end"/>
             </w:r>
           </w:hyperlink>
@@ -1019,40 +563,10 @@
                 <w:noProof/>
               </w:rPr>
               <w:tab/>
-            </w:r>
-            <w:r>
-              <w:rPr>
-                <w:noProof/>
-              </w:rPr>
               <w:fldChar w:fldCharType="begin"/>
-            </w:r>
-            <w:r>
-              <w:rPr>
-                <w:noProof/>
-              </w:rPr>
               <w:instrText xml:space="preserve"> PAGEREF _Toc232111798 \h </w:instrText>
-            </w:r>
-            <w:r>
-              <w:rPr>
-                <w:noProof/>
-              </w:rPr>
-            </w:r>
-            <w:r>
-              <w:rPr>
-                <w:noProof/>
-              </w:rPr>
               <w:fldChar w:fldCharType="separate"/>
-            </w:r>
-            <w:r>
-              <w:rPr>
-                <w:noProof/>
-              </w:rPr>
               <w:t>22</w:t>
-            </w:r>
-            <w:r>
-              <w:rPr>
-                <w:noProof/>
-              </w:rPr>
               <w:fldChar w:fldCharType="end"/>
             </w:r>
           </w:hyperlink>
@@ -1156,30 +670,10 @@
           <w:b/>
           <w:bCs/>
         </w:rPr>
-        <w:t xml:space="preserve">Looks the patient </w:t>
-      </w:r>
-      <w:proofErr w:type="gramStart"/>
-      <w:r>
-        <w:rPr>
-          <w:b/>
-          <w:bCs/>
-        </w:rPr>
-        <w:t>up</w:t>
-      </w:r>
-      <w:r>
-        <w:t xml:space="preserve">  in</w:t>
-      </w:r>
-      <w:proofErr w:type="gramEnd"/>
-      <w:r>
-        <w:t xml:space="preserve"> the hospital system (</w:t>
-      </w:r>
-      <w:proofErr w:type="spellStart"/>
-      <w:r>
-        <w:t>OpenMRS</w:t>
-      </w:r>
-      <w:proofErr w:type="spellEnd"/>
-      <w:r>
-        <w:t>) using those details.</w:t>
+        <w:t>Looks the patient up</w:t>
+      </w:r>
+      <w:r>
+        <w:t xml:space="preserve">  in the hospital system (OpenMRS) using those details.</w:t>
       </w:r>
     </w:p>
     <w:p>
@@ -1199,15 +693,7 @@
         <w:t>Checks it is really the right person.</w:t>
       </w:r>
       <w:r>
-        <w:t xml:space="preserve">  One perfect match → good. NHS number matches but date of birth does not, or two different people </w:t>
-      </w:r>
-      <w:proofErr w:type="gramStart"/>
-      <w:r>
-        <w:t>match</w:t>
-      </w:r>
-      <w:proofErr w:type="gramEnd"/>
-      <w:r>
-        <w:t xml:space="preserve"> → STOP and get a human. Updating the wrong patient is the worst outcome, so it pauses rather than guess.</w:t>
+        <w:t xml:space="preserve">  One perfect match → good. NHS number matches but date of birth does not, or two different people match → STOP and get a human. Updating the wrong patient is the worst outcome, so it pauses rather than guess.</w:t>
       </w:r>
     </w:p>
     <w:p>
@@ -1377,22 +863,10 @@
           <w:b/>
           <w:bCs/>
         </w:rPr>
-        <w:t xml:space="preserve">Files the </w:t>
-      </w:r>
-      <w:proofErr w:type="gramStart"/>
-      <w:r>
-        <w:rPr>
-          <w:b/>
-          <w:bCs/>
-        </w:rPr>
-        <w:t>letter</w:t>
-      </w:r>
-      <w:r>
-        <w:t xml:space="preserve">  into</w:t>
-      </w:r>
-      <w:proofErr w:type="gramEnd"/>
-      <w:r>
-        <w:t xml:space="preserve"> the right folder (done / needs-review / failed) and moves on to the next one.</w:t>
+        <w:t>Files the letter</w:t>
+      </w:r>
+      <w:r>
+        <w:t xml:space="preserve">  into the right folder (done / needs-review / failed) and moves on to the next one.</w:t>
       </w:r>
     </w:p>
     <w:p>
@@ -1612,7 +1086,6 @@
             </w:tcMar>
           </w:tcPr>
           <w:p>
-            <w:proofErr w:type="spellStart"/>
             <w:r>
               <w:rPr>
                 <w:sz w:val="20"/>
@@ -1620,7 +1093,6 @@
               </w:rPr>
               <w:t>OpenMRS</w:t>
             </w:r>
-            <w:proofErr w:type="spellEnd"/>
           </w:p>
         </w:tc>
         <w:tc>
@@ -1906,39 +1378,7 @@
         <w:spacing w:after="120"/>
       </w:pPr>
       <w:r>
-        <w:t xml:space="preserve">An end-to-end Intelligent Automation portfolio project built to NHS RPA / IA standards. A synthetic referral letter is ingested via an Orchestrator queue; a UiPath REFramework bot extracts it (LLM with a deterministic regex fallback), validates the patient against </w:t>
-      </w:r>
-      <w:proofErr w:type="spellStart"/>
-      <w:r>
-        <w:t>OpenMRS</w:t>
-      </w:r>
-      <w:proofErr w:type="spellEnd"/>
-      <w:r>
-        <w:t xml:space="preserve"> (a real mock EPR), checks completeness, patient-match risk and </w:t>
-      </w:r>
-      <w:proofErr w:type="spellStart"/>
-      <w:r>
-        <w:t>duplica</w:t>
-      </w:r>
-      <w:proofErr w:type="spellEnd"/>
-      <w:r>
-        <w:t xml:space="preserve">  </w:t>
-      </w:r>
-      <w:proofErr w:type="spellStart"/>
-      <w:r>
-        <w:t>te</w:t>
-      </w:r>
-      <w:proofErr w:type="spellEnd"/>
-      <w:r>
-        <w:t xml:space="preserve"> risk, applies rule-based clinical-safety logic, creates a referral record in </w:t>
-      </w:r>
-      <w:proofErr w:type="spellStart"/>
-      <w:r>
-        <w:t>OpenMRS</w:t>
-      </w:r>
-      <w:proofErr w:type="spellEnd"/>
-      <w:r>
-        <w:t xml:space="preserve"> for safe cases or escalates risky cases to a real human-review store, writes a full audit trail, files the document, and produces reporting evidence.</w:t>
+        <w:t>An end-to-end Intelligent Automation portfolio project built to NHS RPA / IA standards. A synthetic referral letter is ingested via an Orchestrator queue; a UiPath REFramework bot extracts it (LLM with a deterministic regex fallback), validates the patient against OpenMRS (a real mock EPR), checks completeness, patient-match risk and duplica  te risk, applies rule-based clinical-safety logic, creates a referral record in OpenMRS for safe cases or escalates risky cases to a real human-review store, writes a full audit trail, files the document, and produces reporting evidence.</w:t>
       </w:r>
     </w:p>
     <w:p>
@@ -2134,21 +1574,12 @@
             </w:tcMar>
           </w:tcPr>
           <w:p>
-            <w:proofErr w:type="spellStart"/>
-            <w:r>
-              <w:rPr>
-                <w:sz w:val="20"/>
-                <w:szCs w:val="20"/>
-              </w:rPr>
-              <w:t>OpenMRS</w:t>
-            </w:r>
-            <w:proofErr w:type="spellEnd"/>
-            <w:r>
-              <w:rPr>
-                <w:sz w:val="20"/>
-                <w:szCs w:val="20"/>
-              </w:rPr>
-              <w:t xml:space="preserve"> 3 (Docker)</w:t>
+            <w:r>
+              <w:rPr>
+                <w:sz w:val="20"/>
+                <w:szCs w:val="20"/>
+              </w:rPr>
+              <w:t>OpenMRS 3 (Docker)</w:t>
             </w:r>
           </w:p>
         </w:tc>
@@ -2492,23 +1923,7 @@
                 <w:sz w:val="20"/>
                 <w:szCs w:val="20"/>
               </w:rPr>
-              <w:t xml:space="preserve">SQLite table (Action </w:t>
-            </w:r>
-            <w:proofErr w:type="spellStart"/>
-            <w:r>
-              <w:rPr>
-                <w:sz w:val="20"/>
-                <w:szCs w:val="20"/>
-              </w:rPr>
-              <w:t>Center</w:t>
-            </w:r>
-            <w:proofErr w:type="spellEnd"/>
-            <w:r>
-              <w:rPr>
-                <w:sz w:val="20"/>
-                <w:szCs w:val="20"/>
-              </w:rPr>
-              <w:t xml:space="preserve"> optional)</w:t>
+              <w:t>SQLite table (Action Center optional)</w:t>
             </w:r>
           </w:p>
         </w:tc>
@@ -2644,18 +2059,8 @@
           <w:sz w:val="20"/>
           <w:szCs w:val="20"/>
         </w:rPr>
-        <w:t>E:\Learning\UiPath\UiPath Tutorial &amp; Projects\Projects\</w:t>
-      </w:r>
-      <w:proofErr w:type="spellStart"/>
-      <w:r>
-        <w:rPr>
-          <w:rFonts w:ascii="Consolas" w:eastAsia="Consolas" w:hAnsi="Consolas" w:cs="Consolas"/>
-          <w:sz w:val="20"/>
-          <w:szCs w:val="20"/>
-        </w:rPr>
-        <w:t>nhs</w:t>
-      </w:r>
-      <w:proofErr w:type="spellEnd"/>
+        <w:t>E:\Learning\UiPath\UiPath Tutorial &amp; Projects\Projects\nhs</w:t>
+      </w:r>
     </w:p>
     <w:p>
       <w:pPr>
@@ -2668,7 +2073,6 @@
         </w:rPr>
         <w:t xml:space="preserve">Key documents: </w:t>
       </w:r>
-      <w:proofErr w:type="gramStart"/>
       <w:r>
         <w:rPr>
           <w:rFonts w:ascii="Consolas" w:eastAsia="Consolas" w:hAnsi="Consolas" w:cs="Consolas"/>
@@ -2678,13 +2082,8 @@
         <w:t>README.md</w:t>
       </w:r>
       <w:r>
-        <w:t xml:space="preserve">  ·</w:t>
-      </w:r>
-      <w:proofErr w:type="gramEnd"/>
-      <w:r>
-        <w:t xml:space="preserve">  </w:t>
-      </w:r>
-      <w:proofErr w:type="gramStart"/>
+        <w:t xml:space="preserve">  ·  </w:t>
+      </w:r>
       <w:r>
         <w:rPr>
           <w:rFonts w:ascii="Consolas" w:eastAsia="Consolas" w:hAnsi="Consolas" w:cs="Consolas"/>
@@ -2694,13 +2093,8 @@
         <w:t>docs/business/project-scope.md</w:t>
       </w:r>
       <w:r>
-        <w:t xml:space="preserve">  ·</w:t>
-      </w:r>
-      <w:proofErr w:type="gramEnd"/>
-      <w:r>
-        <w:t xml:space="preserve">  </w:t>
-      </w:r>
-      <w:proofErr w:type="gramStart"/>
+        <w:t xml:space="preserve">  ·  </w:t>
+      </w:r>
       <w:r>
         <w:rPr>
           <w:rFonts w:ascii="Consolas" w:eastAsia="Consolas" w:hAnsi="Consolas" w:cs="Consolas"/>
@@ -2710,13 +2104,8 @@
         <w:t>docs/technical/architecture.md</w:t>
       </w:r>
       <w:r>
-        <w:t xml:space="preserve">  ·</w:t>
-      </w:r>
-      <w:proofErr w:type="gramEnd"/>
-      <w:r>
-        <w:t xml:space="preserve">  </w:t>
-      </w:r>
-      <w:proofErr w:type="gramStart"/>
+        <w:t xml:space="preserve">  ·  </w:t>
+      </w:r>
       <w:r>
         <w:rPr>
           <w:rFonts w:ascii="Consolas" w:eastAsia="Consolas" w:hAnsi="Consolas" w:cs="Consolas"/>
@@ -2726,13 +2115,8 @@
         <w:t>docs/testing/phase1-acceptance.md</w:t>
       </w:r>
       <w:r>
-        <w:t xml:space="preserve">  ·</w:t>
-      </w:r>
-      <w:proofErr w:type="gramEnd"/>
-      <w:r>
-        <w:t xml:space="preserve">  </w:t>
-      </w:r>
-      <w:proofErr w:type="gramStart"/>
+        <w:t xml:space="preserve">  ·  </w:t>
+      </w:r>
       <w:r>
         <w:rPr>
           <w:rFonts w:ascii="Consolas" w:eastAsia="Consolas" w:hAnsi="Consolas" w:cs="Consolas"/>
@@ -2742,11 +2126,7 @@
         <w:t>docs/testing/phase2-acceptance.md</w:t>
       </w:r>
       <w:r>
-        <w:t xml:space="preserve">  ·</w:t>
-      </w:r>
-      <w:proofErr w:type="gramEnd"/>
-      <w:r>
-        <w:t xml:space="preserve">  </w:t>
+        <w:t xml:space="preserve">  ·  </w:t>
       </w:r>
       <w:r>
         <w:rPr>
@@ -2779,13 +2159,8 @@
         <w:pStyle w:val="Heading3"/>
       </w:pPr>
       <w:r>
-        <w:t xml:space="preserve">Start / stop </w:t>
-      </w:r>
-      <w:proofErr w:type="spellStart"/>
-      <w:r>
-        <w:t>OpenMRS</w:t>
-      </w:r>
-      <w:proofErr w:type="spellEnd"/>
+        <w:t>Start / stop OpenMRS</w:t>
+      </w:r>
     </w:p>
     <w:p>
       <w:pPr>
@@ -2797,244 +2172,72 @@
           <w:sz w:val="20"/>
           <w:szCs w:val="20"/>
         </w:rPr>
-        <w:t>docker compose -f "</w:t>
-      </w:r>
-      <w:proofErr w:type="spellStart"/>
+        <w:t>docker compose -f "openmrs-setup\docker-compose.yml" up -d</w:t>
+      </w:r>
+    </w:p>
+    <w:p>
+      <w:pPr>
+        <w:spacing w:after="120"/>
+      </w:pPr>
       <w:r>
         <w:rPr>
           <w:rFonts w:ascii="Consolas" w:eastAsia="Consolas" w:hAnsi="Consolas" w:cs="Consolas"/>
           <w:sz w:val="20"/>
           <w:szCs w:val="20"/>
         </w:rPr>
-        <w:t>openmrs</w:t>
-      </w:r>
-      <w:proofErr w:type="spellEnd"/>
+        <w:t>docker compose -f "openmrs-setup\docker-compose.yml" ps      # all four services Up</w:t>
+      </w:r>
+    </w:p>
+    <w:p>
+      <w:pPr>
+        <w:spacing w:after="120"/>
+      </w:pPr>
       <w:r>
         <w:rPr>
           <w:rFonts w:ascii="Consolas" w:eastAsia="Consolas" w:hAnsi="Consolas" w:cs="Consolas"/>
           <w:sz w:val="20"/>
           <w:szCs w:val="20"/>
         </w:rPr>
-        <w:t>-setup\docker-</w:t>
-      </w:r>
-      <w:proofErr w:type="spellStart"/>
+        <w:t>docker compose -f "openmrs-setup\docker-compose.yml" stop    # keep data</w:t>
+      </w:r>
+    </w:p>
+    <w:p>
+      <w:pPr>
+        <w:spacing w:after="120"/>
+      </w:pPr>
+      <w:r>
+        <w:rPr>
+          <w:b/>
+          <w:bCs/>
+        </w:rPr>
+        <w:t xml:space="preserve">Readiness gate: </w:t>
+      </w:r>
+      <w:r>
+        <w:t xml:space="preserve">the container healthcheck reports 'healthy' BEFORE the app is ready. The real check is the REST session call returning </w:t>
+      </w:r>
       <w:r>
         <w:rPr>
           <w:rFonts w:ascii="Consolas" w:eastAsia="Consolas" w:hAnsi="Consolas" w:cs="Consolas"/>
           <w:sz w:val="20"/>
           <w:szCs w:val="20"/>
         </w:rPr>
-        <w:t>compose.yml</w:t>
-      </w:r>
-      <w:proofErr w:type="spellEnd"/>
+        <w:t>"authenticated":true</w:t>
+      </w:r>
+      <w:r>
+        <w:t>:</w:t>
+      </w:r>
+    </w:p>
+    <w:p>
+      <w:pPr>
+        <w:spacing w:after="120"/>
+      </w:pPr>
       <w:r>
         <w:rPr>
           <w:rFonts w:ascii="Consolas" w:eastAsia="Consolas" w:hAnsi="Consolas" w:cs="Consolas"/>
           <w:sz w:val="20"/>
           <w:szCs w:val="20"/>
         </w:rPr>
-        <w:t>" up -d</w:t>
-      </w:r>
-    </w:p>
-    <w:p>
-      <w:pPr>
-        <w:spacing w:after="120"/>
-      </w:pPr>
-      <w:r>
-        <w:rPr>
-          <w:rFonts w:ascii="Consolas" w:eastAsia="Consolas" w:hAnsi="Consolas" w:cs="Consolas"/>
-          <w:sz w:val="20"/>
-          <w:szCs w:val="20"/>
-        </w:rPr>
-        <w:t>docker compose -f "</w:t>
-      </w:r>
-      <w:proofErr w:type="spellStart"/>
-      <w:r>
-        <w:rPr>
-          <w:rFonts w:ascii="Consolas" w:eastAsia="Consolas" w:hAnsi="Consolas" w:cs="Consolas"/>
-          <w:sz w:val="20"/>
-          <w:szCs w:val="20"/>
-        </w:rPr>
-        <w:t>openmrs</w:t>
-      </w:r>
-      <w:proofErr w:type="spellEnd"/>
-      <w:r>
-        <w:rPr>
-          <w:rFonts w:ascii="Consolas" w:eastAsia="Consolas" w:hAnsi="Consolas" w:cs="Consolas"/>
-          <w:sz w:val="20"/>
-          <w:szCs w:val="20"/>
-        </w:rPr>
-        <w:t>-setup\docker-</w:t>
-      </w:r>
-      <w:proofErr w:type="spellStart"/>
-      <w:r>
-        <w:rPr>
-          <w:rFonts w:ascii="Consolas" w:eastAsia="Consolas" w:hAnsi="Consolas" w:cs="Consolas"/>
-          <w:sz w:val="20"/>
-          <w:szCs w:val="20"/>
-        </w:rPr>
-        <w:t>compose.yml</w:t>
-      </w:r>
-      <w:proofErr w:type="spellEnd"/>
-      <w:r>
-        <w:rPr>
-          <w:rFonts w:ascii="Consolas" w:eastAsia="Consolas" w:hAnsi="Consolas" w:cs="Consolas"/>
-          <w:sz w:val="20"/>
-          <w:szCs w:val="20"/>
-        </w:rPr>
-        <w:t xml:space="preserve">" </w:t>
-      </w:r>
-      <w:proofErr w:type="spellStart"/>
-      <w:r>
-        <w:rPr>
-          <w:rFonts w:ascii="Consolas" w:eastAsia="Consolas" w:hAnsi="Consolas" w:cs="Consolas"/>
-          <w:sz w:val="20"/>
-          <w:szCs w:val="20"/>
-        </w:rPr>
-        <w:t>ps</w:t>
-      </w:r>
-      <w:proofErr w:type="spellEnd"/>
-      <w:r>
-        <w:rPr>
-          <w:rFonts w:ascii="Consolas" w:eastAsia="Consolas" w:hAnsi="Consolas" w:cs="Consolas"/>
-          <w:sz w:val="20"/>
-          <w:szCs w:val="20"/>
-        </w:rPr>
-        <w:t xml:space="preserve">      # all four services Up</w:t>
-      </w:r>
-    </w:p>
-    <w:p>
-      <w:pPr>
-        <w:spacing w:after="120"/>
-      </w:pPr>
-      <w:r>
-        <w:rPr>
-          <w:rFonts w:ascii="Consolas" w:eastAsia="Consolas" w:hAnsi="Consolas" w:cs="Consolas"/>
-          <w:sz w:val="20"/>
-          <w:szCs w:val="20"/>
-        </w:rPr>
-        <w:t>docker compose -f "</w:t>
-      </w:r>
-      <w:proofErr w:type="spellStart"/>
-      <w:r>
-        <w:rPr>
-          <w:rFonts w:ascii="Consolas" w:eastAsia="Consolas" w:hAnsi="Consolas" w:cs="Consolas"/>
-          <w:sz w:val="20"/>
-          <w:szCs w:val="20"/>
-        </w:rPr>
-        <w:t>openmrs</w:t>
-      </w:r>
-      <w:proofErr w:type="spellEnd"/>
-      <w:r>
-        <w:rPr>
-          <w:rFonts w:ascii="Consolas" w:eastAsia="Consolas" w:hAnsi="Consolas" w:cs="Consolas"/>
-          <w:sz w:val="20"/>
-          <w:szCs w:val="20"/>
-        </w:rPr>
-        <w:t>-setup\docker-</w:t>
-      </w:r>
-      <w:proofErr w:type="spellStart"/>
-      <w:r>
-        <w:rPr>
-          <w:rFonts w:ascii="Consolas" w:eastAsia="Consolas" w:hAnsi="Consolas" w:cs="Consolas"/>
-          <w:sz w:val="20"/>
-          <w:szCs w:val="20"/>
-        </w:rPr>
-        <w:t>compose.yml</w:t>
-      </w:r>
-      <w:proofErr w:type="spellEnd"/>
-      <w:r>
-        <w:rPr>
-          <w:rFonts w:ascii="Consolas" w:eastAsia="Consolas" w:hAnsi="Consolas" w:cs="Consolas"/>
-          <w:sz w:val="20"/>
-          <w:szCs w:val="20"/>
-        </w:rPr>
-        <w:t>" stop    # keep data</w:t>
-      </w:r>
-    </w:p>
-    <w:p>
-      <w:pPr>
-        <w:spacing w:after="120"/>
-      </w:pPr>
-      <w:r>
-        <w:rPr>
-          <w:b/>
-          <w:bCs/>
-        </w:rPr>
-        <w:t xml:space="preserve">Readiness gate: </w:t>
-      </w:r>
-      <w:r>
-        <w:t xml:space="preserve">the container </w:t>
-      </w:r>
-      <w:proofErr w:type="spellStart"/>
-      <w:r>
-        <w:t>healthcheck</w:t>
-      </w:r>
-      <w:proofErr w:type="spellEnd"/>
-      <w:r>
-        <w:t xml:space="preserve"> reports 'healthy' BEFORE the app is ready. The real check is the REST session call returning </w:t>
-      </w:r>
-      <w:r>
-        <w:rPr>
-          <w:rFonts w:ascii="Consolas" w:eastAsia="Consolas" w:hAnsi="Consolas" w:cs="Consolas"/>
-          <w:sz w:val="20"/>
-          <w:szCs w:val="20"/>
-        </w:rPr>
-        <w:t>"</w:t>
-      </w:r>
-      <w:proofErr w:type="spellStart"/>
-      <w:r>
-        <w:rPr>
-          <w:rFonts w:ascii="Consolas" w:eastAsia="Consolas" w:hAnsi="Consolas" w:cs="Consolas"/>
-          <w:sz w:val="20"/>
-          <w:szCs w:val="20"/>
-        </w:rPr>
-        <w:t>authenticated</w:t>
-      </w:r>
-      <w:proofErr w:type="gramStart"/>
-      <w:r>
-        <w:rPr>
-          <w:rFonts w:ascii="Consolas" w:eastAsia="Consolas" w:hAnsi="Consolas" w:cs="Consolas"/>
-          <w:sz w:val="20"/>
-          <w:szCs w:val="20"/>
-        </w:rPr>
-        <w:t>":true</w:t>
-      </w:r>
-      <w:proofErr w:type="spellEnd"/>
-      <w:proofErr w:type="gramEnd"/>
-      <w:r>
-        <w:t>:</w:t>
-      </w:r>
-    </w:p>
-    <w:p>
-      <w:pPr>
-        <w:spacing w:after="120"/>
-      </w:pPr>
-      <w:r>
-        <w:rPr>
-          <w:rFonts w:ascii="Consolas" w:eastAsia="Consolas" w:hAnsi="Consolas" w:cs="Consolas"/>
-          <w:sz w:val="20"/>
-          <w:szCs w:val="20"/>
-        </w:rPr>
-        <w:t xml:space="preserve">curl.exe -u </w:t>
-      </w:r>
-      <w:proofErr w:type="gramStart"/>
-      <w:r>
-        <w:rPr>
-          <w:rFonts w:ascii="Consolas" w:eastAsia="Consolas" w:hAnsi="Consolas" w:cs="Consolas"/>
-          <w:sz w:val="20"/>
-          <w:szCs w:val="20"/>
-        </w:rPr>
-        <w:t>admin:Admin</w:t>
-      </w:r>
-      <w:proofErr w:type="gramEnd"/>
-      <w:r>
-        <w:rPr>
-          <w:rFonts w:ascii="Consolas" w:eastAsia="Consolas" w:hAnsi="Consolas" w:cs="Consolas"/>
-          <w:sz w:val="20"/>
-          <w:szCs w:val="20"/>
-        </w:rPr>
-        <w:t>123 http://localhost/openmrs/ws/rest/v1/session</w:t>
+        <w:t>curl.exe -u admin:Admin123 http://localhost/openmrs/ws/rest/v1/session</w:t>
       </w:r>
     </w:p>
     <w:p>
@@ -3454,65 +2657,21 @@
           <w:sz w:val="20"/>
           <w:szCs w:val="20"/>
         </w:rPr>
-        <w:t xml:space="preserve">cd </w:t>
-      </w:r>
-      <w:proofErr w:type="spellStart"/>
+        <w:t>cd openmrs-setup\seed-data</w:t>
+      </w:r>
+      <w:r>
+        <w:t xml:space="preserve">  →  </w:t>
+      </w:r>
       <w:r>
         <w:rPr>
           <w:rFonts w:ascii="Consolas" w:eastAsia="Consolas" w:hAnsi="Consolas" w:cs="Consolas"/>
           <w:sz w:val="20"/>
           <w:szCs w:val="20"/>
         </w:rPr>
-        <w:t>openmrs</w:t>
-      </w:r>
-      <w:proofErr w:type="spellEnd"/>
-      <w:r>
-        <w:rPr>
-          <w:rFonts w:ascii="Consolas" w:eastAsia="Consolas" w:hAnsi="Consolas" w:cs="Consolas"/>
-          <w:sz w:val="20"/>
-          <w:szCs w:val="20"/>
-        </w:rPr>
-        <w:t>-setup\seed-</w:t>
-      </w:r>
-      <w:proofErr w:type="gramStart"/>
-      <w:r>
-        <w:rPr>
-          <w:rFonts w:ascii="Consolas" w:eastAsia="Consolas" w:hAnsi="Consolas" w:cs="Consolas"/>
-          <w:sz w:val="20"/>
-          <w:szCs w:val="20"/>
-        </w:rPr>
-        <w:t>data</w:t>
-      </w:r>
-      <w:r>
-        <w:t xml:space="preserve">  →</w:t>
-      </w:r>
-      <w:proofErr w:type="gramEnd"/>
-      <w:r>
-        <w:t xml:space="preserve">  </w:t>
-      </w:r>
-      <w:r>
-        <w:rPr>
-          <w:rFonts w:ascii="Consolas" w:eastAsia="Consolas" w:hAnsi="Consolas" w:cs="Consolas"/>
-          <w:sz w:val="20"/>
-          <w:szCs w:val="20"/>
-        </w:rPr>
-        <w:t xml:space="preserve">python </w:t>
-      </w:r>
-      <w:proofErr w:type="gramStart"/>
-      <w:r>
-        <w:rPr>
-          <w:rFonts w:ascii="Consolas" w:eastAsia="Consolas" w:hAnsi="Consolas" w:cs="Consolas"/>
-          <w:sz w:val="20"/>
-          <w:szCs w:val="20"/>
-        </w:rPr>
-        <w:t>generate_patients.py</w:t>
-      </w:r>
-      <w:r>
-        <w:t xml:space="preserve">  →</w:t>
-      </w:r>
-      <w:proofErr w:type="gramEnd"/>
-      <w:r>
-        <w:t xml:space="preserve">  </w:t>
+        <w:t>python generate_patients.py</w:t>
+      </w:r>
+      <w:r>
+        <w:t xml:space="preserve">  →  </w:t>
       </w:r>
       <w:r>
         <w:rPr>
@@ -3528,62 +2687,33 @@
         <w:pStyle w:val="Heading3"/>
       </w:pPr>
       <w:r>
-        <w:t xml:space="preserve">Environment </w:t>
-      </w:r>
-      <w:proofErr w:type="gramStart"/>
-      <w:r>
-        <w:t>note</w:t>
-      </w:r>
-      <w:proofErr w:type="gramEnd"/>
-    </w:p>
-    <w:p>
-      <w:pPr>
-        <w:pStyle w:val="ListParagraph"/>
-        <w:numPr>
-          <w:ilvl w:val="0"/>
-          <w:numId w:val="3"/>
-        </w:numPr>
-        <w:spacing w:after="60"/>
-      </w:pPr>
-      <w:r>
-        <w:t xml:space="preserve">Windows 11 Home → Docker Desktop must use the WSL2 backend (Hyper-V backend is unavailable on Home). A broken WSL (symptom: </w:t>
-      </w:r>
-      <w:proofErr w:type="spellStart"/>
-      <w:r>
-        <w:t>Wsl</w:t>
-      </w:r>
-      <w:proofErr w:type="spellEnd"/>
-      <w:r>
-        <w:t>/</w:t>
-      </w:r>
-      <w:proofErr w:type="spellStart"/>
-      <w:r>
-        <w:t>CallMsi</w:t>
-      </w:r>
-      <w:proofErr w:type="spellEnd"/>
-      <w:r>
-        <w:t>/Install/REGDB_E_CLASSNOTREG) was fixed by updating WSL to v2.7.3.0.</w:t>
-      </w:r>
-    </w:p>
-    <w:p>
-      <w:pPr>
-        <w:pStyle w:val="ListParagraph"/>
-        <w:numPr>
-          <w:ilvl w:val="0"/>
-          <w:numId w:val="3"/>
-        </w:numPr>
-        <w:spacing w:after="60"/>
-      </w:pPr>
-      <w:r>
-        <w:t xml:space="preserve">First </w:t>
-      </w:r>
-      <w:proofErr w:type="spellStart"/>
-      <w:r>
-        <w:t>OpenMRS</w:t>
-      </w:r>
-      <w:proofErr w:type="spellEnd"/>
-      <w:r>
-        <w:t xml:space="preserve"> boot took ~45 min (one-time demo-data generation). Subsequent boots are fast (data persists in Docker volumes).</w:t>
+        <w:t>Environment note</w:t>
+      </w:r>
+    </w:p>
+    <w:p>
+      <w:pPr>
+        <w:pStyle w:val="ListParagraph"/>
+        <w:numPr>
+          <w:ilvl w:val="0"/>
+          <w:numId w:val="3"/>
+        </w:numPr>
+        <w:spacing w:after="60"/>
+      </w:pPr>
+      <w:r>
+        <w:t>Windows 11 Home → Docker Desktop must use the WSL2 backend (Hyper-V backend is unavailable on Home). A broken WSL (symptom: Wsl/CallMsi/Install/REGDB_E_CLASSNOTREG) was fixed by updating WSL to v2.7.3.0.</w:t>
+      </w:r>
+    </w:p>
+    <w:p>
+      <w:pPr>
+        <w:pStyle w:val="ListParagraph"/>
+        <w:numPr>
+          <w:ilvl w:val="0"/>
+          <w:numId w:val="3"/>
+        </w:numPr>
+        <w:spacing w:after="60"/>
+      </w:pPr>
+      <w:r>
+        <w:t>First OpenMRS boot took ~45 min (one-time demo-data generation). Subsequent boots are fast (data persists in Docker volumes).</w:t>
       </w:r>
     </w:p>
     <w:p>
@@ -3752,15 +2882,7 @@
         <w:spacing w:after="60"/>
       </w:pPr>
       <w:r>
-        <w:t xml:space="preserve">Finalised project scope, architecture (C4 context + 13-step data flow), folder structure, data model, </w:t>
-      </w:r>
-      <w:proofErr w:type="spellStart"/>
-      <w:r>
-        <w:t>OpenMRS</w:t>
-      </w:r>
-      <w:proofErr w:type="spellEnd"/>
-      <w:r>
-        <w:t xml:space="preserve"> mapping, RPA design draft, and the clinical-safety boundary statement.</w:t>
+        <w:t>Finalised project scope, architecture (C4 context + 13-step data flow), folder structure, data model, OpenMRS mapping, RPA design draft, and the clinical-safety boundary statement.</w:t>
       </w:r>
     </w:p>
     <w:p>
@@ -3958,56 +3080,13 @@
             </w:tcMar>
           </w:tcPr>
           <w:p>
-            <w:proofErr w:type="gramStart"/>
-            <w:r>
-              <w:rPr>
-                <w:sz w:val="20"/>
-                <w:szCs w:val="20"/>
-              </w:rPr>
-              <w:t>.</w:t>
-            </w:r>
-            <w:proofErr w:type="spellStart"/>
-            <w:r>
-              <w:rPr>
-                <w:sz w:val="20"/>
-                <w:szCs w:val="20"/>
-              </w:rPr>
-              <w:t>gitignore</w:t>
-            </w:r>
-            <w:proofErr w:type="spellEnd"/>
-            <w:proofErr w:type="gramEnd"/>
-            <w:r>
-              <w:rPr>
-                <w:sz w:val="20"/>
-                <w:szCs w:val="20"/>
-              </w:rPr>
-              <w:t xml:space="preserve"> </w:t>
-            </w:r>
-            <w:proofErr w:type="gramStart"/>
-            <w:r>
-              <w:rPr>
-                <w:sz w:val="20"/>
-                <w:szCs w:val="20"/>
-              </w:rPr>
-              <w:t>/ .</w:t>
-            </w:r>
-            <w:proofErr w:type="spellStart"/>
-            <w:r>
-              <w:rPr>
-                <w:sz w:val="20"/>
-                <w:szCs w:val="20"/>
-              </w:rPr>
-              <w:t>env</w:t>
-            </w:r>
-            <w:proofErr w:type="gramEnd"/>
-            <w:r>
-              <w:rPr>
-                <w:sz w:val="20"/>
-                <w:szCs w:val="20"/>
-              </w:rPr>
-              <w:t>.example</w:t>
-            </w:r>
-            <w:proofErr w:type="spellEnd"/>
+            <w:r>
+              <w:rPr>
+                <w:sz w:val="20"/>
+                <w:szCs w:val="20"/>
+              </w:rPr>
+              <w:t>.gitignore / .env.example</w:t>
+            </w:r>
           </w:p>
         </w:tc>
         <w:tc>
@@ -4236,15 +3315,7 @@
         <w:spacing w:after="60"/>
       </w:pPr>
       <w:r>
-        <w:t xml:space="preserve">REST-first for all bot writes (reliable, verifiable); UI automation reserved for patient search/confirm screenshots. </w:t>
-      </w:r>
-      <w:proofErr w:type="spellStart"/>
-      <w:r>
-        <w:t>OpenMRS</w:t>
-      </w:r>
-      <w:proofErr w:type="spellEnd"/>
-      <w:r>
-        <w:t xml:space="preserve"> O3 is a React SPA and is selector-hostile; legacy 2.x UI is the fallback.</w:t>
+        <w:t>REST-first for all bot writes (reliable, verifiable); UI automation reserved for patient search/confirm screenshots. OpenMRS O3 is a React SPA and is selector-hostile; legacy 2.x UI is the fallback.</w:t>
       </w:r>
     </w:p>
     <w:p>
@@ -4270,15 +3341,7 @@
         <w:spacing w:after="60"/>
       </w:pPr>
       <w:r>
-        <w:t xml:space="preserve">Synthetic NHS numbers use the reserved 999 test range with a valid Modulus-11 check digit. Human review defaults to a real SQLite table (Action </w:t>
-      </w:r>
-      <w:proofErr w:type="spellStart"/>
-      <w:r>
-        <w:t>Center</w:t>
-      </w:r>
-      <w:proofErr w:type="spellEnd"/>
-      <w:r>
-        <w:t xml:space="preserve"> optional).</w:t>
+        <w:t>Synthetic NHS numbers use the reserved 999 test range with a valid Modulus-11 check digit. Human review defaults to a real SQLite table (Action Center optional).</w:t>
       </w:r>
     </w:p>
     <w:p>
@@ -4294,15 +3357,7 @@
         <w:spacing w:after="120"/>
       </w:pPr>
       <w:r>
-        <w:t xml:space="preserve">Acceptance met: architecture realistic; </w:t>
-      </w:r>
-      <w:proofErr w:type="spellStart"/>
-      <w:r>
-        <w:t>OpenMRS</w:t>
-      </w:r>
-      <w:proofErr w:type="spellEnd"/>
-      <w:r>
-        <w:t xml:space="preserve"> replaces a custom mock EPR; no filler system actions; suitable for an NHS RPA portfolio.</w:t>
+        <w:t>Acceptance met: architecture realistic; OpenMRS replaces a custom mock EPR; no filler system actions; suitable for an NHS RPA portfolio.</w:t>
       </w:r>
     </w:p>
     <w:p>
@@ -4317,15 +3372,7 @@
       <w:bookmarkStart w:id="6" w:name="_Toc232111790"/>
       <w:r>
         <w:lastRenderedPageBreak/>
-        <w:t xml:space="preserve">Phase 1 — </w:t>
-      </w:r>
-      <w:proofErr w:type="spellStart"/>
-      <w:r>
-        <w:t>OpenMRS</w:t>
-      </w:r>
-      <w:proofErr w:type="spellEnd"/>
-      <w:r>
-        <w:t xml:space="preserve"> Local Setup</w:t>
+        <w:t>Phase 1 — OpenMRS Local Setup</w:t>
       </w:r>
       <w:bookmarkEnd w:id="6"/>
     </w:p>
@@ -4346,13 +3393,8 @@
         </w:numPr>
         <w:spacing w:after="60"/>
       </w:pPr>
-      <w:proofErr w:type="spellStart"/>
-      <w:r>
-        <w:t>OpenMRS</w:t>
-      </w:r>
-      <w:proofErr w:type="spellEnd"/>
-      <w:r>
-        <w:t xml:space="preserve"> 3 reference application running locally via Docker Compose (gateway + frontend + backend + MariaDB), with 50 demo patients, verified REST API and FHIR R4.</w:t>
+      <w:r>
+        <w:t>OpenMRS 3 reference application running locally via Docker Compose (gateway + frontend + backend + MariaDB), with 50 demo patients, verified REST API and FHIR R4.</w:t>
       </w:r>
     </w:p>
     <w:p>
@@ -4477,31 +3519,13 @@
             </w:tcMar>
           </w:tcPr>
           <w:p>
-            <w:proofErr w:type="spellStart"/>
-            <w:r>
-              <w:rPr>
-                <w:sz w:val="20"/>
-                <w:szCs w:val="20"/>
-              </w:rPr>
-              <w:t>openmrs</w:t>
-            </w:r>
-            <w:proofErr w:type="spellEnd"/>
-            <w:r>
-              <w:rPr>
-                <w:sz w:val="20"/>
-                <w:szCs w:val="20"/>
-              </w:rPr>
-              <w:t>-setup/docker-</w:t>
-            </w:r>
-            <w:proofErr w:type="spellStart"/>
-            <w:r>
-              <w:rPr>
-                <w:sz w:val="20"/>
-                <w:szCs w:val="20"/>
-              </w:rPr>
-              <w:t>compose.yml</w:t>
-            </w:r>
-            <w:proofErr w:type="spellEnd"/>
+            <w:r>
+              <w:rPr>
+                <w:sz w:val="20"/>
+                <w:szCs w:val="20"/>
+              </w:rPr>
+              <w:t>openmrs-setup/docker-compose.yml</w:t>
+            </w:r>
           </w:p>
         </w:tc>
         <w:tc>
@@ -4526,23 +3550,7 @@
                 <w:sz w:val="20"/>
                 <w:szCs w:val="20"/>
               </w:rPr>
-              <w:t xml:space="preserve">The 4-service </w:t>
-            </w:r>
-            <w:proofErr w:type="spellStart"/>
-            <w:r>
-              <w:rPr>
-                <w:sz w:val="20"/>
-                <w:szCs w:val="20"/>
-              </w:rPr>
-              <w:t>OpenMRS</w:t>
-            </w:r>
-            <w:proofErr w:type="spellEnd"/>
-            <w:r>
-              <w:rPr>
-                <w:sz w:val="20"/>
-                <w:szCs w:val="20"/>
-              </w:rPr>
-              <w:t xml:space="preserve"> 3 stack</w:t>
+              <w:t>The 4-service OpenMRS 3 stack</w:t>
             </w:r>
           </w:p>
         </w:tc>
@@ -4662,23 +3670,7 @@
                 <w:sz w:val="20"/>
                 <w:szCs w:val="20"/>
               </w:rPr>
-              <w:t>Referral → Visit/Encounter/</w:t>
-            </w:r>
-            <w:proofErr w:type="spellStart"/>
-            <w:r>
-              <w:rPr>
-                <w:sz w:val="20"/>
-                <w:szCs w:val="20"/>
-              </w:rPr>
-              <w:t>Obs</w:t>
-            </w:r>
-            <w:proofErr w:type="spellEnd"/>
-            <w:r>
-              <w:rPr>
-                <w:sz w:val="20"/>
-                <w:szCs w:val="20"/>
-              </w:rPr>
-              <w:t xml:space="preserve"> mapping plan</w:t>
+              <w:t>Referral → Visit/Encounter/Obs mapping plan</w:t>
             </w:r>
           </w:p>
         </w:tc>
@@ -4762,43 +3754,148 @@
           <w:sz w:val="20"/>
           <w:szCs w:val="20"/>
         </w:rPr>
-        <w:t>docker compose -f "</w:t>
-      </w:r>
-      <w:proofErr w:type="spellStart"/>
+        <w:t>docker compose -f "openmrs-setup\docker-compose.yml" up -d</w:t>
+      </w:r>
+    </w:p>
+    <w:p>
+      <w:pPr>
+        <w:spacing w:after="120"/>
+      </w:pPr>
       <w:r>
         <w:rPr>
           <w:rFonts w:ascii="Consolas" w:eastAsia="Consolas" w:hAnsi="Consolas" w:cs="Consolas"/>
           <w:sz w:val="20"/>
           <w:szCs w:val="20"/>
         </w:rPr>
-        <w:t>openmrs</w:t>
-      </w:r>
-      <w:proofErr w:type="spellEnd"/>
-      <w:r>
-        <w:rPr>
-          <w:rFonts w:ascii="Consolas" w:eastAsia="Consolas" w:hAnsi="Consolas" w:cs="Consolas"/>
-          <w:sz w:val="20"/>
-          <w:szCs w:val="20"/>
-        </w:rPr>
-        <w:t>-setup\docker-</w:t>
-      </w:r>
-      <w:proofErr w:type="spellStart"/>
-      <w:r>
-        <w:rPr>
-          <w:rFonts w:ascii="Consolas" w:eastAsia="Consolas" w:hAnsi="Consolas" w:cs="Consolas"/>
-          <w:sz w:val="20"/>
-          <w:szCs w:val="20"/>
-        </w:rPr>
-        <w:t>compose.yml</w:t>
-      </w:r>
-      <w:proofErr w:type="spellEnd"/>
-      <w:r>
-        <w:rPr>
-          <w:rFonts w:ascii="Consolas" w:eastAsia="Consolas" w:hAnsi="Consolas" w:cs="Consolas"/>
-          <w:sz w:val="20"/>
-          <w:szCs w:val="20"/>
-        </w:rPr>
-        <w:t>" up -d</w:t>
+        <w:t>curl.exe -u admin:Admin123 http://localhost/openmrs/ws/rest/v1/session   # authenticated:true</w:t>
+      </w:r>
+    </w:p>
+    <w:p>
+      <w:pPr>
+        <w:pStyle w:val="Heading3"/>
+      </w:pPr>
+      <w:r>
+        <w:t>Results (all PASS)</w:t>
+      </w:r>
+    </w:p>
+    <w:p>
+      <w:pPr>
+        <w:pStyle w:val="ListParagraph"/>
+        <w:numPr>
+          <w:ilvl w:val="0"/>
+          <w:numId w:val="3"/>
+        </w:numPr>
+        <w:spacing w:after="60"/>
+      </w:pPr>
+      <w:r>
+        <w:t>REST /session → authenticated:true (admin: System Developer, Provider).</w:t>
+      </w:r>
+    </w:p>
+    <w:p>
+      <w:pPr>
+        <w:pStyle w:val="ListParagraph"/>
+        <w:numPr>
+          <w:ilvl w:val="0"/>
+          <w:numId w:val="3"/>
+        </w:numPr>
+        <w:spacing w:after="60"/>
+      </w:pPr>
+      <w:r>
+        <w:t>Patient search works: q=John→1, q=Smith→2 (single letters return 0 — search threshold, not a bug).</w:t>
+      </w:r>
+    </w:p>
+    <w:p>
+      <w:pPr>
+        <w:pStyle w:val="ListParagraph"/>
+        <w:numPr>
+          <w:ilvl w:val="0"/>
+          <w:numId w:val="3"/>
+        </w:numPr>
+        <w:spacing w:after="60"/>
+      </w:pPr>
+      <w:r>
+        <w:t>FHIR Patient count: 50. FHIR metadata: HTTP 200.</w:t>
+      </w:r>
+    </w:p>
+    <w:p>
+      <w:pPr>
+        <w:pStyle w:val="ListParagraph"/>
+        <w:numPr>
+          <w:ilvl w:val="0"/>
+          <w:numId w:val="3"/>
+        </w:numPr>
+        <w:spacing w:after="60"/>
+      </w:pPr>
+      <w:r>
+        <w:t>Lesson captured: container 'healthy' ≠ app ready — gate on REST /session.</w:t>
+      </w:r>
+    </w:p>
+    <w:p>
+      <w:pPr>
+        <w:pStyle w:val="Heading3"/>
+      </w:pPr>
+      <w:r>
+        <w:t>Screenshots to capture</w:t>
+      </w:r>
+    </w:p>
+    <w:p>
+      <w:pPr>
+        <w:pStyle w:val="ListParagraph"/>
+        <w:numPr>
+          <w:ilvl w:val="0"/>
+          <w:numId w:val="3"/>
+        </w:numPr>
+        <w:spacing w:after="60"/>
+      </w:pPr>
+      <w:r>
+        <w:t>Docker Desktop Containers view — openmrs-setup stack all green.</w:t>
+      </w:r>
+    </w:p>
+    <w:p>
+      <w:pPr>
+        <w:pStyle w:val="ListParagraph"/>
+        <w:numPr>
+          <w:ilvl w:val="0"/>
+          <w:numId w:val="3"/>
+        </w:numPr>
+        <w:spacing w:after="60"/>
+      </w:pPr>
+      <w:r>
+        <w:t>O3 login screen + home after login.</w:t>
+      </w:r>
+    </w:p>
+    <w:p>
+      <w:pPr>
+        <w:pStyle w:val="ListParagraph"/>
+        <w:numPr>
+          <w:ilvl w:val="0"/>
+          <w:numId w:val="3"/>
+        </w:numPr>
+        <w:spacing w:after="60"/>
+      </w:pPr>
+      <w:r>
+        <w:t>Patient search for 'Smith' returning results; a patient chart.</w:t>
+      </w:r>
+    </w:p>
+    <w:p>
+      <w:pPr>
+        <w:pStyle w:val="ListParagraph"/>
+        <w:numPr>
+          <w:ilvl w:val="0"/>
+          <w:numId w:val="3"/>
+        </w:numPr>
+        <w:spacing w:after="60"/>
+      </w:pPr>
+      <w:r>
+        <w:t>Terminal showing /session authenticated:true.</w:t>
+      </w:r>
+    </w:p>
+    <w:p>
+      <w:pPr>
+        <w:pStyle w:val="Heading3"/>
+      </w:pPr>
+      <w:r>
+        <w:t>What to commit</w:t>
       </w:r>
     </w:p>
     <w:p>
@@ -4806,219 +3903,7 @@
         <w:spacing w:after="120"/>
       </w:pPr>
       <w:r>
-        <w:rPr>
-          <w:rFonts w:ascii="Consolas" w:eastAsia="Consolas" w:hAnsi="Consolas" w:cs="Consolas"/>
-          <w:sz w:val="20"/>
-          <w:szCs w:val="20"/>
-        </w:rPr>
-        <w:t xml:space="preserve">curl.exe -u </w:t>
-      </w:r>
-      <w:proofErr w:type="gramStart"/>
-      <w:r>
-        <w:rPr>
-          <w:rFonts w:ascii="Consolas" w:eastAsia="Consolas" w:hAnsi="Consolas" w:cs="Consolas"/>
-          <w:sz w:val="20"/>
-          <w:szCs w:val="20"/>
-        </w:rPr>
-        <w:t>admin:Admin</w:t>
-      </w:r>
-      <w:proofErr w:type="gramEnd"/>
-      <w:r>
-        <w:rPr>
-          <w:rFonts w:ascii="Consolas" w:eastAsia="Consolas" w:hAnsi="Consolas" w:cs="Consolas"/>
-          <w:sz w:val="20"/>
-          <w:szCs w:val="20"/>
-        </w:rPr>
-        <w:t xml:space="preserve">123 http://localhost/openmrs/ws/rest/v1/session   # </w:t>
-      </w:r>
-      <w:proofErr w:type="spellStart"/>
-      <w:proofErr w:type="gramStart"/>
-      <w:r>
-        <w:rPr>
-          <w:rFonts w:ascii="Consolas" w:eastAsia="Consolas" w:hAnsi="Consolas" w:cs="Consolas"/>
-          <w:sz w:val="20"/>
-          <w:szCs w:val="20"/>
-        </w:rPr>
-        <w:t>authenticated:true</w:t>
-      </w:r>
-      <w:proofErr w:type="spellEnd"/>
-      <w:proofErr w:type="gramEnd"/>
-    </w:p>
-    <w:p>
-      <w:pPr>
-        <w:pStyle w:val="Heading3"/>
-      </w:pPr>
-      <w:r>
-        <w:t>Results (all PASS)</w:t>
-      </w:r>
-    </w:p>
-    <w:p>
-      <w:pPr>
-        <w:pStyle w:val="ListParagraph"/>
-        <w:numPr>
-          <w:ilvl w:val="0"/>
-          <w:numId w:val="3"/>
-        </w:numPr>
-        <w:spacing w:after="60"/>
-      </w:pPr>
-      <w:r>
-        <w:t xml:space="preserve">REST /session → </w:t>
-      </w:r>
-      <w:proofErr w:type="spellStart"/>
-      <w:proofErr w:type="gramStart"/>
-      <w:r>
-        <w:t>authenticated:true</w:t>
-      </w:r>
-      <w:proofErr w:type="spellEnd"/>
-      <w:proofErr w:type="gramEnd"/>
-      <w:r>
-        <w:t xml:space="preserve"> (admin: System Developer, Provider).</w:t>
-      </w:r>
-    </w:p>
-    <w:p>
-      <w:pPr>
-        <w:pStyle w:val="ListParagraph"/>
-        <w:numPr>
-          <w:ilvl w:val="0"/>
-          <w:numId w:val="3"/>
-        </w:numPr>
-        <w:spacing w:after="60"/>
-      </w:pPr>
-      <w:r>
-        <w:t>Patient search works: q=John→1, q=Smith→2 (single letters return 0 — search threshold, not a bug).</w:t>
-      </w:r>
-    </w:p>
-    <w:p>
-      <w:pPr>
-        <w:pStyle w:val="ListParagraph"/>
-        <w:numPr>
-          <w:ilvl w:val="0"/>
-          <w:numId w:val="3"/>
-        </w:numPr>
-        <w:spacing w:after="60"/>
-      </w:pPr>
-      <w:r>
-        <w:t>FHIR Patient count: 50. FHIR metadata: HTTP 200.</w:t>
-      </w:r>
-    </w:p>
-    <w:p>
-      <w:pPr>
-        <w:pStyle w:val="ListParagraph"/>
-        <w:numPr>
-          <w:ilvl w:val="0"/>
-          <w:numId w:val="3"/>
-        </w:numPr>
-        <w:spacing w:after="60"/>
-      </w:pPr>
-      <w:r>
-        <w:t>Lesson captured: container 'healthy' ≠ app ready — gate on REST /session.</w:t>
-      </w:r>
-    </w:p>
-    <w:p>
-      <w:pPr>
-        <w:pStyle w:val="Heading3"/>
-      </w:pPr>
-      <w:r>
-        <w:t>Screenshots to capture</w:t>
-      </w:r>
-    </w:p>
-    <w:p>
-      <w:pPr>
-        <w:pStyle w:val="ListParagraph"/>
-        <w:numPr>
-          <w:ilvl w:val="0"/>
-          <w:numId w:val="3"/>
-        </w:numPr>
-        <w:spacing w:after="60"/>
-      </w:pPr>
-      <w:r>
-        <w:t xml:space="preserve">Docker Desktop Containers view — </w:t>
-      </w:r>
-      <w:proofErr w:type="spellStart"/>
-      <w:r>
-        <w:t>openmrs</w:t>
-      </w:r>
-      <w:proofErr w:type="spellEnd"/>
-      <w:r>
-        <w:t>-setup stack all green.</w:t>
-      </w:r>
-    </w:p>
-    <w:p>
-      <w:pPr>
-        <w:pStyle w:val="ListParagraph"/>
-        <w:numPr>
-          <w:ilvl w:val="0"/>
-          <w:numId w:val="3"/>
-        </w:numPr>
-        <w:spacing w:after="60"/>
-      </w:pPr>
-      <w:r>
-        <w:t>O3 login screen + home after login.</w:t>
-      </w:r>
-    </w:p>
-    <w:p>
-      <w:pPr>
-        <w:pStyle w:val="ListParagraph"/>
-        <w:numPr>
-          <w:ilvl w:val="0"/>
-          <w:numId w:val="3"/>
-        </w:numPr>
-        <w:spacing w:after="60"/>
-      </w:pPr>
-      <w:r>
-        <w:t>Patient search for 'Smith' returning results; a patient chart.</w:t>
-      </w:r>
-    </w:p>
-    <w:p>
-      <w:pPr>
-        <w:pStyle w:val="ListParagraph"/>
-        <w:numPr>
-          <w:ilvl w:val="0"/>
-          <w:numId w:val="3"/>
-        </w:numPr>
-        <w:spacing w:after="60"/>
-      </w:pPr>
-      <w:r>
-        <w:t xml:space="preserve">Terminal showing /session </w:t>
-      </w:r>
-      <w:proofErr w:type="spellStart"/>
-      <w:proofErr w:type="gramStart"/>
-      <w:r>
-        <w:t>authenticated:true</w:t>
-      </w:r>
-      <w:proofErr w:type="spellEnd"/>
-      <w:proofErr w:type="gramEnd"/>
-      <w:r>
-        <w:t>.</w:t>
-      </w:r>
-    </w:p>
-    <w:p>
-      <w:pPr>
-        <w:pStyle w:val="Heading3"/>
-      </w:pPr>
-      <w:r>
-        <w:t>What to commit</w:t>
-      </w:r>
-    </w:p>
-    <w:p>
-      <w:pPr>
-        <w:spacing w:after="120"/>
-      </w:pPr>
-      <w:proofErr w:type="spellStart"/>
-      <w:r>
-        <w:t>openmrs</w:t>
-      </w:r>
-      <w:proofErr w:type="spellEnd"/>
-      <w:r>
-        <w:t xml:space="preserve">-setup/ (compose + notes), docs/testing/phase1-acceptance.md, README update. Never commit Docker volumes </w:t>
-      </w:r>
-      <w:proofErr w:type="gramStart"/>
-      <w:r>
-        <w:t>or .env</w:t>
-      </w:r>
-      <w:proofErr w:type="gramEnd"/>
-      <w:r>
-        <w:t>.</w:t>
+        <w:t>openmrs-setup/ (compose + notes), docs/testing/phase1-acceptance.md, README update. Never commit Docker volumes or .env.</w:t>
       </w:r>
     </w:p>
     <w:p>
@@ -5055,31 +3940,7 @@
         <w:spacing w:after="60"/>
       </w:pPr>
       <w:r>
-        <w:t xml:space="preserve">A deterministic generator and an idempotent REST </w:t>
-      </w:r>
-      <w:proofErr w:type="spellStart"/>
-      <w:r>
-        <w:t>seeder</w:t>
-      </w:r>
-      <w:proofErr w:type="spellEnd"/>
-      <w:r>
-        <w:t xml:space="preserve"> (Python, </w:t>
-      </w:r>
-      <w:proofErr w:type="spellStart"/>
-      <w:r>
-        <w:t>stdlib</w:t>
-      </w:r>
-      <w:proofErr w:type="spellEnd"/>
-      <w:r>
-        <w:t xml:space="preserve"> only) that loaded 32 synthetic patients into </w:t>
-      </w:r>
-      <w:proofErr w:type="spellStart"/>
-      <w:r>
-        <w:t>OpenMRS</w:t>
-      </w:r>
-      <w:proofErr w:type="spellEnd"/>
-      <w:r>
-        <w:t>, plus a custom 'Synthetic NHS Number' identifier type.</w:t>
+        <w:t>A deterministic generator and an idempotent REST seeder (Python, stdlib only) that loaded 32 synthetic patients into OpenMRS, plus a custom 'Synthetic NHS Number' identifier type.</w:t>
       </w:r>
     </w:p>
     <w:p>
@@ -5308,39 +4169,7 @@
                 <w:sz w:val="20"/>
                 <w:szCs w:val="20"/>
               </w:rPr>
-              <w:t xml:space="preserve">Idempotent </w:t>
-            </w:r>
-            <w:proofErr w:type="spellStart"/>
-            <w:r>
-              <w:rPr>
-                <w:sz w:val="20"/>
-                <w:szCs w:val="20"/>
-              </w:rPr>
-              <w:t>seeder</w:t>
-            </w:r>
-            <w:proofErr w:type="spellEnd"/>
-            <w:r>
-              <w:rPr>
-                <w:sz w:val="20"/>
-                <w:szCs w:val="20"/>
-              </w:rPr>
-              <w:t xml:space="preserve"> (id type, </w:t>
-            </w:r>
-            <w:proofErr w:type="spellStart"/>
-            <w:r>
-              <w:rPr>
-                <w:sz w:val="20"/>
-                <w:szCs w:val="20"/>
-              </w:rPr>
-              <w:t>OpenMRS</w:t>
-            </w:r>
-            <w:proofErr w:type="spellEnd"/>
-            <w:r>
-              <w:rPr>
-                <w:sz w:val="20"/>
-                <w:szCs w:val="20"/>
-              </w:rPr>
-              <w:t xml:space="preserve"> ID gen, POST patients)</w:t>
+              <w:t>Idempotent seeder (id type, OpenMRS ID gen, POST patients)</w:t>
             </w:r>
           </w:p>
         </w:tc>
@@ -5374,23 +4203,7 @@
                 <w:sz w:val="20"/>
                 <w:szCs w:val="20"/>
               </w:rPr>
-              <w:t>data/synthetic-patients/</w:t>
-            </w:r>
-            <w:proofErr w:type="spellStart"/>
-            <w:r>
-              <w:rPr>
-                <w:sz w:val="20"/>
-                <w:szCs w:val="20"/>
-              </w:rPr>
-              <w:t>synthetic_patients.json</w:t>
-            </w:r>
-            <w:proofErr w:type="spellEnd"/>
-            <w:r>
-              <w:rPr>
-                <w:sz w:val="20"/>
-                <w:szCs w:val="20"/>
-              </w:rPr>
-              <w:t xml:space="preserve"> / .csv</w:t>
+              <w:t>data/synthetic-patients/synthetic_patients.json / .csv</w:t>
             </w:r>
           </w:p>
         </w:tc>
@@ -5560,65 +4373,21 @@
           <w:sz w:val="20"/>
           <w:szCs w:val="20"/>
         </w:rPr>
-        <w:t xml:space="preserve">cd </w:t>
-      </w:r>
-      <w:proofErr w:type="spellStart"/>
+        <w:t>cd openmrs-setup\seed-data</w:t>
+      </w:r>
+      <w:r>
+        <w:t xml:space="preserve">  →  </w:t>
+      </w:r>
       <w:r>
         <w:rPr>
           <w:rFonts w:ascii="Consolas" w:eastAsia="Consolas" w:hAnsi="Consolas" w:cs="Consolas"/>
           <w:sz w:val="20"/>
           <w:szCs w:val="20"/>
         </w:rPr>
-        <w:t>openmrs</w:t>
-      </w:r>
-      <w:proofErr w:type="spellEnd"/>
-      <w:r>
-        <w:rPr>
-          <w:rFonts w:ascii="Consolas" w:eastAsia="Consolas" w:hAnsi="Consolas" w:cs="Consolas"/>
-          <w:sz w:val="20"/>
-          <w:szCs w:val="20"/>
-        </w:rPr>
-        <w:t>-setup\seed-</w:t>
-      </w:r>
-      <w:proofErr w:type="gramStart"/>
-      <w:r>
-        <w:rPr>
-          <w:rFonts w:ascii="Consolas" w:eastAsia="Consolas" w:hAnsi="Consolas" w:cs="Consolas"/>
-          <w:sz w:val="20"/>
-          <w:szCs w:val="20"/>
-        </w:rPr>
-        <w:t>data</w:t>
-      </w:r>
-      <w:r>
-        <w:t xml:space="preserve">  →</w:t>
-      </w:r>
-      <w:proofErr w:type="gramEnd"/>
-      <w:r>
-        <w:t xml:space="preserve">  </w:t>
-      </w:r>
-      <w:r>
-        <w:rPr>
-          <w:rFonts w:ascii="Consolas" w:eastAsia="Consolas" w:hAnsi="Consolas" w:cs="Consolas"/>
-          <w:sz w:val="20"/>
-          <w:szCs w:val="20"/>
-        </w:rPr>
-        <w:t xml:space="preserve">python </w:t>
-      </w:r>
-      <w:proofErr w:type="gramStart"/>
-      <w:r>
-        <w:rPr>
-          <w:rFonts w:ascii="Consolas" w:eastAsia="Consolas" w:hAnsi="Consolas" w:cs="Consolas"/>
-          <w:sz w:val="20"/>
-          <w:szCs w:val="20"/>
-        </w:rPr>
-        <w:t>generate_patients.py</w:t>
-      </w:r>
-      <w:r>
-        <w:t xml:space="preserve">  →</w:t>
-      </w:r>
-      <w:proofErr w:type="gramEnd"/>
-      <w:r>
-        <w:t xml:space="preserve">  </w:t>
+        <w:t>python generate_patients.py</w:t>
+      </w:r>
+      <w:r>
+        <w:t xml:space="preserve">  →  </w:t>
       </w:r>
       <w:r>
         <w:rPr>
@@ -5647,15 +4416,7 @@
         <w:spacing w:after="60"/>
       </w:pPr>
       <w:r>
-        <w:t>First seed: created=32, skipped=0, reserved(no-</w:t>
-      </w:r>
-      <w:proofErr w:type="gramStart"/>
-      <w:r>
-        <w:t>match)=</w:t>
-      </w:r>
-      <w:proofErr w:type="gramEnd"/>
-      <w:r>
-        <w:t>2, failed=0.</w:t>
+        <w:t>First seed: created=32, skipped=0, reserved(no-match)=2, failed=0.</w:t>
       </w:r>
     </w:p>
     <w:p>
@@ -5681,60 +4442,20 @@
         <w:spacing w:after="60"/>
       </w:pPr>
       <w:r>
-        <w:t xml:space="preserve">Search: 9990000018→1; Walsh→2 (multiple-candidate). Each patient carries </w:t>
-      </w:r>
-      <w:proofErr w:type="spellStart"/>
-      <w:r>
-        <w:t>OpenMRS</w:t>
-      </w:r>
-      <w:proofErr w:type="spellEnd"/>
-      <w:r>
-        <w:t xml:space="preserve"> ID (preferred) + Synthetic NHS Number (searchable).</w:t>
-      </w:r>
-    </w:p>
-    <w:p>
-      <w:pPr>
-        <w:pStyle w:val="ListParagraph"/>
-        <w:numPr>
-          <w:ilvl w:val="0"/>
-          <w:numId w:val="3"/>
-        </w:numPr>
-        <w:spacing w:after="60"/>
-      </w:pPr>
-      <w:r>
-        <w:t xml:space="preserve">Real issue solved well: </w:t>
-      </w:r>
-      <w:proofErr w:type="spellStart"/>
-      <w:r>
-        <w:t>OpenMRS</w:t>
-      </w:r>
-      <w:proofErr w:type="spellEnd"/>
-      <w:r>
-        <w:t xml:space="preserve"> rejects patients lacking the required </w:t>
-      </w:r>
-      <w:proofErr w:type="spellStart"/>
-      <w:r>
-        <w:t>OpenMRS</w:t>
-      </w:r>
-      <w:proofErr w:type="spellEnd"/>
-      <w:r>
-        <w:t xml:space="preserve"> ID; the </w:t>
-      </w:r>
-      <w:proofErr w:type="spellStart"/>
-      <w:r>
-        <w:t>seeder</w:t>
-      </w:r>
-      <w:proofErr w:type="spellEnd"/>
-      <w:r>
-        <w:t xml:space="preserve"> now generates one via the </w:t>
-      </w:r>
-      <w:proofErr w:type="spellStart"/>
-      <w:r>
-        <w:t>idgen</w:t>
-      </w:r>
-      <w:proofErr w:type="spellEnd"/>
-      <w:r>
-        <w:t xml:space="preserve"> module REST endpoint (the same mechanism the UI uses) rather than weakening data-integrity rules.</w:t>
+        <w:t>Search: 9990000018→1; Walsh→2 (multiple-candidate). Each patient carries OpenMRS ID (preferred) + Synthetic NHS Number (searchable).</w:t>
+      </w:r>
+    </w:p>
+    <w:p>
+      <w:pPr>
+        <w:pStyle w:val="ListParagraph"/>
+        <w:numPr>
+          <w:ilvl w:val="0"/>
+          <w:numId w:val="3"/>
+        </w:numPr>
+        <w:spacing w:after="60"/>
+      </w:pPr>
+      <w:r>
+        <w:t>Real issue solved well: OpenMRS rejects patients lacking the required OpenMRS ID; the seeder now generates one via the idgen module REST endpoint (the same mechanism the UI uses) rather than weakening data-integrity rules.</w:t>
       </w:r>
     </w:p>
     <w:p>
@@ -5789,15 +4510,7 @@
         <w:spacing w:after="60"/>
       </w:pPr>
       <w:r>
-        <w:t xml:space="preserve">Terminal: </w:t>
-      </w:r>
-      <w:proofErr w:type="spellStart"/>
-      <w:r>
-        <w:t>seeder</w:t>
-      </w:r>
-      <w:proofErr w:type="spellEnd"/>
-      <w:r>
-        <w:t xml:space="preserve"> run (created=32, failed=0).</w:t>
+        <w:t>Terminal: seeder run (created=32, failed=0).</w:t>
       </w:r>
     </w:p>
     <w:p>
@@ -5851,29 +4564,8 @@
       <w:pPr>
         <w:spacing w:after="120"/>
       </w:pPr>
-      <w:proofErr w:type="spellStart"/>
-      <w:r>
-        <w:t>openmrs</w:t>
-      </w:r>
-      <w:proofErr w:type="spellEnd"/>
-      <w:r>
-        <w:t>-setup/seed-data/*.</w:t>
-      </w:r>
-      <w:proofErr w:type="spellStart"/>
-      <w:r>
-        <w:t>py</w:t>
-      </w:r>
-      <w:proofErr w:type="spellEnd"/>
-      <w:r>
-        <w:t xml:space="preserve">, data/synthetic-patients/ (README + </w:t>
-      </w:r>
-      <w:proofErr w:type="spellStart"/>
-      <w:r>
-        <w:t>json</w:t>
-      </w:r>
-      <w:proofErr w:type="spellEnd"/>
-      <w:r>
-        <w:t xml:space="preserve"> + csv = fixtures), docs/testing/phase2-acceptance.md, README.</w:t>
+      <w:r>
+        <w:t>openmrs-setup/seed-data/*.py, data/synthetic-patients/ (README + json + csv = fixtures), docs/testing/phase2-acceptance.md, README.</w:t>
       </w:r>
     </w:p>
     <w:p>
@@ -5940,36 +4632,20 @@
         <w:spacing w:after="60"/>
       </w:pPr>
       <w:r>
-        <w:t>15 machine-readable expected-outcome files (data/expected-outcomes/REF-</w:t>
-      </w:r>
-      <w:proofErr w:type="spellStart"/>
-      <w:r>
-        <w:t>NNN.expected.json</w:t>
-      </w:r>
-      <w:proofErr w:type="spellEnd"/>
-      <w:r>
-        <w:t>) — the test oracle that says, for each referral, what the correct extraction, patient-match result, safety flags, decision and final status should be.</w:t>
-      </w:r>
-    </w:p>
-    <w:p>
-      <w:pPr>
-        <w:pStyle w:val="ListParagraph"/>
-        <w:numPr>
-          <w:ilvl w:val="0"/>
-          <w:numId w:val="3"/>
-        </w:numPr>
-        <w:spacing w:after="60"/>
-      </w:pPr>
-      <w:r>
-        <w:t xml:space="preserve">Every referral is wired to a real Phase-2 seeded patient (or a reserved no-match fixture), so the scenarios exercise the actual data already in </w:t>
-      </w:r>
-      <w:proofErr w:type="spellStart"/>
-      <w:r>
-        <w:t>OpenMRS</w:t>
-      </w:r>
-      <w:proofErr w:type="spellEnd"/>
-      <w:r>
-        <w:t>.</w:t>
+        <w:t>15 machine-readable expected-outcome files (data/expected-outcomes/REF-NNN.expected.json) — the test oracle that says, for each referral, what the correct extraction, patient-match result, safety flags, decision and final status should be.</w:t>
+      </w:r>
+    </w:p>
+    <w:p>
+      <w:pPr>
+        <w:pStyle w:val="ListParagraph"/>
+        <w:numPr>
+          <w:ilvl w:val="0"/>
+          <w:numId w:val="3"/>
+        </w:numPr>
+        <w:spacing w:after="60"/>
+      </w:pPr>
+      <w:r>
+        <w:t>Every referral is wired to a real Phase-2 seeded patient (or a reserved no-match fixture), so the scenarios exercise the actual data already in OpenMRS.</w:t>
       </w:r>
     </w:p>
     <w:p>
@@ -6172,17 +4848,8 @@
                 <w:sz w:val="20"/>
                 <w:szCs w:val="20"/>
               </w:rPr>
-              <w:t>data/expected-outcomes/REF-001…</w:t>
-            </w:r>
-            <w:proofErr w:type="gramStart"/>
-            <w:r>
-              <w:rPr>
-                <w:sz w:val="20"/>
-                <w:szCs w:val="20"/>
-              </w:rPr>
-              <w:t>015.expected.json</w:t>
-            </w:r>
-            <w:proofErr w:type="gramEnd"/>
+              <w:t>data/expected-outcomes/REF-001…015.expected.json</w:t>
+            </w:r>
           </w:p>
         </w:tc>
         <w:tc>
@@ -7126,23 +5793,7 @@
                 <w:sz w:val="20"/>
                 <w:szCs w:val="20"/>
               </w:rPr>
-              <w:t xml:space="preserve">No match — not in </w:t>
-            </w:r>
-            <w:proofErr w:type="spellStart"/>
-            <w:r>
-              <w:rPr>
-                <w:sz w:val="20"/>
-                <w:szCs w:val="20"/>
-              </w:rPr>
-              <w:t>OpenMRS</w:t>
-            </w:r>
-            <w:proofErr w:type="spellEnd"/>
-            <w:r>
-              <w:rPr>
-                <w:sz w:val="20"/>
-                <w:szCs w:val="20"/>
-              </w:rPr>
-              <w:t xml:space="preserve"> (Maria Fernandes / Ibrahim Osei)</w:t>
+              <w:t>No match — not in OpenMRS (Maria Fernandes / Ibrahim Osei)</w:t>
             </w:r>
           </w:p>
         </w:tc>
@@ -7536,49 +6187,34 @@
         </w:numPr>
         <w:spacing w:after="60"/>
       </w:pPr>
-      <w:proofErr w:type="spellStart"/>
-      <w:r>
-        <w:t>match_result</w:t>
-      </w:r>
-      <w:proofErr w:type="spellEnd"/>
-      <w:r>
-        <w:t>: EXACT_MATCH · DOB_MISMATCH · PARTIAL_MATCH · MULTIPLE_CANDIDATES · NO_MATCH · NOT_APPLICABLE</w:t>
-      </w:r>
-    </w:p>
-    <w:p>
-      <w:pPr>
-        <w:pStyle w:val="ListParagraph"/>
-        <w:numPr>
-          <w:ilvl w:val="0"/>
-          <w:numId w:val="3"/>
-        </w:numPr>
-        <w:spacing w:after="60"/>
-      </w:pPr>
-      <w:proofErr w:type="spellStart"/>
-      <w:r>
-        <w:t>bot_decision</w:t>
-      </w:r>
-      <w:proofErr w:type="spellEnd"/>
-      <w:r>
-        <w:t>: AUTO_CREATE_REFERRAL_RECORD · HUMAN_REVIEW_REQUIRED · BUSINESS_EXCEPTION · SYSTEM_EXCEPTION</w:t>
-      </w:r>
-    </w:p>
-    <w:p>
-      <w:pPr>
-        <w:pStyle w:val="ListParagraph"/>
-        <w:numPr>
-          <w:ilvl w:val="0"/>
-          <w:numId w:val="3"/>
-        </w:numPr>
-        <w:spacing w:after="60"/>
-      </w:pPr>
-      <w:proofErr w:type="spellStart"/>
-      <w:r>
-        <w:t>final_status</w:t>
-      </w:r>
-      <w:proofErr w:type="spellEnd"/>
-      <w:r>
-        <w:t>: REFERRAL_CREATED_IN_OPENMRS · ROUTED_TO_HUMAN_REVIEW · BUSINESS_EXCEPTION_FAILED · SYSTEM_EXCEPTION_ESCALATED</w:t>
+      <w:r>
+        <w:t>match_result: EXACT_MATCH · DOB_MISMATCH · PARTIAL_MATCH · MULTIPLE_CANDIDATES · NO_MATCH · NOT_APPLICABLE</w:t>
+      </w:r>
+    </w:p>
+    <w:p>
+      <w:pPr>
+        <w:pStyle w:val="ListParagraph"/>
+        <w:numPr>
+          <w:ilvl w:val="0"/>
+          <w:numId w:val="3"/>
+        </w:numPr>
+        <w:spacing w:after="60"/>
+      </w:pPr>
+      <w:r>
+        <w:t>bot_decision: AUTO_CREATE_REFERRAL_RECORD · HUMAN_REVIEW_REQUIRED · BUSINESS_EXCEPTION · SYSTEM_EXCEPTION</w:t>
+      </w:r>
+    </w:p>
+    <w:p>
+      <w:pPr>
+        <w:pStyle w:val="ListParagraph"/>
+        <w:numPr>
+          <w:ilvl w:val="0"/>
+          <w:numId w:val="3"/>
+        </w:numPr>
+        <w:spacing w:after="60"/>
+      </w:pPr>
+      <w:r>
+        <w:t>final_status: REFERRAL_CREATED_IN_OPENMRS · ROUTED_TO_HUMAN_REVIEW · BUSINESS_EXCEPTION_FAILED · SYSTEM_EXCEPTION_ESCALATED</w:t>
       </w:r>
     </w:p>
     <w:p>
@@ -7612,17 +6248,7 @@
         <w:spacing w:after="60"/>
       </w:pPr>
       <w:r>
-        <w:t>15 referral inputs present; 15 expected-outcome JSON files, all validated (</w:t>
-      </w:r>
-      <w:proofErr w:type="spellStart"/>
-      <w:proofErr w:type="gramStart"/>
-      <w:r>
-        <w:t>json.load</w:t>
-      </w:r>
-      <w:proofErr w:type="spellEnd"/>
-      <w:proofErr w:type="gramEnd"/>
-      <w:r>
-        <w:t xml:space="preserve"> over all 15 → 0 invalid).</w:t>
+        <w:t>15 referral inputs present; 15 expected-outcome JSON files, all validated (json.load over all 15 → 0 invalid).</w:t>
       </w:r>
     </w:p>
     <w:p>
@@ -7695,15 +6321,7 @@
         <w:spacing w:after="60"/>
       </w:pPr>
       <w:r>
-        <w:t>An expected-outcome JSON (e.g. REF-</w:t>
-      </w:r>
-      <w:proofErr w:type="gramStart"/>
-      <w:r>
-        <w:t>004.expected.json</w:t>
-      </w:r>
-      <w:proofErr w:type="gramEnd"/>
-      <w:r>
-        <w:t>) showing the DOB-mismatch oracle.</w:t>
+        <w:t>An expected-outcome JSON (e.g. REF-004.expected.json) showing the DOB-mismatch oracle.</w:t>
       </w:r>
     </w:p>
     <w:p>
@@ -7748,15 +6366,7 @@
         <w:spacing w:after="120"/>
       </w:pPr>
       <w:r>
-        <w:t xml:space="preserve">REF-007 duplicate needs the pre-existing Cardiology Referral encounter for Arthur Reed (seeded Phase 6/8). A few .txt referrals may optionally be re-rendered as real .pdf in Phase 4 to exercise the </w:t>
-      </w:r>
-      <w:proofErr w:type="spellStart"/>
-      <w:r>
-        <w:t>PDF→text</w:t>
-      </w:r>
-      <w:proofErr w:type="spellEnd"/>
-      <w:r>
-        <w:t xml:space="preserve"> path on valid PDFs.</w:t>
+        <w:t>REF-007 duplicate needs the pre-existing Cardiology Referral encounter for Arthur Reed (seeded Phase 6/8). A few .txt referrals may optionally be re-rendered as real .pdf in Phase 4 to exercise the PDF→text path on valid PDFs.</w:t>
       </w:r>
     </w:p>
     <w:p>
@@ -7793,57 +6403,33 @@
         <w:spacing w:after="60"/>
       </w:pPr>
       <w:r>
-        <w:t>A Python extraction service (services/extraction-service/) that turns each referral document into a schema-validated JSON record: the structured referral fields, a completeness report (</w:t>
-      </w:r>
-      <w:proofErr w:type="spellStart"/>
-      <w:r>
-        <w:t>missing_fields</w:t>
-      </w:r>
-      <w:proofErr w:type="spellEnd"/>
-      <w:r>
-        <w:t>), and a confidence rating (high / medium / low / n-a).</w:t>
-      </w:r>
-    </w:p>
-    <w:p>
-      <w:pPr>
-        <w:pStyle w:val="ListParagraph"/>
-        <w:numPr>
-          <w:ilvl w:val="0"/>
-          <w:numId w:val="3"/>
-        </w:numPr>
-        <w:spacing w:after="60"/>
-      </w:pPr>
-      <w:r>
-        <w:t>A deterministic regex extractor is the default 'guardrail' path — no model, no API key, no internet — so its output is fully reproducible and auditable. An optional LLM path (</w:t>
-      </w:r>
-      <w:proofErr w:type="spellStart"/>
-      <w:r>
-        <w:t>Groq</w:t>
-      </w:r>
-      <w:proofErr w:type="spellEnd"/>
-      <w:r>
-        <w:t xml:space="preserve"> / OpenAI-compatible) runs only when USE_LLM=true and a key is configured, and any LLM failure falls back to regex. Both paths share the same normalisers and the same schema validation.</w:t>
-      </w:r>
-    </w:p>
-    <w:p>
-      <w:pPr>
-        <w:pStyle w:val="ListParagraph"/>
-        <w:numPr>
-          <w:ilvl w:val="0"/>
-          <w:numId w:val="3"/>
-        </w:numPr>
-        <w:spacing w:after="60"/>
-      </w:pPr>
-      <w:r>
-        <w:t>Normalisers clean the messy realities of referral letters: NHS number '999 000 0018' to '9990000018', dates dd/mm/</w:t>
-      </w:r>
-      <w:proofErr w:type="spellStart"/>
-      <w:r>
-        <w:t>yyyy</w:t>
-      </w:r>
-      <w:proofErr w:type="spellEnd"/>
-      <w:r>
-        <w:t xml:space="preserve"> to ISO (1979-04-12), 'Male' to 'M', and priority 'URGENT — 2-WEEK WAIT' to '2WW'.</w:t>
+        <w:t>A Python extraction service (services/extraction-service/) that turns each referral document into a schema-validated JSON record: the structured referral fields, a completeness report (missing_fields), and a confidence rating (high / medium / low / n-a).</w:t>
+      </w:r>
+    </w:p>
+    <w:p>
+      <w:pPr>
+        <w:pStyle w:val="ListParagraph"/>
+        <w:numPr>
+          <w:ilvl w:val="0"/>
+          <w:numId w:val="3"/>
+        </w:numPr>
+        <w:spacing w:after="60"/>
+      </w:pPr>
+      <w:r>
+        <w:t>A deterministic regex extractor is the default 'guardrail' path — no model, no API key, no internet — so its output is fully reproducible and auditable. An optional LLM path (Groq / OpenAI-compatible) runs only when USE_LLM=true and a key is configured, and any LLM failure falls back to regex. Both paths share the same normalisers and the same schema validation.</w:t>
+      </w:r>
+    </w:p>
+    <w:p>
+      <w:pPr>
+        <w:pStyle w:val="ListParagraph"/>
+        <w:numPr>
+          <w:ilvl w:val="0"/>
+          <w:numId w:val="3"/>
+        </w:numPr>
+        <w:spacing w:after="60"/>
+      </w:pPr>
+      <w:r>
+        <w:t>Normalisers clean the messy realities of referral letters: NHS number '999 000 0018' to '9990000018', dates dd/mm/yyyy to ISO (1979-04-12), 'Male' to 'M', and priority 'URGENT — 2-WEEK WAIT' to '2WW'.</w:t>
       </w:r>
     </w:p>
     <w:p>
@@ -7882,39 +6468,7 @@
         <w:spacing w:after="60"/>
       </w:pPr>
       <w:r>
-        <w:t xml:space="preserve">Scope guardrail: extraction only. No patient matching against </w:t>
-      </w:r>
-      <w:proofErr w:type="spellStart"/>
-      <w:r>
-        <w:t>OpenMRS</w:t>
-      </w:r>
-      <w:proofErr w:type="spellEnd"/>
-      <w:r>
-        <w:t xml:space="preserve"> and no clinical/routing decision — those are Phase 5/6 and are deliberately absent from the output schema (no </w:t>
-      </w:r>
-      <w:proofErr w:type="spellStart"/>
-      <w:r>
-        <w:t>match_result</w:t>
-      </w:r>
-      <w:proofErr w:type="spellEnd"/>
-      <w:r>
-        <w:t xml:space="preserve">, </w:t>
-      </w:r>
-      <w:proofErr w:type="spellStart"/>
-      <w:r>
-        <w:t>bot_decision</w:t>
-      </w:r>
-      <w:proofErr w:type="spellEnd"/>
-      <w:r>
-        <w:t xml:space="preserve"> or </w:t>
-      </w:r>
-      <w:proofErr w:type="spellStart"/>
-      <w:r>
-        <w:t>final_status</w:t>
-      </w:r>
-      <w:proofErr w:type="spellEnd"/>
-      <w:r>
-        <w:t>).</w:t>
+        <w:t>Scope guardrail: extraction only. No patient matching against OpenMRS and no clinical/routing decision — those are Phase 5/6 and are deliberately absent from the output schema (no match_result, bot_decision or final_status).</w:t>
       </w:r>
     </w:p>
     <w:p>
@@ -7935,86 +6489,46 @@
         <w:spacing w:after="60"/>
       </w:pPr>
       <w:r>
-        <w:t>services/extraction-service/</w:t>
-      </w:r>
-      <w:proofErr w:type="spellStart"/>
-      <w:r>
-        <w:t>src</w:t>
-      </w:r>
-      <w:proofErr w:type="spellEnd"/>
-      <w:r>
-        <w:t>/ — regex_extractor.py, llm_extractor.py, text_reader.py, confidence.py, validate.py, extractor.py (orchestrator).</w:t>
-      </w:r>
-    </w:p>
-    <w:p>
-      <w:pPr>
-        <w:pStyle w:val="ListParagraph"/>
-        <w:numPr>
-          <w:ilvl w:val="0"/>
-          <w:numId w:val="3"/>
-        </w:numPr>
-        <w:spacing w:after="60"/>
-      </w:pPr>
-      <w:r>
-        <w:t>services/extraction-service/schema/</w:t>
-      </w:r>
-      <w:proofErr w:type="spellStart"/>
-      <w:r>
-        <w:t>extraction.schema.json</w:t>
-      </w:r>
-      <w:proofErr w:type="spellEnd"/>
-      <w:r>
-        <w:t xml:space="preserve"> — Draft-07 output schema.</w:t>
-      </w:r>
-    </w:p>
-    <w:p>
-      <w:pPr>
-        <w:pStyle w:val="ListParagraph"/>
-        <w:numPr>
-          <w:ilvl w:val="0"/>
-          <w:numId w:val="3"/>
-        </w:numPr>
-        <w:spacing w:after="60"/>
-      </w:pPr>
-      <w:r>
-        <w:t>run_extraction.py (CLI), validate_against_oracles.py (acceptance harness), app.py (</w:t>
-      </w:r>
-      <w:proofErr w:type="spellStart"/>
-      <w:r>
-        <w:t>stdlib</w:t>
-      </w:r>
-      <w:proofErr w:type="spellEnd"/>
-      <w:r>
-        <w:t xml:space="preserve"> HTTP service — no Flask), requirements.txt (all optional), README.md.</w:t>
-      </w:r>
-    </w:p>
-    <w:p>
-      <w:pPr>
-        <w:pStyle w:val="ListParagraph"/>
-        <w:numPr>
-          <w:ilvl w:val="0"/>
-          <w:numId w:val="3"/>
-        </w:numPr>
-        <w:spacing w:after="60"/>
-      </w:pPr>
-      <w:r>
-        <w:t>data/extracted-</w:t>
-      </w:r>
-      <w:proofErr w:type="spellStart"/>
-      <w:r>
-        <w:t>json</w:t>
-      </w:r>
-      <w:proofErr w:type="spellEnd"/>
-      <w:r>
-        <w:t>/REF-001…REF-</w:t>
-      </w:r>
-      <w:proofErr w:type="gramStart"/>
-      <w:r>
-        <w:t>015.extracted.json</w:t>
-      </w:r>
-      <w:proofErr w:type="gramEnd"/>
-      <w:r>
-        <w:t xml:space="preserve"> — the 15 extraction outputs.</w:t>
+        <w:t>services/extraction-service/src/ — regex_extractor.py, llm_extractor.py, text_reader.py, confidence.py, validate.py, extractor.py (orchestrator).</w:t>
+      </w:r>
+    </w:p>
+    <w:p>
+      <w:pPr>
+        <w:pStyle w:val="ListParagraph"/>
+        <w:numPr>
+          <w:ilvl w:val="0"/>
+          <w:numId w:val="3"/>
+        </w:numPr>
+        <w:spacing w:after="60"/>
+      </w:pPr>
+      <w:r>
+        <w:t>services/extraction-service/schema/extraction.schema.json — Draft-07 output schema.</w:t>
+      </w:r>
+    </w:p>
+    <w:p>
+      <w:pPr>
+        <w:pStyle w:val="ListParagraph"/>
+        <w:numPr>
+          <w:ilvl w:val="0"/>
+          <w:numId w:val="3"/>
+        </w:numPr>
+        <w:spacing w:after="60"/>
+      </w:pPr>
+      <w:r>
+        <w:t>run_extraction.py (CLI), validate_against_oracles.py (acceptance harness), app.py (stdlib HTTP service — no Flask), requirements.txt (all optional), README.md.</w:t>
+      </w:r>
+    </w:p>
+    <w:p>
+      <w:pPr>
+        <w:pStyle w:val="ListParagraph"/>
+        <w:numPr>
+          <w:ilvl w:val="0"/>
+          <w:numId w:val="3"/>
+        </w:numPr>
+        <w:spacing w:after="60"/>
+      </w:pPr>
+      <w:r>
+        <w:t>data/extracted-json/REF-001…REF-015.extracted.json — the 15 extraction outputs.</w:t>
       </w:r>
     </w:p>
     <w:p>
@@ -8061,15 +6575,7 @@
         <w:spacing w:after="60"/>
       </w:pPr>
       <w:r>
-        <w:t>python run_extraction.py — extracts every referral to data/extracted-</w:t>
-      </w:r>
-      <w:proofErr w:type="spellStart"/>
-      <w:r>
-        <w:t>json</w:t>
-      </w:r>
-      <w:proofErr w:type="spellEnd"/>
-      <w:r>
-        <w:t>/. Runs offline on the regex path with no dependencies or keys.</w:t>
+        <w:t>python run_extraction.py — extracts every referral to data/extracted-json/. Runs offline on the regex path with no dependencies or keys.</w:t>
       </w:r>
     </w:p>
     <w:p>
@@ -8141,22 +6647,9 @@
         </w:numPr>
         <w:spacing w:after="60"/>
       </w:pPr>
-      <w:proofErr w:type="spellStart"/>
       <w:r>
         <w:lastRenderedPageBreak/>
-        <w:t>is_referral</w:t>
-      </w:r>
-      <w:proofErr w:type="spellEnd"/>
-      <w:r>
-        <w:t xml:space="preserve">, </w:t>
-      </w:r>
-      <w:proofErr w:type="spellStart"/>
-      <w:r>
-        <w:t>missing_fields</w:t>
-      </w:r>
-      <w:proofErr w:type="spellEnd"/>
-      <w:r>
-        <w:t>, field normalisation and exception type (Business vs System) are all correct against the oracles.</w:t>
+        <w:t>is_referral, missing_fields, field normalisation and exception type (Business vs System) are all correct against the oracles.</w:t>
       </w:r>
     </w:p>
     <w:p>
@@ -8235,39 +6728,7 @@
         <w:spacing w:after="120"/>
       </w:pPr>
       <w:r>
-        <w:t>services/extraction-service/ (source, schema, CLI, HTTP service, harness, README), data/extracted-</w:t>
-      </w:r>
-      <w:proofErr w:type="spellStart"/>
-      <w:r>
-        <w:t>json</w:t>
-      </w:r>
-      <w:proofErr w:type="spellEnd"/>
-      <w:r>
-        <w:t>/REF-*.</w:t>
-      </w:r>
-      <w:proofErr w:type="spellStart"/>
-      <w:r>
-        <w:t>extracted.json</w:t>
-      </w:r>
-      <w:proofErr w:type="spellEnd"/>
-      <w:r>
-        <w:t xml:space="preserve">, docs/testing/phase4-acceptance.md, README + this build log. No secrets — the LLM key stays </w:t>
-      </w:r>
-      <w:proofErr w:type="gramStart"/>
-      <w:r>
-        <w:t>in .env</w:t>
-      </w:r>
-      <w:proofErr w:type="gramEnd"/>
-      <w:r>
-        <w:t xml:space="preserve"> (</w:t>
-      </w:r>
-      <w:proofErr w:type="spellStart"/>
-      <w:r>
-        <w:t>gitignored</w:t>
-      </w:r>
-      <w:proofErr w:type="spellEnd"/>
-      <w:r>
-        <w:t>).</w:t>
+        <w:t>services/extraction-service/ (source, schema, CLI, HTTP service, harness, README), data/extracted-json/REF-*.extracted.json, docs/testing/phase4-acceptance.md, README + this build log. No secrets — the LLM key stays in .env (gitignored).</w:t>
       </w:r>
     </w:p>
     <w:p>
@@ -8283,55 +6744,7 @@
         <w:spacing w:after="120"/>
       </w:pPr>
       <w:r>
-        <w:t>Rules &amp; safety decision engine: consume extracted-</w:t>
-      </w:r>
-      <w:proofErr w:type="spellStart"/>
-      <w:r>
-        <w:t>json</w:t>
-      </w:r>
-      <w:proofErr w:type="spellEnd"/>
-      <w:r>
-        <w:t xml:space="preserve">/ + the </w:t>
-      </w:r>
-      <w:proofErr w:type="spellStart"/>
-      <w:r>
-        <w:t>OpenMRS</w:t>
-      </w:r>
-      <w:proofErr w:type="spellEnd"/>
-      <w:r>
-        <w:t xml:space="preserve"> patient match to produce </w:t>
-      </w:r>
-      <w:proofErr w:type="spellStart"/>
-      <w:r>
-        <w:t>match_result</w:t>
-      </w:r>
-      <w:proofErr w:type="spellEnd"/>
-      <w:r>
-        <w:t xml:space="preserve">, </w:t>
-      </w:r>
-      <w:proofErr w:type="spellStart"/>
-      <w:r>
-        <w:t>safety_flags</w:t>
-      </w:r>
-      <w:proofErr w:type="spellEnd"/>
-      <w:r>
-        <w:t xml:space="preserve">, </w:t>
-      </w:r>
-      <w:proofErr w:type="spellStart"/>
-      <w:r>
-        <w:t>reason_codes</w:t>
-      </w:r>
-      <w:proofErr w:type="spellEnd"/>
-      <w:r>
-        <w:t xml:space="preserve"> and </w:t>
-      </w:r>
-      <w:proofErr w:type="spellStart"/>
-      <w:r>
-        <w:t>bot_decision</w:t>
-      </w:r>
-      <w:proofErr w:type="spellEnd"/>
-      <w:r>
-        <w:t>, with a reason code for every decision. The Phase 3 oracles already hold the expected values.</w:t>
+        <w:t>Rules &amp; safety decision engine: consume extracted-json/ + the OpenMRS patient match to produce match_result, safety_flags, reason_codes and bot_decision, with a reason code for every decision. The Phase 3 oracles already hold the expected values.</w:t>
       </w:r>
     </w:p>
     <w:p>
@@ -8420,28 +6833,7 @@
         <w:spacing w:after="60"/>
       </w:pPr>
       <w:r>
-        <w:t xml:space="preserve">Two interchangeable patient-match backends sit behind one interface: a local seed-file backend (the committed </w:t>
-      </w:r>
-      <w:proofErr w:type="spellStart"/>
-      <w:r>
-        <w:t>synthetic_</w:t>
-      </w:r>
-      <w:proofErr w:type="gramStart"/>
-      <w:r>
-        <w:t>patients.json</w:t>
-      </w:r>
-      <w:proofErr w:type="spellEnd"/>
-      <w:proofErr w:type="gramEnd"/>
-      <w:r>
-        <w:t xml:space="preserve">) that makes the acceptance gate fully offline and reproducible, and a live </w:t>
-      </w:r>
-      <w:proofErr w:type="spellStart"/>
-      <w:r>
-        <w:t>OpenMRS</w:t>
-      </w:r>
-      <w:proofErr w:type="spellEnd"/>
-      <w:r>
-        <w:t xml:space="preserve"> REST backend for the Phase 8 performer.</w:t>
+        <w:t>Two interchangeable patient-match backends sit behind one interface: a local seed-file backend (the committed synthetic_patients.json) that makes the acceptance gate fully offline and reproducible, and a live OpenMRS REST backend for the Phase 8 performer.</w:t>
       </w:r>
     </w:p>
     <w:p>
@@ -8462,102 +6854,46 @@
         <w:spacing w:after="60"/>
       </w:pPr>
       <w:r>
-        <w:t>services/rules-engine/</w:t>
-      </w:r>
-      <w:proofErr w:type="spellStart"/>
-      <w:r>
-        <w:t>src</w:t>
-      </w:r>
-      <w:proofErr w:type="spellEnd"/>
-      <w:r>
-        <w:t xml:space="preserve">/ — patient_repository.py (local + </w:t>
-      </w:r>
-      <w:proofErr w:type="spellStart"/>
-      <w:r>
-        <w:t>OpenMRS</w:t>
-      </w:r>
-      <w:proofErr w:type="spellEnd"/>
-      <w:r>
-        <w:t xml:space="preserve"> backends), matcher.py, rules.py, decision_engine.py (orchestrator), validate.py.</w:t>
-      </w:r>
-    </w:p>
-    <w:p>
-      <w:pPr>
-        <w:pStyle w:val="ListParagraph"/>
-        <w:numPr>
-          <w:ilvl w:val="0"/>
-          <w:numId w:val="3"/>
-        </w:numPr>
-        <w:spacing w:after="60"/>
-      </w:pPr>
-      <w:r>
-        <w:t>services/rules-engine/schema/</w:t>
-      </w:r>
-      <w:proofErr w:type="spellStart"/>
-      <w:r>
-        <w:t>decision.schema.json</w:t>
-      </w:r>
-      <w:proofErr w:type="spellEnd"/>
-      <w:r>
-        <w:t xml:space="preserve"> — Draft-07 output schema (requires a non-empty </w:t>
-      </w:r>
-      <w:proofErr w:type="spellStart"/>
-      <w:r>
-        <w:t>reason_codes</w:t>
-      </w:r>
-      <w:proofErr w:type="spellEnd"/>
-      <w:r>
-        <w:t xml:space="preserve"> array).</w:t>
-      </w:r>
-    </w:p>
-    <w:p>
-      <w:pPr>
-        <w:pStyle w:val="ListParagraph"/>
-        <w:numPr>
-          <w:ilvl w:val="0"/>
-          <w:numId w:val="3"/>
-        </w:numPr>
-        <w:spacing w:after="60"/>
-      </w:pPr>
-      <w:r>
-        <w:t>run_decisions.py (CLI), validate_against_oracles.py (acceptance harness), app.py (</w:t>
-      </w:r>
-      <w:proofErr w:type="spellStart"/>
-      <w:r>
-        <w:t>stdlib</w:t>
-      </w:r>
-      <w:proofErr w:type="spellEnd"/>
-      <w:r>
-        <w:t xml:space="preserve"> HTTP service on :8090 — no Flask), requirements.txt (optional), README.md.</w:t>
-      </w:r>
-    </w:p>
-    <w:p>
-      <w:pPr>
-        <w:pStyle w:val="ListParagraph"/>
-        <w:numPr>
-          <w:ilvl w:val="0"/>
-          <w:numId w:val="3"/>
-        </w:numPr>
-        <w:spacing w:after="60"/>
-      </w:pPr>
-      <w:r>
-        <w:t>data/decisions/REF-001…REF-</w:t>
-      </w:r>
-      <w:proofErr w:type="gramStart"/>
-      <w:r>
-        <w:t>015.decision.json</w:t>
-      </w:r>
-      <w:proofErr w:type="gramEnd"/>
-      <w:r>
-        <w:t xml:space="preserve"> — the 15 decision outputs (</w:t>
-      </w:r>
-      <w:proofErr w:type="spellStart"/>
-      <w:r>
-        <w:t>gitignored</w:t>
-      </w:r>
-      <w:proofErr w:type="spellEnd"/>
-      <w:r>
-        <w:t xml:space="preserve"> runtime output; regenerate anytime).</w:t>
+        <w:t>services/rules-engine/src/ — patient_repository.py (local + OpenMRS backends), matcher.py, rules.py, decision_engine.py (orchestrator), validate.py.</w:t>
+      </w:r>
+    </w:p>
+    <w:p>
+      <w:pPr>
+        <w:pStyle w:val="ListParagraph"/>
+        <w:numPr>
+          <w:ilvl w:val="0"/>
+          <w:numId w:val="3"/>
+        </w:numPr>
+        <w:spacing w:after="60"/>
+      </w:pPr>
+      <w:r>
+        <w:t>services/rules-engine/schema/decision.schema.json — Draft-07 output schema (requires a non-empty reason_codes array).</w:t>
+      </w:r>
+    </w:p>
+    <w:p>
+      <w:pPr>
+        <w:pStyle w:val="ListParagraph"/>
+        <w:numPr>
+          <w:ilvl w:val="0"/>
+          <w:numId w:val="3"/>
+        </w:numPr>
+        <w:spacing w:after="60"/>
+      </w:pPr>
+      <w:r>
+        <w:t>run_decisions.py (CLI), validate_against_oracles.py (acceptance harness), app.py (stdlib HTTP service on :8090 — no Flask), requirements.txt (optional), README.md.</w:t>
+      </w:r>
+    </w:p>
+    <w:p>
+      <w:pPr>
+        <w:pStyle w:val="ListParagraph"/>
+        <w:numPr>
+          <w:ilvl w:val="0"/>
+          <w:numId w:val="3"/>
+        </w:numPr>
+        <w:spacing w:after="60"/>
+      </w:pPr>
+      <w:r>
+        <w:t>data/decisions/REF-001…REF-015.decision.json — the 15 decision outputs (gitignored runtime output; regenerate anytime).</w:t>
       </w:r>
     </w:p>
     <w:p>
@@ -8604,23 +6940,7 @@
         <w:spacing w:after="60"/>
       </w:pPr>
       <w:r>
-        <w:t xml:space="preserve">python run_decisions.py — decides every extracted referral to data/decisions/. Runs fully offline against the synthetic-patient seed file (use --source </w:t>
-      </w:r>
-      <w:proofErr w:type="spellStart"/>
-      <w:r>
-        <w:t>openmrs</w:t>
-      </w:r>
-      <w:proofErr w:type="spellEnd"/>
-      <w:r>
-        <w:t xml:space="preserve"> to match against live </w:t>
-      </w:r>
-      <w:proofErr w:type="spellStart"/>
-      <w:r>
-        <w:t>OpenMRS</w:t>
-      </w:r>
-      <w:proofErr w:type="spellEnd"/>
-      <w:r>
-        <w:t>).</w:t>
+        <w:t>python run_decisions.py — decides every extracted referral to data/decisions/. Runs fully offline against the synthetic-patient seed file (use --source openmrs to match against live OpenMRS).</w:t>
       </w:r>
     </w:p>
     <w:p>
@@ -8693,29 +7013,8 @@
         </w:numPr>
         <w:spacing w:after="60"/>
       </w:pPr>
-      <w:proofErr w:type="spellStart"/>
-      <w:r>
-        <w:t>match_result</w:t>
-      </w:r>
-      <w:proofErr w:type="spellEnd"/>
-      <w:r>
-        <w:t xml:space="preserve">, </w:t>
-      </w:r>
-      <w:proofErr w:type="spellStart"/>
-      <w:r>
-        <w:t>bot_decision</w:t>
-      </w:r>
-      <w:proofErr w:type="spellEnd"/>
-      <w:r>
-        <w:t xml:space="preserve"> and </w:t>
-      </w:r>
-      <w:proofErr w:type="spellStart"/>
-      <w:r>
-        <w:t>final_status</w:t>
-      </w:r>
-      <w:proofErr w:type="spellEnd"/>
-      <w:r>
-        <w:t xml:space="preserve"> match the oracles exactly; every decision carries at least one reason code; every risky case routes to a human.</w:t>
+      <w:r>
+        <w:t>match_result, bot_decision and final_status match the oracles exactly; every decision carries at least one reason code; every risky case routes to a human.</w:t>
       </w:r>
     </w:p>
     <w:p>
@@ -8731,39 +7030,7 @@
         <w:spacing w:after="120"/>
       </w:pPr>
       <w:r>
-        <w:t xml:space="preserve">The three safety-critical </w:t>
-      </w:r>
-      <w:proofErr w:type="spellStart"/>
-      <w:r>
-        <w:t>categoricals</w:t>
-      </w:r>
-      <w:proofErr w:type="spellEnd"/>
-      <w:r>
-        <w:t xml:space="preserve"> — </w:t>
-      </w:r>
-      <w:proofErr w:type="spellStart"/>
-      <w:r>
-        <w:t>match_result</w:t>
-      </w:r>
-      <w:proofErr w:type="spellEnd"/>
-      <w:r>
-        <w:t xml:space="preserve">, </w:t>
-      </w:r>
-      <w:proofErr w:type="spellStart"/>
-      <w:r>
-        <w:t>bot_decision</w:t>
-      </w:r>
-      <w:proofErr w:type="spellEnd"/>
-      <w:r>
-        <w:t xml:space="preserve"> and </w:t>
-      </w:r>
-      <w:proofErr w:type="spellStart"/>
-      <w:r>
-        <w:t>final_status</w:t>
-      </w:r>
-      <w:proofErr w:type="spellEnd"/>
-      <w:r>
-        <w:t xml:space="preserve"> — are checked for exact equality against the oracles. The safety flags and reason codes are checked for coverage: every expected one must be present, but the engine derives codes mechanically and is deliberately more thorough than the oracle’s hand-written headline set, so any extra it raises is reported as INFO, not FAIL. For example, it also records URGENT_RED_FLAG on the safeguarding child (REF-009), and INCOMPLETE on the degraded scan whose speciality could not be read (REF-013). This never weakens the gate — an extra flag on a clean case would flip it away from auto-create and fail the exact decision check.</w:t>
+        <w:t>The three safety-critical categoricals — match_result, bot_decision and final_status — are checked for exact equality against the oracles. The safety flags and reason codes are checked for coverage: every expected one must be present, but the engine derives codes mechanically and is deliberately more thorough than the oracle’s hand-written headline set, so any extra it raises is reported as INFO, not FAIL. For example, it also records URGENT_RED_FLAG on the safeguarding child (REF-009), and INCOMPLETE on the degraded scan whose speciality could not be read (REF-013). This never weakens the gate — an extra flag on a clean case would flip it away from auto-create and fail the exact decision check.</w:t>
       </w:r>
     </w:p>
     <w:p>
@@ -8826,41 +7093,7 @@
         <w:spacing w:after="120"/>
       </w:pPr>
       <w:r>
-        <w:t>services/rules-engine/ (source, schema, CLI, HTTP service, harness, README), docs/testing/phase5-acceptance.md, data/decisions</w:t>
-      </w:r>
-      <w:proofErr w:type="gramStart"/>
-      <w:r>
-        <w:t>/.</w:t>
-      </w:r>
-      <w:proofErr w:type="spellStart"/>
-      <w:r>
-        <w:t>gitkeep</w:t>
-      </w:r>
-      <w:proofErr w:type="spellEnd"/>
-      <w:proofErr w:type="gramEnd"/>
-      <w:r>
-        <w:t xml:space="preserve">, </w:t>
-      </w:r>
-      <w:proofErr w:type="gramStart"/>
-      <w:r>
-        <w:t>the .</w:t>
-      </w:r>
-      <w:proofErr w:type="spellStart"/>
-      <w:r>
-        <w:t>gitignore</w:t>
-      </w:r>
-      <w:proofErr w:type="spellEnd"/>
-      <w:proofErr w:type="gramEnd"/>
-      <w:r>
-        <w:t xml:space="preserve"> rule for data/decisions/, the README status table, and this build log. The decision JSON outputs are </w:t>
-      </w:r>
-      <w:proofErr w:type="spellStart"/>
-      <w:r>
-        <w:t>gitignored</w:t>
-      </w:r>
-      <w:proofErr w:type="spellEnd"/>
-      <w:r>
-        <w:t xml:space="preserve"> runtime artefacts.</w:t>
+        <w:t>services/rules-engine/ (source, schema, CLI, HTTP service, harness, README), docs/testing/phase5-acceptance.md, data/decisions/.gitkeep, the .gitignore rule for data/decisions/, the README status table, and this build log. The decision JSON outputs are gitignored runtime artefacts.</w:t>
       </w:r>
     </w:p>
     <w:p>
@@ -8875,21 +7108,8 @@
       <w:pPr>
         <w:spacing w:after="120"/>
       </w:pPr>
-      <w:proofErr w:type="spellStart"/>
-      <w:r>
-        <w:t>OpenMRS</w:t>
-      </w:r>
-      <w:proofErr w:type="spellEnd"/>
-      <w:r>
-        <w:t xml:space="preserve"> workflow mapping: define the Referral encounter type and concepts, seed Arthur Reed’s pre-existing active Cardiology referral (which activates the live </w:t>
-      </w:r>
-      <w:proofErr w:type="spellStart"/>
-      <w:r>
-        <w:t>OpenMRS</w:t>
-      </w:r>
-      <w:proofErr w:type="spellEnd"/>
-      <w:r>
-        <w:t xml:space="preserve"> duplicate check), and specify the concrete REST create + re-read verify the bot performs for an AUTO_CREATE decision.</w:t>
+      <w:r>
+        <w:t>OpenMRS workflow mapping: define the Referral encounter type and concepts, seed Arthur Reed’s pre-existing active Cardiology referral (which activates the live OpenMRS duplicate check), and specify the concrete REST create + re-read verify the bot performs for an AUTO_CREATE decision.</w:t>
       </w:r>
     </w:p>
     <w:p>
@@ -8904,15 +7124,7 @@
       <w:bookmarkStart w:id="11" w:name="_Toc232111795"/>
       <w:r>
         <w:lastRenderedPageBreak/>
-        <w:t xml:space="preserve">Phase 6 — </w:t>
-      </w:r>
-      <w:proofErr w:type="spellStart"/>
-      <w:r>
-        <w:t>OpenMRS</w:t>
-      </w:r>
-      <w:proofErr w:type="spellEnd"/>
-      <w:r>
-        <w:t xml:space="preserve"> Workflow Mapping</w:t>
+        <w:t>Phase 6 — OpenMRS Workflow Mapping</w:t>
       </w:r>
       <w:bookmarkEnd w:id="11"/>
     </w:p>
@@ -8934,65 +7146,33 @@
         <w:spacing w:after="60"/>
       </w:pPr>
       <w:r>
-        <w:t xml:space="preserve">The concrete, executable </w:t>
-      </w:r>
-      <w:proofErr w:type="spellStart"/>
-      <w:r>
-        <w:t>OpenMRS</w:t>
-      </w:r>
-      <w:proofErr w:type="spellEnd"/>
-      <w:r>
-        <w:t xml:space="preserve"> update path (services/</w:t>
-      </w:r>
-      <w:proofErr w:type="spellStart"/>
-      <w:r>
-        <w:t>openmrs</w:t>
-      </w:r>
-      <w:proofErr w:type="spellEnd"/>
-      <w:r>
-        <w:t>-workflow/) the bot uses once a referral has been decided (Phase 5): real REST writes against the real EMR, verified by re-reading the record — no log-message-only steps.</w:t>
-      </w:r>
-    </w:p>
-    <w:p>
-      <w:pPr>
-        <w:pStyle w:val="ListParagraph"/>
-        <w:numPr>
-          <w:ilvl w:val="0"/>
-          <w:numId w:val="3"/>
-        </w:numPr>
-        <w:spacing w:after="60"/>
-      </w:pPr>
-      <w:r>
-        <w:t xml:space="preserve">A referral is modelled with the native </w:t>
-      </w:r>
-      <w:proofErr w:type="spellStart"/>
-      <w:r>
-        <w:t>OpenMRS</w:t>
-      </w:r>
-      <w:proofErr w:type="spellEnd"/>
-      <w:r>
-        <w:t xml:space="preserve"> clinical data model — one Referral encounter carrying one observation per field (speciality, urgency, reason, referrer name/organisation, status, source-document id, suspected-cancer) — so it is fully reachable and verifiable over REST, rather than a custom O3 form.</w:t>
-      </w:r>
-    </w:p>
-    <w:p>
-      <w:pPr>
-        <w:pStyle w:val="ListParagraph"/>
-        <w:numPr>
-          <w:ilvl w:val="0"/>
-          <w:numId w:val="3"/>
-        </w:numPr>
-        <w:spacing w:after="60"/>
-      </w:pPr>
-      <w:r>
-        <w:t>The Referral encounter type and the eight referral concepts are created idempotently; concept datatype/class and the clinic location are discovered from the live instance, so nothing instance-specific is hard-coded. Resolved UUIDs are cached to config/referral-</w:t>
-      </w:r>
-      <w:proofErr w:type="spellStart"/>
-      <w:r>
-        <w:t>metadata.json</w:t>
-      </w:r>
-      <w:proofErr w:type="spellEnd"/>
-      <w:r>
-        <w:t>.</w:t>
+        <w:t>The concrete, executable OpenMRS update path (services/openmrs-workflow/) the bot uses once a referral has been decided (Phase 5): real REST writes against the real EMR, verified by re-reading the record — no log-message-only steps.</w:t>
+      </w:r>
+    </w:p>
+    <w:p>
+      <w:pPr>
+        <w:pStyle w:val="ListParagraph"/>
+        <w:numPr>
+          <w:ilvl w:val="0"/>
+          <w:numId w:val="3"/>
+        </w:numPr>
+        <w:spacing w:after="60"/>
+      </w:pPr>
+      <w:r>
+        <w:t>A referral is modelled with the native OpenMRS clinical data model — one Referral encounter carrying one observation per field (speciality, urgency, reason, referrer name/organisation, status, source-document id, suspected-cancer) — so it is fully reachable and verifiable over REST, rather than a custom O3 form.</w:t>
+      </w:r>
+    </w:p>
+    <w:p>
+      <w:pPr>
+        <w:pStyle w:val="ListParagraph"/>
+        <w:numPr>
+          <w:ilvl w:val="0"/>
+          <w:numId w:val="3"/>
+        </w:numPr>
+        <w:spacing w:after="60"/>
+      </w:pPr>
+      <w:r>
+        <w:t>The Referral encounter type and the eight referral concepts are created idempotently; concept datatype/class and the clinic location are discovered from the live instance, so nothing instance-specific is hard-coded. Resolved UUIDs are cached to config/referral-metadata.json.</w:t>
       </w:r>
     </w:p>
     <w:p>
@@ -9018,33 +7198,7 @@
         <w:spacing w:after="60"/>
       </w:pPr>
       <w:r>
-        <w:t xml:space="preserve">The live duplicate-referral check is now real: after seeding Arthur Reed’s pre-existing active Cardiology referral, querying </w:t>
-      </w:r>
-      <w:proofErr w:type="spellStart"/>
-      <w:r>
-        <w:t>OpenMRS</w:t>
-      </w:r>
-      <w:proofErr w:type="spellEnd"/>
-      <w:r>
-        <w:t xml:space="preserve"> returns </w:t>
-      </w:r>
-      <w:proofErr w:type="spellStart"/>
-      <w:r>
-        <w:t>existing_referral_status</w:t>
-      </w:r>
-      <w:proofErr w:type="spellEnd"/>
-      <w:r>
-        <w:t xml:space="preserve"> = </w:t>
-      </w:r>
-      <w:proofErr w:type="spellStart"/>
-      <w:proofErr w:type="gramStart"/>
-      <w:r>
-        <w:t>active:Cardiology</w:t>
-      </w:r>
-      <w:proofErr w:type="spellEnd"/>
-      <w:proofErr w:type="gramEnd"/>
-      <w:r>
-        <w:t xml:space="preserve"> — identical to the seed value Phase 5 decided on. This closes the duplicate dependency carried since Phase 2.</w:t>
+        <w:t>The live duplicate-referral check is now real: after seeding Arthur Reed’s pre-existing active Cardiology referral, querying OpenMRS returns existing_referral_status = active:Cardiology — identical to the seed value Phase 5 decided on. This closes the duplicate dependency carried since Phase 2.</w:t>
       </w:r>
     </w:p>
     <w:p>
@@ -9065,31 +7219,7 @@
         <w:spacing w:after="60"/>
       </w:pPr>
       <w:r>
-        <w:t>services/</w:t>
-      </w:r>
-      <w:proofErr w:type="spellStart"/>
-      <w:r>
-        <w:t>openmrs</w:t>
-      </w:r>
-      <w:proofErr w:type="spellEnd"/>
-      <w:r>
-        <w:t>-workflow/</w:t>
-      </w:r>
-      <w:proofErr w:type="spellStart"/>
-      <w:r>
-        <w:t>src</w:t>
-      </w:r>
-      <w:proofErr w:type="spellEnd"/>
-      <w:r>
-        <w:t>/ — openmrs_client.py (</w:t>
-      </w:r>
-      <w:proofErr w:type="spellStart"/>
-      <w:r>
-        <w:t>stdlib</w:t>
-      </w:r>
-      <w:proofErr w:type="spellEnd"/>
-      <w:r>
-        <w:t xml:space="preserve"> REST client + readiness gate), metadata.py (encounter type + concept setup), referral_writer.py (create / verify / duplicate-query / idempotent write).</w:t>
+        <w:t>services/openmrs-workflow/src/ — openmrs_client.py (stdlib REST client + readiness gate), metadata.py (encounter type + concept setup), referral_writer.py (create / verify / duplicate-query / idempotent write).</w:t>
       </w:r>
     </w:p>
     <w:p>
@@ -9115,15 +7245,7 @@
         <w:spacing w:after="60"/>
       </w:pPr>
       <w:r>
-        <w:t>docs/technical/openmrs-referral-workflow.md (the concrete update path — encounter/</w:t>
-      </w:r>
-      <w:proofErr w:type="spellStart"/>
-      <w:r>
-        <w:t>obs</w:t>
-      </w:r>
-      <w:proofErr w:type="spellEnd"/>
-      <w:r>
-        <w:t xml:space="preserve"> shapes, REST calls, queries) and docs/testing/phase6-acceptance.md (acceptance evidence).</w:t>
+        <w:t>docs/technical/openmrs-referral-workflow.md (the concrete update path — encounter/obs shapes, REST calls, queries) and docs/testing/phase6-acceptance.md (acceptance evidence).</w:t>
       </w:r>
     </w:p>
     <w:p>
@@ -9144,57 +7266,20 @@
         <w:spacing w:after="60"/>
       </w:pPr>
       <w:r>
-        <w:t xml:space="preserve">docker compose -f </w:t>
-      </w:r>
-      <w:proofErr w:type="spellStart"/>
-      <w:r>
-        <w:t>openmrs</w:t>
-      </w:r>
-      <w:proofErr w:type="spellEnd"/>
-      <w:r>
-        <w:t>-setup/docker-</w:t>
-      </w:r>
-      <w:proofErr w:type="spellStart"/>
-      <w:r>
-        <w:t>compose.yml</w:t>
-      </w:r>
-      <w:proofErr w:type="spellEnd"/>
-      <w:r>
-        <w:t xml:space="preserve"> up -</w:t>
-      </w:r>
-      <w:proofErr w:type="gramStart"/>
-      <w:r>
-        <w:t>d  (</w:t>
-      </w:r>
-      <w:proofErr w:type="spellStart"/>
-      <w:proofErr w:type="gramEnd"/>
-      <w:r>
-        <w:t>OpenMRS</w:t>
-      </w:r>
-      <w:proofErr w:type="spellEnd"/>
-      <w:r>
-        <w:t xml:space="preserve"> must be authenticated-ready)</w:t>
-      </w:r>
-    </w:p>
-    <w:p>
-      <w:pPr>
-        <w:pStyle w:val="ListParagraph"/>
-        <w:numPr>
-          <w:ilvl w:val="0"/>
-          <w:numId w:val="3"/>
-        </w:numPr>
-        <w:spacing w:after="60"/>
-      </w:pPr>
-      <w:r>
-        <w:t>cd services/</w:t>
-      </w:r>
-      <w:proofErr w:type="spellStart"/>
-      <w:r>
-        <w:t>openmrs</w:t>
-      </w:r>
-      <w:proofErr w:type="spellEnd"/>
-      <w:r>
-        <w:t>-workflow; python setup_referral_metadata.py (encounter type + concepts, idempotent).</w:t>
+        <w:t>docker compose -f openmrs-setup/docker-compose.yml up -d  (OpenMRS must be authenticated-ready)</w:t>
+      </w:r>
+    </w:p>
+    <w:p>
+      <w:pPr>
+        <w:pStyle w:val="ListParagraph"/>
+        <w:numPr>
+          <w:ilvl w:val="0"/>
+          <w:numId w:val="3"/>
+        </w:numPr>
+        <w:spacing w:after="60"/>
+      </w:pPr>
+      <w:r>
+        <w:t>cd services/openmrs-workflow; python setup_referral_metadata.py (encounter type + concepts, idempotent).</w:t>
       </w:r>
     </w:p>
     <w:p>
@@ -9266,22 +7351,9 @@
         </w:numPr>
         <w:spacing w:after="60"/>
       </w:pPr>
-      <w:proofErr w:type="spellStart"/>
       <w:r>
         <w:lastRenderedPageBreak/>
-        <w:t>find_active_</w:t>
-      </w:r>
-      <w:proofErr w:type="gramStart"/>
-      <w:r>
-        <w:t>referrals</w:t>
-      </w:r>
-      <w:proofErr w:type="spellEnd"/>
-      <w:r>
-        <w:t>(</w:t>
-      </w:r>
-      <w:proofErr w:type="gramEnd"/>
-      <w:r>
-        <w:t>Reed) returns Cardiology, so the live duplicate check sees REF-007’s collision — the same fact Phase 5 decided on, now proven live.</w:t>
+        <w:t>find_active_referrals(Reed) returns Cardiology, so the live duplicate check sees REF-007’s collision — the same fact Phase 5 decided on, now proven live.</w:t>
       </w:r>
     </w:p>
     <w:p>
@@ -9315,23 +7387,7 @@
         <w:spacing w:after="60"/>
       </w:pPr>
       <w:r>
-        <w:t xml:space="preserve">The </w:t>
-      </w:r>
-      <w:proofErr w:type="spellStart"/>
-      <w:r>
-        <w:t>OpenMRS</w:t>
-      </w:r>
-      <w:proofErr w:type="spellEnd"/>
-      <w:r>
-        <w:t xml:space="preserve"> SPA showing Oliver Bennett’s new Referral encounter (http://localhost/openmrs/spa), and a re-read GET /encounter/&lt;</w:t>
-      </w:r>
-      <w:proofErr w:type="spellStart"/>
-      <w:r>
-        <w:t>uuid</w:t>
-      </w:r>
-      <w:proofErr w:type="spellEnd"/>
-      <w:r>
-        <w:t>&gt; JSON showing the observations round-trip.</w:t>
+        <w:t>The OpenMRS SPA showing Oliver Bennett’s new Referral encounter (http://localhost/openmrs/spa), and a re-read GET /encounter/&lt;uuid&gt; JSON showing the observations round-trip.</w:t>
       </w:r>
     </w:p>
     <w:p>
@@ -9347,65 +7403,7 @@
         <w:spacing w:after="120"/>
       </w:pPr>
       <w:r>
-        <w:t>services/</w:t>
-      </w:r>
-      <w:proofErr w:type="spellStart"/>
-      <w:r>
-        <w:t>openmrs</w:t>
-      </w:r>
-      <w:proofErr w:type="spellEnd"/>
-      <w:r>
-        <w:t xml:space="preserve">-workflow/ (source, CLIs, acceptance harness, README), docs/technical/openmrs-referral-workflow.md, docs/testing/phase6-acceptance.md, </w:t>
-      </w:r>
-      <w:proofErr w:type="gramStart"/>
-      <w:r>
-        <w:t>the .</w:t>
-      </w:r>
-      <w:proofErr w:type="spellStart"/>
-      <w:r>
-        <w:t>gitignore</w:t>
-      </w:r>
-      <w:proofErr w:type="spellEnd"/>
-      <w:proofErr w:type="gramEnd"/>
-      <w:r>
-        <w:t xml:space="preserve"> rule + config</w:t>
-      </w:r>
-      <w:proofErr w:type="gramStart"/>
-      <w:r>
-        <w:t>/.</w:t>
-      </w:r>
-      <w:proofErr w:type="spellStart"/>
-      <w:r>
-        <w:t>gitkeep</w:t>
-      </w:r>
-      <w:proofErr w:type="spellEnd"/>
-      <w:proofErr w:type="gramEnd"/>
-      <w:r>
-        <w:t>, the README status table, and this build log. The generated config/referral-</w:t>
-      </w:r>
-      <w:proofErr w:type="spellStart"/>
-      <w:r>
-        <w:t>metadata.json</w:t>
-      </w:r>
-      <w:proofErr w:type="spellEnd"/>
-      <w:r>
-        <w:t xml:space="preserve"> is a </w:t>
-      </w:r>
-      <w:proofErr w:type="spellStart"/>
-      <w:r>
-        <w:t>gitignored</w:t>
-      </w:r>
-      <w:proofErr w:type="spellEnd"/>
-      <w:r>
-        <w:t xml:space="preserve">, environment-specific artefact; the created </w:t>
-      </w:r>
-      <w:proofErr w:type="spellStart"/>
-      <w:r>
-        <w:t>OpenMRS</w:t>
-      </w:r>
-      <w:proofErr w:type="spellEnd"/>
-      <w:r>
-        <w:t xml:space="preserve"> records live in the docker volume, not the repo.</w:t>
+        <w:t>services/openmrs-workflow/ (source, CLIs, acceptance harness, README), docs/technical/openmrs-referral-workflow.md, docs/testing/phase6-acceptance.md, the .gitignore rule + config/.gitkeep, the README status table, and this build log. The generated config/referral-metadata.json is a gitignored, environment-specific artefact; the created OpenMRS records live in the docker volume, not the repo.</w:t>
       </w:r>
     </w:p>
     <w:p>
@@ -9434,8 +7432,6 @@
         <w:pStyle w:val="Heading1"/>
       </w:pPr>
       <w:bookmarkStart w:id="11" w:name="_Toc232111795"/>
-      <w:proofErr w:type="spellStart"/>
-      <w:proofErr w:type="spellEnd"/>
       <w:bookmarkEnd w:id="11"/>
       <w:r>
         <w:lastRenderedPageBreak/>
@@ -9459,10 +7455,6 @@
         </w:numPr>
         <w:spacing w:after="60"/>
       </w:pPr>
-      <w:proofErr w:type="spellStart"/>
-      <w:proofErr w:type="spellEnd"/>
-      <w:proofErr w:type="spellStart"/>
-      <w:proofErr w:type="spellEnd"/>
       <w:r>
         <w:t xml:space="preserve">The buildable UiPath design that turns the Phase 4 (extraction), Phase 5 (decision) and Phase 6 (OpenMRS write/verify) services into a Dispatcher + REFramework Performer. No new business logic — Phase 8 is pure orchestration of services already built and tested.</w:t>
       </w:r>
@@ -9476,10 +7468,6 @@
         </w:numPr>
         <w:spacing w:after="60"/>
       </w:pPr>
-      <w:proofErr w:type="spellStart"/>
-      <w:proofErr w:type="spellEnd"/>
-      <w:proofErr w:type="spellStart"/>
-      <w:proofErr w:type="spellEnd"/>
       <w:r>
         <w:t xml:space="preserve">A Dispatcher that enumerates the 15 synthetic referral files and pushes one queue item each, with Reference = REF-NNN and a unique-reference constraint so re-running never double-enqueues.</w:t>
       </w:r>
@@ -9493,10 +7481,6 @@
         </w:numPr>
         <w:spacing w:after="60"/>
       </w:pPr>
-      <w:proofErr w:type="spellStart"/>
-      <w:proofErr w:type="spellEnd"/>
-      <w:proofErr w:type="spellStart"/>
-      <w:proofErr w:type="spellEnd"/>
       <w:r>
         <w:t xml:space="preserve">A per-transaction Process flow: POST /extract → save extraction JSON, POST /decide → save decision JSON, then branch on bot_decision to OpenMRS create+verify, the human-review store, or an exception.</w:t>
       </w:r>
@@ -9510,10 +7494,6 @@
         </w:numPr>
         <w:spacing w:after="60"/>
       </w:pPr>
-      <w:proofErr w:type="spellStart"/>
-      <w:proofErr w:type="spellEnd"/>
-      <w:proofErr w:type="spellStart"/>
-      <w:proofErr w:type="spellEnd"/>
       <w:r>
         <w:t xml:space="preserve">A real REFramework Config.xlsx (Settings / Constants / Assets) plus the queue-item schema. The only secret the bot holds is the OpenMRS credential (Orchestrator Credential asset); the LLM key stays inside the Phase 4 service, unreachable from UiPath.</w:t>
       </w:r>
@@ -9535,10 +7515,6 @@
         </w:numPr>
         <w:spacing w:after="60"/>
       </w:pPr>
-      <w:proofErr w:type="spellStart"/>
-      <w:proofErr w:type="spellEnd"/>
-      <w:proofErr w:type="spellStart"/>
-      <w:proofErr w:type="spellEnd"/>
       <w:r>
         <w:t xml:space="preserve">AUTO_CREATE_REFERRAL_RECORD → queue item Successful → file to processed/.</w:t>
       </w:r>
@@ -9552,10 +7528,6 @@
         </w:numPr>
         <w:spacing w:after="60"/>
       </w:pPr>
-      <w:proofErr w:type="spellStart"/>
-      <w:proofErr w:type="spellEnd"/>
-      <w:proofErr w:type="spellStart"/>
-      <w:proofErr w:type="spellEnd"/>
       <w:r>
         <w:t xml:space="preserve">HUMAN_REVIEW_REQUIRED → queue item Successful → file to review/. Routing a risky/ambiguous/urgent/duplicate/incomplete case to a human is the designed safe outcome, NOT an exception.</w:t>
       </w:r>
@@ -9569,10 +7541,6 @@
         </w:numPr>
         <w:spacing w:after="60"/>
       </w:pPr>
-      <w:proofErr w:type="spellStart"/>
-      <w:proofErr w:type="spellEnd"/>
-      <w:proofErr w:type="spellStart"/>
-      <w:proofErr w:type="spellEnd"/>
       <w:r>
         <w:t xml:space="preserve">BUSINESS_EXCEPTION (REF-014, not a referral) → BusinessRuleException → Failed (Business), no retry → failed/.</w:t>
       </w:r>
@@ -9586,10 +7554,6 @@
         </w:numPr>
         <w:spacing w:after="60"/>
       </w:pPr>
-      <w:proofErr w:type="spellStart"/>
-      <w:proofErr w:type="spellEnd"/>
-      <w:proofErr w:type="spellStart"/>
-      <w:proofErr w:type="spellEnd"/>
       <w:r>
         <w:t xml:space="preserve">SYSTEM_EXCEPTION (REF-015, corrupt PDF) and any transient service/OpenMRS infra failure → Exception → Failed (Application), retried then screenshot + escalate → failed/.</w:t>
       </w:r>
@@ -9611,10 +7575,6 @@
         </w:numPr>
         <w:spacing w:after="60"/>
       </w:pPr>
-      <w:proofErr w:type="spellStart"/>
-      <w:proofErr w:type="spellEnd"/>
-      <w:proofErr w:type="spellStart"/>
-      <w:proofErr w:type="spellEnd"/>
       <w:r>
         <w:t xml:space="preserve">uipath/design/reframework-design-spec.md — the full build contract: project identity, Dispatcher, queue schema, Config workbook, Assets/credentials, REFramework state machine, Process.xaml flow, the OpenMRS write/verify sub-sequence, BE/SE policy, idempotency, and the 15-scenario traceability matrix.</w:t>
       </w:r>
@@ -9628,10 +7588,6 @@
         </w:numPr>
         <w:spacing w:after="60"/>
       </w:pPr>
-      <w:proofErr w:type="spellStart"/>
-      <w:proofErr w:type="spellEnd"/>
-      <w:proofErr w:type="spellStart"/>
-      <w:proofErr w:type="spellEnd"/>
       <w:r>
         <w:t xml:space="preserve">uipath/design/Config.xlsx — the REFramework Config workbook (Settings / Constants / Assets) the Performer ships with.</w:t>
       </w:r>
@@ -9645,10 +7601,6 @@
         </w:numPr>
         <w:spacing w:after="60"/>
       </w:pPr>
-      <w:proofErr w:type="spellStart"/>
-      <w:proofErr w:type="spellEnd"/>
-      <w:proofErr w:type="spellStart"/>
-      <w:proofErr w:type="spellEnd"/>
       <w:r>
         <w:t xml:space="preserve">uipath/README.md — pointer for the uipath/ solution area.</w:t>
       </w:r>
@@ -9662,10 +7614,6 @@
         </w:numPr>
         <w:spacing w:after="60"/>
       </w:pPr>
-      <w:proofErr w:type="spellStart"/>
-      <w:proofErr w:type="spellEnd"/>
-      <w:proofErr w:type="spellStart"/>
-      <w:proofErr w:type="spellEnd"/>
       <w:r>
         <w:t xml:space="preserve">docs/testing/phase7-acceptance.md — the design-review acceptance record (12/12).</w:t>
       </w:r>
@@ -9687,10 +7635,6 @@
         </w:numPr>
         <w:spacing w:after="60"/>
       </w:pPr>
-      <w:proofErr w:type="spellStart"/>
-      <w:proofErr w:type="spellEnd"/>
-      <w:proofErr w:type="spellStart"/>
-      <w:proofErr w:type="spellEnd"/>
       <w:r>
         <w:t xml:space="preserve">12/12 design-review checks pass (see phase7-acceptance.md). The build is fully specified from already-tested services — buildable from the spec, with BE and SE separated.</w:t>
       </w:r>
@@ -9704,10 +7648,6 @@
         </w:numPr>
         <w:spacing w:after="60"/>
       </w:pPr>
-      <w:proofErr w:type="spellStart"/>
-      <w:proofErr w:type="spellEnd"/>
-      <w:proofErr w:type="spellStart"/>
-      <w:proofErr w:type="spellEnd"/>
       <w:r>
         <w:t xml:space="preserve">The Phase 8 test matrix is fixed: 3 AUTO_CREATE → processed, 10 HUMAN_REVIEW → review, 1 Business-Exception failed, 1 System-Exception failed.</w:t>
       </w:r>
@@ -9729,10 +7669,6 @@
         </w:numPr>
         <w:spacing w:after="60"/>
       </w:pPr>
-      <w:proofErr w:type="spellStart"/>
-      <w:proofErr w:type="spellEnd"/>
-      <w:proofErr w:type="spellStart"/>
-      <w:proofErr w:type="spellEnd"/>
       <w:r>
         <w:t xml:space="preserve">The BE/SE policy table (spec §8) — the clearest single artefact of REFramework exception thinking for an interviewer.</w:t>
       </w:r>
@@ -9746,10 +7682,6 @@
         </w:numPr>
         <w:spacing w:after="60"/>
       </w:pPr>
-      <w:proofErr w:type="spellStart"/>
-      <w:proofErr w:type="spellEnd"/>
-      <w:proofErr w:type="spellStart"/>
-      <w:proofErr w:type="spellEnd"/>
       <w:r>
         <w:t xml:space="preserve">The Config.xlsx Settings sheet.</w:t>
       </w:r>
@@ -9763,10 +7695,6 @@
         </w:numPr>
         <w:spacing w:after="60"/>
       </w:pPr>
-      <w:proofErr w:type="spellStart"/>
-      <w:proofErr w:type="spellEnd"/>
-      <w:proofErr w:type="spellStart"/>
-      <w:proofErr w:type="spellEnd"/>
       <w:r>
         <w:t xml:space="preserve">The state machine / Process flow (spec §6–7).</w:t>
       </w:r>
@@ -9783,22 +7711,6 @@
       <w:pPr>
         <w:spacing w:after="120"/>
       </w:pPr>
-      <w:proofErr w:type="spellStart"/>
-      <w:proofErr w:type="spellEnd"/>
-      <w:proofErr w:type="gramStart"/>
-      <w:proofErr w:type="spellStart"/>
-      <w:proofErr w:type="spellEnd"/>
-      <w:proofErr w:type="gramEnd"/>
-      <w:proofErr w:type="gramStart"/>
-      <w:proofErr w:type="spellStart"/>
-      <w:proofErr w:type="spellEnd"/>
-      <w:proofErr w:type="gramEnd"/>
-      <w:proofErr w:type="spellStart"/>
-      <w:proofErr w:type="spellEnd"/>
-      <w:proofErr w:type="spellStart"/>
-      <w:proofErr w:type="spellEnd"/>
-      <w:proofErr w:type="spellStart"/>
-      <w:proofErr w:type="spellEnd"/>
       <w:r>
         <w:t xml:space="preserve">uipath/ (design spec, Config.xlsx, README), docs/testing/phase7-acceptance.md, the updated README.md status table, and this build log.</w:t>
       </w:r>
@@ -9815,22 +7727,6 @@
       <w:pPr>
         <w:spacing w:after="120"/>
       </w:pPr>
-      <w:proofErr w:type="spellStart"/>
-      <w:proofErr w:type="spellEnd"/>
-      <w:proofErr w:type="gramStart"/>
-      <w:proofErr w:type="spellStart"/>
-      <w:proofErr w:type="spellEnd"/>
-      <w:proofErr w:type="gramEnd"/>
-      <w:proofErr w:type="gramStart"/>
-      <w:proofErr w:type="spellStart"/>
-      <w:proofErr w:type="spellEnd"/>
-      <w:proofErr w:type="gramEnd"/>
-      <w:proofErr w:type="spellStart"/>
-      <w:proofErr w:type="spellEnd"/>
-      <w:proofErr w:type="spellStart"/>
-      <w:proofErr w:type="spellEnd"/>
-      <w:proofErr w:type="spellStart"/>
-      <w:proofErr w:type="spellEnd"/>
       <w:r>
         <w:t xml:space="preserve">UiPath build: implement the Dispatcher and REFramework Performer from the spec, set up the NHS_Referrals queue and the NHS_OpenMRS_Credential asset, and run the matrix — clean → OpenMRS, risky → review, duplicate detected, Business vs System exceptions distinct.</w:t>
       </w:r>
@@ -9840,8 +7736,6 @@
         <w:pStyle w:val="Heading1"/>
       </w:pPr>
       <w:bookmarkStart w:id="11" w:name="_Toc232111795"/>
-      <w:proofErr w:type="spellStart"/>
-      <w:proofErr w:type="spellEnd"/>
       <w:bookmarkEnd w:id="11"/>
       <w:r>
         <w:lastRenderedPageBreak/>
@@ -10176,18 +8070,305 @@
       <w:pPr>
         <w:pStyle w:val="Heading1"/>
       </w:pPr>
+      <w:r>
+        <w:t xml:space="preserve">Phase 9 — Human-in-the-Loop Review (live run)</w:t>
+      </w:r>
+    </w:p>
+    <w:p>
+      <w:r>
+        <w:t xml:space="preserve">Status: COMPLETE (2026-06-15). The 10 referrals the bot routed to human review in Phase 8 now live in a real SQLite store. A clinician’s decision (APPROVE / REJECT / AMEND), with their identity and a rationale, was recorded against each, and a UiPath ReviewResolver process re-read those decisions and changed the final outcome: 6 referrals were created in OpenMRS (verified by re-read) and 4 were rejected with no record. Every action is audited and re-running is idempotent. Self-contained acceptance gate: 8/8. This delivers Definition-of-Done item 5 (a human review decision can be recorded and changes the final outcome).</w:t>
+      </w:r>
+    </w:p>
+    <w:p>
+      <w:pPr>
+        <w:pStyle w:val="Heading3"/>
+      </w:pPr>
+      <w:r>
+        <w:t xml:space="preserve">What was built</w:t>
+      </w:r>
+    </w:p>
+    <w:p>
+      <w:pPr>
+        <w:pStyle w:val="ListParagraph"/>
+        <w:numPr>
+          <w:ilvl w:val="0"/>
+          <w:numId w:val="2"/>
+        </w:numPr>
+        <w:spacing w:after="80"/>
+      </w:pPr>
+      <w:r>
+        <w:rPr>
+          <w:b/>
+          <w:bCs/>
+        </w:rPr>
+        <w:t xml:space="preserve">services/review-service/ </w:t>
+      </w:r>
+      <w:r>
+        <w:t xml:space="preserve">— the review store and the loop (Python standard library only: sqlite3, http.server, urllib). A real SQLite store at data/review/review-store.sqlite, one row per referral, lifecycle PENDING to DECIDED to RESOLVED (or FAILED). The row itself is the human-decision audit trail: who / what / before / after / when / why.</w:t>
+      </w:r>
+    </w:p>
+    <w:p>
+      <w:pPr>
+        <w:pStyle w:val="ListParagraph"/>
+        <w:numPr>
+          <w:ilvl w:val="0"/>
+          <w:numId w:val="2"/>
+        </w:numPr>
+        <w:spacing w:after="80"/>
+      </w:pPr>
+      <w:r>
+        <w:rPr>
+          <w:b/>
+          <w:bCs/>
+        </w:rPr>
+        <w:t xml:space="preserve">record_decision.py </w:t>
+      </w:r>
+      <w:r>
+        <w:t xml:space="preserve">— the reviewer action. Records APPROVE / REJECT / AMEND with the clinician’s identity and a mandatory rationale. Does not touch OpenMRS.</w:t>
+      </w:r>
+    </w:p>
+    <w:p>
+      <w:pPr>
+        <w:pStyle w:val="ListParagraph"/>
+        <w:numPr>
+          <w:ilvl w:val="0"/>
+          <w:numId w:val="2"/>
+        </w:numPr>
+        <w:spacing w:after="80"/>
+      </w:pPr>
+      <w:r>
+        <w:rPr>
+          <w:b/>
+          <w:bCs/>
+        </w:rPr>
+        <w:t xml:space="preserve">resolve_reviews.py </w:t>
+      </w:r>
+      <w:r>
+        <w:t xml:space="preserve">— the bot re-read. Applies each decision: APPROVE/AMEND create the referral in OpenMRS via the Phase 6 writeback service (:8091); REJECT records nothing. Writes an audit row per outcome. Idempotent.</w:t>
+      </w:r>
+    </w:p>
+    <w:p>
+      <w:pPr>
+        <w:pStyle w:val="ListParagraph"/>
+        <w:numPr>
+          <w:ilvl w:val="0"/>
+          <w:numId w:val="2"/>
+        </w:numPr>
+        <w:spacing w:after="80"/>
+      </w:pPr>
+      <w:r>
+        <w:rPr>
+          <w:b/>
+          <w:bCs/>
+        </w:rPr>
+        <w:t xml:space="preserve">app.py + init_store.py + validate_acceptance.py </w:t>
+      </w:r>
+      <w:r>
+        <w:t xml:space="preserve">— an HTTP service on :8092 (/health, /reviews, /reviews/&lt;id&gt;/decision, /resolve) matching the other three services so the UiPath process can drive it; the CSV-to-SQLite ingest; and the self-contained acceptance gate.</w:t>
+      </w:r>
+    </w:p>
+    <w:p>
+      <w:pPr>
+        <w:pStyle w:val="ListParagraph"/>
+        <w:numPr>
+          <w:ilvl w:val="0"/>
+          <w:numId w:val="2"/>
+        </w:numPr>
+        <w:spacing w:after="80"/>
+      </w:pPr>
+      <w:r>
+        <w:rPr>
+          <w:b/>
+          <w:bCs/>
+        </w:rPr>
+        <w:t xml:space="preserve">uipath/NHS.ReferralSafety.ReviewResolver/ </w:t>
+      </w:r>
+      <w:r>
+        <w:t xml:space="preserve">— a UiPath Process (Windows / VB, UiPath.WebAPI.Activities). Main.xaml POSTs /resolve, guards a non-200 response (system throw), deserializes the summary, logs created/rejected/failed, and throws on any failure. Same service-oriented pattern as the Phase 8 performer.</w:t>
+      </w:r>
+    </w:p>
+    <w:p>
+      <w:pPr>
+        <w:pStyle w:val="Heading3"/>
+      </w:pPr>
+      <w:r>
+        <w:t xml:space="preserve">The reviewer worklist and outcomes</w:t>
+      </w:r>
+    </w:p>
+    <w:p>
+      <w:pPr>
+        <w:pStyle w:val="ListParagraph"/>
+        <w:numPr>
+          <w:ilvl w:val="0"/>
+          <w:numId w:val="2"/>
+        </w:numPr>
+        <w:spacing w:after="80"/>
+      </w:pPr>
+      <w:r>
+        <w:rPr>
+          <w:b/>
+          <w:bCs/>
+        </w:rPr>
+        <w:t xml:space="preserve">APPROVE to create (6): </w:t>
+      </w:r>
+      <w:r>
+        <w:t xml:space="preserve">REF-004 Shaw (DOB typo confirmed), REF-005 Hamilton (partial match confirmed), REF-006 Walsh (disambiguated between two candidates), REF-008 Knight (2-week-wait suspected cancer, expedited), REF-009 Cole (safeguarding flagged to lead, referral valid), REF-013 Roberts (AMEND: reviewer supplied the specialty / priority / reason the degraded fax had left blank).</w:t>
+      </w:r>
+    </w:p>
+    <w:p>
+      <w:pPr>
+        <w:pStyle w:val="ListParagraph"/>
+        <w:numPr>
+          <w:ilvl w:val="0"/>
+          <w:numId w:val="2"/>
+        </w:numPr>
+        <w:spacing w:after="80"/>
+      </w:pPr>
+      <w:r>
+        <w:rPr>
+          <w:b/>
+          <w:bCs/>
+        </w:rPr>
+        <w:t xml:space="preserve">REJECT with no record (4): </w:t>
+      </w:r>
+      <w:r>
+        <w:t xml:space="preserve">REF-007 Reed (genuine duplicate of an active Cardiology referral), REF-010 Fernandes and REF-011 Osei (no patient in the EPR), REF-012 Owen (incomplete mandatory fields, returned to GP).</w:t>
+      </w:r>
+    </w:p>
+    <w:p>
+      <w:r>
+        <w:t xml:space="preserve">The decisions genuinely changed the outcome: 6 referrals the bot was not allowed to auto-create were created once a human approved or completed them, and 4 were explicitly closed without a record by human judgement. The AMEND (REF-013) was re-read from OpenMRS afterwards and carried the reviewer’s Dermatology / Routine / reason values that the bot’s extraction had left null.</w:t>
+      </w:r>
+    </w:p>
+    <w:p>
+      <w:pPr>
+        <w:pStyle w:val="Heading3"/>
+      </w:pPr>
+      <w:r>
+        <w:t xml:space="preserve">How to run and test</w:t>
+      </w:r>
+    </w:p>
+    <w:p>
+      <w:pPr>
+        <w:pStyle w:val="ListParagraph"/>
+        <w:numPr>
+          <w:ilvl w:val="0"/>
+          <w:numId w:val="2"/>
+        </w:numPr>
+        <w:spacing w:after="80"/>
+      </w:pPr>
+      <w:r>
+        <w:t xml:space="preserve">Prerequisites: OpenMRS up; writeback service (:8091) and review service (:8092) running; dotnet on PATH.</w:t>
+      </w:r>
+    </w:p>
+    <w:p>
+      <w:pPr>
+        <w:pStyle w:val="ListParagraph"/>
+        <w:numPr>
+          <w:ilvl w:val="0"/>
+          <w:numId w:val="2"/>
+        </w:numPr>
+        <w:spacing w:after="80"/>
+      </w:pPr>
+      <w:r>
+        <w:t xml:space="preserve">cd services/review-service; python init_store.py (10 PENDING from the Phase 8 CSV), then record the worklist with record_decision.py (see its --help).</w:t>
+      </w:r>
+    </w:p>
+    <w:p>
+      <w:pPr>
+        <w:pStyle w:val="ListParagraph"/>
+        <w:numPr>
+          <w:ilvl w:val="0"/>
+          <w:numId w:val="2"/>
+        </w:numPr>
+        <w:spacing w:after="80"/>
+      </w:pPr>
+      <w:r>
+        <w:t xml:space="preserve">Apply it via UiPath: cd uipath/NHS.ReferralSafety.ReviewResolver; uip rpa run --file-path Main.xaml. Self-contained gate: python services/review-service/validate_acceptance.py (8/8).</w:t>
+      </w:r>
+    </w:p>
+    <w:p>
+      <w:pPr>
+        <w:pStyle w:val="Heading3"/>
+      </w:pPr>
+      <w:r>
+        <w:t xml:space="preserve">Results, idempotency, and what to commit</w:t>
+      </w:r>
+    </w:p>
+    <w:p>
+      <w:pPr>
+        <w:pStyle w:val="ListParagraph"/>
+        <w:numPr>
+          <w:ilvl w:val="0"/>
+          <w:numId w:val="2"/>
+        </w:numPr>
+        <w:spacing w:after="80"/>
+      </w:pPr>
+      <w:r>
+        <w:t xml:space="preserve">ReviewResolver live run: Resolved 10 review(s): 6 created in OpenMRS, 4 rejected (no record), 0 failed; pending remaining 0. Store after: 10 RESOLVED. Audit log gained 10 REVIEW_RESOLVED_{APPROVE|AMEND|REJECT} rows with reviewer + NHS number + encounter UUID (creates) or rationale (rejections). Acceptance gate: 8/8.</w:t>
+      </w:r>
+    </w:p>
+    <w:p>
+      <w:pPr>
+        <w:pStyle w:val="ListParagraph"/>
+        <w:numPr>
+          <w:ilvl w:val="0"/>
+          <w:numId w:val="2"/>
+        </w:numPr>
+        <w:spacing w:after="80"/>
+      </w:pPr>
+      <w:r>
+        <w:rPr>
+          <w:b/>
+          <w:bCs/>
+        </w:rPr>
+        <w:t xml:space="preserve">Idempotency: </w:t>
+      </w:r>
+      <w:r>
+        <w:t xml:space="preserve">re-running the ReviewResolver actions 0 reviews (all RESOLVED), and the writeback is keyed on REF-NNN, so no duplicate OpenMRS record is ever created.</w:t>
+      </w:r>
+    </w:p>
+    <w:p>
+      <w:pPr>
+        <w:pStyle w:val="ListParagraph"/>
+        <w:numPr>
+          <w:ilvl w:val="0"/>
+          <w:numId w:val="2"/>
+        </w:numPr>
+        <w:spacing w:after="80"/>
+      </w:pPr>
+      <w:r>
+        <w:rPr>
+          <w:b/>
+          <w:bCs/>
+        </w:rPr>
+        <w:t xml:space="preserve">Commit: </w:t>
+      </w:r>
+      <w:r>
+        <w:t xml:space="preserve">services/review-service/, uipath/NHS.ReferralSafety.ReviewResolver/, docs/testing/phase9-acceptance.md, and the README / uipath/README phase tables. The SQLite store and runtime data stay gitignored.</w:t>
+      </w:r>
+    </w:p>
+    <w:p>
+      <w:pPr>
+        <w:pStyle w:val="Heading3"/>
+      </w:pPr>
+      <w:r>
+        <w:t xml:space="preserve">Next — Phase 10</w:t>
+      </w:r>
+    </w:p>
+    <w:p>
+      <w:r>
+        <w:t xml:space="preserve">Reporting + dashboard over the real Phase 8 + Phase 9 data (auto-created, routed-to-review, reviewer outcomes, exceptions) with portfolio screenshots.</w:t>
+      </w:r>
+    </w:p>
+    <w:p>
+      <w:pPr>
+        <w:pStyle w:val="Heading1"/>
+      </w:pPr>
       <w:bookmarkStart w:id="12" w:name="_Toc232111796"/>
       <w:r>
         <w:lastRenderedPageBreak/>
-        <w:t xml:space="preserve">Appendix A — Key </w:t>
-      </w:r>
-      <w:proofErr w:type="spellStart"/>
-      <w:r>
-        <w:t>OpenMRS</w:t>
-      </w:r>
-      <w:proofErr w:type="spellEnd"/>
-      <w:r>
-        <w:t xml:space="preserve"> UUIDs</w:t>
+        <w:t>Appendix A — Key OpenMRS UUIDs</w:t>
       </w:r>
       <w:bookmarkEnd w:id="12"/>
     </w:p>
@@ -10365,21 +8546,12 @@
             </w:tcMar>
           </w:tcPr>
           <w:p>
-            <w:proofErr w:type="spellStart"/>
-            <w:r>
-              <w:rPr>
-                <w:sz w:val="20"/>
-                <w:szCs w:val="20"/>
-              </w:rPr>
-              <w:t>OpenMRS</w:t>
-            </w:r>
-            <w:proofErr w:type="spellEnd"/>
-            <w:r>
-              <w:rPr>
-                <w:sz w:val="20"/>
-                <w:szCs w:val="20"/>
-              </w:rPr>
-              <w:t xml:space="preserve"> ID (required identifier type)</w:t>
+            <w:r>
+              <w:rPr>
+                <w:sz w:val="20"/>
+                <w:szCs w:val="20"/>
+              </w:rPr>
+              <w:t>OpenMRS ID (required identifier type)</w:t>
             </w:r>
           </w:p>
         </w:tc>
@@ -10434,37 +8606,12 @@
             </w:tcMar>
           </w:tcPr>
           <w:p>
-            <w:proofErr w:type="spellStart"/>
-            <w:r>
-              <w:rPr>
-                <w:sz w:val="20"/>
-                <w:szCs w:val="20"/>
-              </w:rPr>
-              <w:t>idgen</w:t>
-            </w:r>
-            <w:proofErr w:type="spellEnd"/>
-            <w:r>
-              <w:rPr>
-                <w:sz w:val="20"/>
-                <w:szCs w:val="20"/>
-              </w:rPr>
-              <w:t xml:space="preserve"> source (Generator for </w:t>
-            </w:r>
-            <w:proofErr w:type="spellStart"/>
-            <w:r>
-              <w:rPr>
-                <w:sz w:val="20"/>
-                <w:szCs w:val="20"/>
-              </w:rPr>
-              <w:t>OpenMRS</w:t>
-            </w:r>
-            <w:proofErr w:type="spellEnd"/>
-            <w:r>
-              <w:rPr>
-                <w:sz w:val="20"/>
-                <w:szCs w:val="20"/>
-              </w:rPr>
-              <w:t xml:space="preserve"> ID)</w:t>
+            <w:r>
+              <w:rPr>
+                <w:sz w:val="20"/>
+                <w:szCs w:val="20"/>
+              </w:rPr>
+              <w:t>idgen source (Generator for OpenMRS ID)</w:t>
             </w:r>
           </w:p>
         </w:tc>
@@ -10870,7 +9017,6 @@
             </w:tcMar>
           </w:tcPr>
           <w:p>
-            <w:proofErr w:type="spellStart"/>
             <w:r>
               <w:rPr>
                 <w:sz w:val="20"/>
@@ -10878,7 +9024,6 @@
               </w:rPr>
               <w:t>dob_mismatch_target</w:t>
             </w:r>
-            <w:proofErr w:type="spellEnd"/>
           </w:p>
         </w:tc>
         <w:tc>
@@ -10958,7 +9103,6 @@
             </w:tcMar>
           </w:tcPr>
           <w:p>
-            <w:proofErr w:type="spellStart"/>
             <w:r>
               <w:rPr>
                 <w:sz w:val="20"/>
@@ -10966,7 +9110,6 @@
               </w:rPr>
               <w:t>partial_match_target</w:t>
             </w:r>
-            <w:proofErr w:type="spellEnd"/>
           </w:p>
         </w:tc>
         <w:tc>
@@ -11046,37 +9189,12 @@
             </w:tcMar>
           </w:tcPr>
           <w:p>
-            <w:proofErr w:type="spellStart"/>
-            <w:r>
-              <w:rPr>
-                <w:sz w:val="20"/>
-                <w:szCs w:val="20"/>
-              </w:rPr>
-              <w:t>multiple_candidate</w:t>
-            </w:r>
-            <w:proofErr w:type="spellEnd"/>
-            <w:r>
-              <w:rPr>
-                <w:sz w:val="20"/>
-                <w:szCs w:val="20"/>
-              </w:rPr>
-              <w:t xml:space="preserve"> (same </w:t>
-            </w:r>
-            <w:proofErr w:type="spellStart"/>
-            <w:r>
-              <w:rPr>
-                <w:sz w:val="20"/>
-                <w:szCs w:val="20"/>
-              </w:rPr>
-              <w:t>surname+DOB</w:t>
-            </w:r>
-            <w:proofErr w:type="spellEnd"/>
-            <w:r>
-              <w:rPr>
-                <w:sz w:val="20"/>
-                <w:szCs w:val="20"/>
-              </w:rPr>
-              <w:t>)</w:t>
+            <w:r>
+              <w:rPr>
+                <w:sz w:val="20"/>
+                <w:szCs w:val="20"/>
+              </w:rPr>
+              <w:t>multiple_candidate (same surname+DOB)</w:t>
             </w:r>
           </w:p>
         </w:tc>
@@ -11157,7 +9275,6 @@
             </w:tcMar>
           </w:tcPr>
           <w:p>
-            <w:proofErr w:type="spellStart"/>
             <w:r>
               <w:rPr>
                 <w:sz w:val="20"/>
@@ -11165,7 +9282,6 @@
               </w:rPr>
               <w:t>duplicate_target</w:t>
             </w:r>
-            <w:proofErr w:type="spellEnd"/>
           </w:p>
         </w:tc>
         <w:tc>
@@ -11245,37 +9361,12 @@
             </w:tcMar>
           </w:tcPr>
           <w:p>
-            <w:proofErr w:type="spellStart"/>
-            <w:r>
-              <w:rPr>
-                <w:sz w:val="20"/>
-                <w:szCs w:val="20"/>
-              </w:rPr>
-              <w:t>no_match</w:t>
-            </w:r>
-            <w:proofErr w:type="spellEnd"/>
-            <w:r>
-              <w:rPr>
-                <w:sz w:val="20"/>
-                <w:szCs w:val="20"/>
-              </w:rPr>
-              <w:t xml:space="preserve"> (reserved, NOT in </w:t>
-            </w:r>
-            <w:proofErr w:type="spellStart"/>
-            <w:r>
-              <w:rPr>
-                <w:sz w:val="20"/>
-                <w:szCs w:val="20"/>
-              </w:rPr>
-              <w:t>OpenMRS</w:t>
-            </w:r>
-            <w:proofErr w:type="spellEnd"/>
-            <w:r>
-              <w:rPr>
-                <w:sz w:val="20"/>
-                <w:szCs w:val="20"/>
-              </w:rPr>
-              <w:t>)</w:t>
+            <w:r>
+              <w:rPr>
+                <w:sz w:val="20"/>
+                <w:szCs w:val="20"/>
+              </w:rPr>
+              <w:t>no_match (reserved, NOT in OpenMRS)</w:t>
             </w:r>
           </w:p>
         </w:tc>
@@ -11605,21 +9696,12 @@
             </w:tcMar>
           </w:tcPr>
           <w:p>
-            <w:proofErr w:type="spellStart"/>
-            <w:r>
-              <w:rPr>
-                <w:sz w:val="20"/>
-                <w:szCs w:val="20"/>
-              </w:rPr>
-              <w:t>OpenMRS</w:t>
-            </w:r>
-            <w:proofErr w:type="spellEnd"/>
-            <w:r>
-              <w:rPr>
-                <w:sz w:val="20"/>
-                <w:szCs w:val="20"/>
-              </w:rPr>
-              <w:t xml:space="preserve"> local setup</w:t>
+            <w:r>
+              <w:rPr>
+                <w:sz w:val="20"/>
+                <w:szCs w:val="20"/>
+              </w:rPr>
+              <w:t>OpenMRS local setup</w:t>
             </w:r>
           </w:p>
         </w:tc>
@@ -12044,37 +10126,12 @@
             </w:tcMar>
           </w:tcPr>
           <w:p>
-            <w:proofErr w:type="spellStart"/>
-            <w:r>
-              <w:rPr>
-                <w:sz w:val="20"/>
-                <w:szCs w:val="20"/>
-              </w:rPr>
-              <w:t>OpenMRS</w:t>
-            </w:r>
-            <w:proofErr w:type="spellEnd"/>
-            <w:r>
-              <w:rPr>
-                <w:sz w:val="20"/>
-                <w:szCs w:val="20"/>
-              </w:rPr>
-              <w:t xml:space="preserve"> workflow mapping (Referral encounter/</w:t>
-            </w:r>
-            <w:proofErr w:type="spellStart"/>
-            <w:r>
-              <w:rPr>
-                <w:sz w:val="20"/>
-                <w:szCs w:val="20"/>
-              </w:rPr>
-              <w:t>obs</w:t>
-            </w:r>
-            <w:proofErr w:type="spellEnd"/>
-            <w:r>
-              <w:rPr>
-                <w:sz w:val="20"/>
-                <w:szCs w:val="20"/>
-              </w:rPr>
-              <w:t>)</w:t>
+            <w:r>
+              <w:rPr>
+                <w:sz w:val="20"/>
+                <w:szCs w:val="20"/>
+              </w:rPr>
+              <w:t>OpenMRS workflow mapping (Referral encounter/obs)</w:t>
             </w:r>
           </w:p>
         </w:tc>
@@ -12358,7 +10415,7 @@
                 <w:sz w:val="20"/>
                 <w:szCs w:val="20"/>
               </w:rPr>
-              <w:t>⬜ Next</w:t>
+              <w:t>✅ Done</w:t>
             </w:r>
           </w:p>
         </w:tc>

</xml_diff>

<commit_message>
Add run reporting + portfolio dashboard (Phase 10)
services/reporting/ turns the real Phase 8 + Phase 9 run into an Excel workbook
(Summary + charts, Referrals, Human review, Exceptions, Audit trail) and a
self-contained HTML dashboard (inline SVG, no JS) — every figure derived from the
run artifacts, none hand-typed. Of 15 referrals: 9 created in OpenMRS (3 automated
+ 6 human-approved), 4 rejected at review, 2 exceptions, and 0 auto-created while
carrying a safety flag. Reconciles with the audit log and the Phase 3 oracles;
acceptance gate 8/8.

Also fixes a Phase 9 defect: the resolver wrote audit rows to the shared audit log
regardless of store, so gate replays polluted it. resolve() now takes an audit_log
path (the gate uses a throwaway); the canonical log was restored to 25 rows.
</commit_message>
<xml_diff>
--- a/docs/Build-Progress-Log.docx
+++ b/docs/Build-Progress-Log.docx
@@ -8365,6 +8365,202 @@
       <w:pPr>
         <w:pStyle w:val="Heading1"/>
       </w:pPr>
+      <w:r>
+        <w:t xml:space="preserve">Phase 10 — Reporting + Dashboard</w:t>
+      </w:r>
+    </w:p>
+    <w:p>
+      <w:r>
+        <w:t xml:space="preserve">Status: COMPLETE (2026-06-15). An Excel workbook and a self-contained HTML dashboard are generated entirely from the real Phase 8 + Phase 9 run artifacts — no hand-typed figures. The reporting reconciles with the append-only audit log and the Phase 3 oracles. Headline: of 15 referrals, 9 were created in OpenMRS (3 fully automated + 6 human-approved), 4 were rejected at review, 2 were exceptions, and 0 were auto-created while carrying a safety flag. Self-contained acceptance gate: 8/8. Delivers Definition-of-Done item 9 (Excel report + optional dashboard reflect the real run).</w:t>
+      </w:r>
+    </w:p>
+    <w:p>
+      <w:pPr>
+        <w:pStyle w:val="Heading3"/>
+      </w:pPr>
+      <w:r>
+        <w:t xml:space="preserve">What was built</w:t>
+      </w:r>
+    </w:p>
+    <w:p>
+      <w:pPr>
+        <w:pStyle w:val="ListParagraph"/>
+        <w:numPr>
+          <w:ilvl w:val="0"/>
+          <w:numId w:val="2"/>
+        </w:numPr>
+        <w:spacing w:after="80"/>
+      </w:pPr>
+      <w:r>
+        <w:rPr>
+          <w:b/>
+          <w:bCs/>
+        </w:rPr>
+        <w:t xml:space="preserve">services/reporting/report_model.py </w:t>
+      </w:r>
+      <w:r>
+        <w:t xml:space="preserve">— the single source of truth. Folds the decisions, extractions, the Phase 9 SQLite review store, the audit log and the Phase 3 oracles into one per-referral model plus aggregate counts.</w:t>
+      </w:r>
+    </w:p>
+    <w:p>
+      <w:pPr>
+        <w:pStyle w:val="ListParagraph"/>
+        <w:numPr>
+          <w:ilvl w:val="0"/>
+          <w:numId w:val="2"/>
+        </w:numPr>
+        <w:spacing w:after="80"/>
+      </w:pPr>
+      <w:r>
+        <w:rPr>
+          <w:b/>
+          <w:bCs/>
+        </w:rPr>
+        <w:t xml:space="preserve">build_report.py </w:t>
+      </w:r>
+      <w:r>
+        <w:t xml:space="preserve">— writes reports/referral-safety-report.xlsx (openpyxl): five sheets — Summary (KPI table + outcomes pie + safety-catch bar chart), Referrals, Human review, Exceptions, Audit trail.</w:t>
+      </w:r>
+    </w:p>
+    <w:p>
+      <w:pPr>
+        <w:pStyle w:val="ListParagraph"/>
+        <w:numPr>
+          <w:ilvl w:val="0"/>
+          <w:numId w:val="2"/>
+        </w:numPr>
+        <w:spacing w:after="80"/>
+      </w:pPr>
+      <w:r>
+        <w:rPr>
+          <w:b/>
+          <w:bCs/>
+        </w:rPr>
+        <w:t xml:space="preserve">build_dashboard.py </w:t>
+      </w:r>
+      <w:r>
+        <w:t xml:space="preserve">— writes reports/dashboard.html, a self-contained dashboard (inline CSS + inline SVG donut/bars, no JavaScript, no network) that opens offline and screenshots cleanly. build_all.py runs both; validate_acceptance.py is the gate.</w:t>
+      </w:r>
+    </w:p>
+    <w:p>
+      <w:pPr>
+        <w:pStyle w:val="Heading3"/>
+      </w:pPr>
+      <w:r>
+        <w:t xml:space="preserve">Headline figures (real run) and how to run</w:t>
+      </w:r>
+    </w:p>
+    <w:p>
+      <w:pPr>
+        <w:pStyle w:val="ListParagraph"/>
+        <w:numPr>
+          <w:ilvl w:val="0"/>
+          <w:numId w:val="2"/>
+        </w:numPr>
+        <w:spacing w:after="80"/>
+      </w:pPr>
+      <w:r>
+        <w:t xml:space="preserve">15 referrals: 9 created in OpenMRS (3 automated + 6 human-approved), 10 routed to human review (67%), 4 rejected at review, 2 exceptions (1 business + 1 system), 0 auto-created with a safety flag, 25 audit rows.</w:t>
+      </w:r>
+    </w:p>
+    <w:p>
+      <w:pPr>
+        <w:pStyle w:val="ListParagraph"/>
+        <w:numPr>
+          <w:ilvl w:val="0"/>
+          <w:numId w:val="2"/>
+        </w:numPr>
+        <w:spacing w:after="80"/>
+      </w:pPr>
+      <w:r>
+        <w:t xml:space="preserve">Run: python services/reporting/build_all.py (both artifacts into reports/); python services/reporting/validate_acceptance.py (8/8).</w:t>
+      </w:r>
+    </w:p>
+    <w:p>
+      <w:pPr>
+        <w:pStyle w:val="Heading3"/>
+      </w:pPr>
+      <w:r>
+        <w:t xml:space="preserve">Defect fixed (carried from Phase 9), screenshots, and commit</w:t>
+      </w:r>
+    </w:p>
+    <w:p>
+      <w:pPr>
+        <w:pStyle w:val="ListParagraph"/>
+        <w:numPr>
+          <w:ilvl w:val="0"/>
+          <w:numId w:val="2"/>
+        </w:numPr>
+        <w:spacing w:after="80"/>
+      </w:pPr>
+      <w:r>
+        <w:rPr>
+          <w:b/>
+          <w:bCs/>
+        </w:rPr>
+        <w:t xml:space="preserve">Audit-log fix: </w:t>
+      </w:r>
+      <w:r>
+        <w:t xml:space="preserve">the Phase 9 resolver wrote audit rows to the shared data/audit/audit-log.csv regardless of store, so the gate replays had polluted it. resolve() now takes an audit_log path (gate uses a throwaway); the canonical log was restored to 25 rows before reporting was built on it.</w:t>
+      </w:r>
+    </w:p>
+    <w:p>
+      <w:pPr>
+        <w:pStyle w:val="ListParagraph"/>
+        <w:numPr>
+          <w:ilvl w:val="0"/>
+          <w:numId w:val="2"/>
+        </w:numPr>
+        <w:spacing w:after="80"/>
+      </w:pPr>
+      <w:r>
+        <w:rPr>
+          <w:b/>
+          <w:bCs/>
+        </w:rPr>
+        <w:t xml:space="preserve">Screenshots: </w:t>
+      </w:r>
+      <w:r>
+        <w:t xml:space="preserve">reports/dashboard.html in a browser; the Excel Summary sheet (KPI table + pie + bars); the Excel Audit trail sheet.</w:t>
+      </w:r>
+    </w:p>
+    <w:p>
+      <w:pPr>
+        <w:pStyle w:val="ListParagraph"/>
+        <w:numPr>
+          <w:ilvl w:val="0"/>
+          <w:numId w:val="2"/>
+        </w:numPr>
+        <w:spacing w:after="80"/>
+      </w:pPr>
+      <w:r>
+        <w:rPr>
+          <w:b/>
+          <w:bCs/>
+        </w:rPr>
+        <w:t xml:space="preserve">Commit: </w:t>
+      </w:r>
+      <w:r>
+        <w:t xml:space="preserve">services/reporting/, reports/dashboard.html + reports/README.md, docs/testing/phase10-acceptance.md, README phase table. The .xlsx stays gitignored (regenerable binary).</w:t>
+      </w:r>
+    </w:p>
+    <w:p>
+      <w:pPr>
+        <w:pStyle w:val="Heading3"/>
+      </w:pPr>
+      <w:r>
+        <w:t xml:space="preserve">Next — Phase 11</w:t>
+      </w:r>
+    </w:p>
+    <w:p>
+      <w:r>
+        <w:t xml:space="preserve">Clinical-safety + information-governance documentation pack (DCB0129/0160/DTAC/DPIA-inspired): named hazards, named controls, clearly a simulation.</w:t>
+      </w:r>
+    </w:p>
+    <w:p>
+      <w:pPr>
+        <w:pStyle w:val="Heading1"/>
+      </w:pPr>
       <w:bookmarkStart w:id="12" w:name="_Toc232111796"/>
       <w:r>
         <w:lastRenderedPageBreak/>
@@ -10501,7 +10697,7 @@
                 <w:sz w:val="20"/>
                 <w:szCs w:val="20"/>
               </w:rPr>
-              <w:t>⬜</w:t>
+              <w:t>✅ Done</w:t>
             </w:r>
           </w:p>
         </w:tc>

</xml_diff>

<commit_message>
Add clinical-safety + IG governance pack (Phase 11)
A DCB0129/0160/DTAC/DPIA-inspired pack: a clinical risk management plan, a
12-hazard log (H-01..H-12) where every named control points at the real file or
scenario that implements it, a clinical safety case report, a DPIA, and a DTAC
self-assessment. Clearly a synthetic-data simulation throughout.

The pack is machine-checked: docs/clinical-safety/validate_pack.py asserts the
hazards are fully populated, risk ratings use the defined 5x5 matrix, every
control-evidence reference resolves to a real artifact, the safety case cites
every hazard, and every document carries the simulation banner (9/9).
</commit_message>
<xml_diff>
--- a/docs/Build-Progress-Log.docx
+++ b/docs/Build-Progress-Log.docx
@@ -8561,6 +8561,141 @@
       <w:pPr>
         <w:pStyle w:val="Heading1"/>
       </w:pPr>
+      <w:r>
+        <w:t xml:space="preserve">Phase 11 — Clinical Safety + Information Governance</w:t>
+      </w:r>
+    </w:p>
+    <w:p>
+      <w:r>
+        <w:t xml:space="preserve">Status: COMPLETE (2026-06-15). A DCB0129/0160/DTAC/DPIA-inspired governance pack: specific (12 named hazards, each mapped to the real file/scenario that implements its control), professional (risk-management plan + hazard log + safety case + DPIA + DTAC, cross-referenced), and clearly a simulation (synthetic-data banner on every document). The pack is machine-checked — validate_pack.py passes 9/9. Delivers Definition-of-Done item 10 (clinical-safety + IG docs exist and are specific).</w:t>
+      </w:r>
+    </w:p>
+    <w:p>
+      <w:pPr>
+        <w:pStyle w:val="Heading3"/>
+      </w:pPr>
+      <w:r>
+        <w:t xml:space="preserve">What was written</w:t>
+      </w:r>
+    </w:p>
+    <w:p>
+      <w:pPr>
+        <w:pStyle w:val="ListParagraph"/>
+        <w:numPr>
+          <w:ilvl w:val="0"/>
+          <w:numId w:val="2"/>
+        </w:numPr>
+        <w:spacing w:after="80"/>
+      </w:pPr>
+      <w:r>
+        <w:rPr>
+          <w:b/>
+          <w:bCs/>
+        </w:rPr>
+        <w:t xml:space="preserve">docs/clinical-safety/ </w:t>
+      </w:r>
+      <w:r>
+        <w:t xml:space="preserve">— clinical-risk-management-plan.md (DCB0129 CRMP: scope, simulated CSO, 5x5 risk matrix), hazard-log.csv (12 named hazards H-01..H-12 with causes, clinical effect, named controls + control evidence, initial vs residual risk), clinical-safety-case-report.md (CSCR), README, and validate_pack.py (the gate).</w:t>
+      </w:r>
+    </w:p>
+    <w:p>
+      <w:pPr>
+        <w:pStyle w:val="ListParagraph"/>
+        <w:numPr>
+          <w:ilvl w:val="0"/>
+          <w:numId w:val="2"/>
+        </w:numPr>
+        <w:spacing w:after="80"/>
+      </w:pPr>
+      <w:r>
+        <w:rPr>
+          <w:b/>
+          <w:bCs/>
+        </w:rPr>
+        <w:t xml:space="preserve">docs/information-governance/ </w:t>
+      </w:r>
+      <w:r>
+        <w:t xml:space="preserve">— dpia.md (DPIA-inspired: data flow, 6 data-protection risks + mitigations, minimisation) and dtac-assessment.md (DTAC-inspired self-assessment across the 5 domains, each with evidence + the gap a real deployment would close), README.</w:t>
+      </w:r>
+    </w:p>
+    <w:p>
+      <w:pPr>
+        <w:pStyle w:val="Heading3"/>
+      </w:pPr>
+      <w:r>
+        <w:t xml:space="preserve">The safety argument, the gate, and commit</w:t>
+      </w:r>
+    </w:p>
+    <w:p>
+      <w:pPr>
+        <w:pStyle w:val="ListParagraph"/>
+        <w:numPr>
+          <w:ilvl w:val="0"/>
+          <w:numId w:val="2"/>
+        </w:numPr>
+        <w:spacing w:after="80"/>
+      </w:pPr>
+      <w:r>
+        <w:t xml:space="preserve">Argument: AI assists; deterministic rules and humans decide; everything is audited; the bot fails safe. The empirical evidence is the Phase 10 figure — 0 of 15 referrals auto-created while carrying a safety flag. Residual risk: no hazard above Moderate on the software side; the one residual High (H-11, review-queue backlog) is an operational risk owned by the deploying organisation under DCB0160.</w:t>
+      </w:r>
+    </w:p>
+    <w:p>
+      <w:pPr>
+        <w:pStyle w:val="ListParagraph"/>
+        <w:numPr>
+          <w:ilvl w:val="0"/>
+          <w:numId w:val="2"/>
+        </w:numPr>
+        <w:spacing w:after="80"/>
+      </w:pPr>
+      <w:r>
+        <w:rPr>
+          <w:b/>
+          <w:bCs/>
+        </w:rPr>
+        <w:t xml:space="preserve">Gate (machine-checked): </w:t>
+      </w:r>
+      <w:r>
+        <w:t xml:space="preserve">python docs/clinical-safety/validate_pack.py — 9/9. The standout check: every control-evidence reference must resolve to a real file or scenario, so the safety case cannot claim an unimplemented control and cannot silently rot.</w:t>
+      </w:r>
+    </w:p>
+    <w:p>
+      <w:pPr>
+        <w:pStyle w:val="ListParagraph"/>
+        <w:numPr>
+          <w:ilvl w:val="0"/>
+          <w:numId w:val="2"/>
+        </w:numPr>
+        <w:spacing w:after="80"/>
+      </w:pPr>
+      <w:r>
+        <w:rPr>
+          <w:b/>
+          <w:bCs/>
+        </w:rPr>
+        <w:t xml:space="preserve">Commit: </w:t>
+      </w:r>
+      <w:r>
+        <w:t xml:space="preserve">docs/clinical-safety/ + docs/information-governance/ + docs/testing/phase11-acceptance.md + README key-documents/phase table.</w:t>
+      </w:r>
+    </w:p>
+    <w:p>
+      <w:pPr>
+        <w:pStyle w:val="Heading3"/>
+      </w:pPr>
+      <w:r>
+        <w:t xml:space="preserve">Next — Phase 12</w:t>
+      </w:r>
+    </w:p>
+    <w:p>
+      <w:r>
+        <w:t xml:space="preserve">Testing + evidence pack: consolidate the per-phase acceptance records and demonstrate all 15 scenarios (happy / business-exception / system-exception / human-review).</w:t>
+      </w:r>
+    </w:p>
+    <w:p>
+      <w:pPr>
+        <w:pStyle w:val="Heading1"/>
+      </w:pPr>
       <w:bookmarkStart w:id="12" w:name="_Toc232111796"/>
       <w:r>
         <w:lastRenderedPageBreak/>
@@ -10783,7 +10918,7 @@
                 <w:sz w:val="20"/>
                 <w:szCs w:val="20"/>
               </w:rPr>
-              <w:t>⬜</w:t>
+              <w:t>✅ Done</w:t>
             </w:r>
           </w:p>
         </w:tc>

</xml_diff>

<commit_message>
Add testing + consolidated evidence pack (Phase 12)
services/testing/ consolidates the per-phase acceptance records into a
generated, machine-checked evidence pack:
- evidence_model.py fuses oracles + real decisions + post-review resolution
  and scans each phaseN-acceptance.md for its PASS result (no hand-typed numbers)
- build_evidence_pack.py generates docs/testing/evidence-pack.md
  (11-gate build status, headline KPIs, full 15-scenario traceability matrix)
- validate_acceptance.py = the Phase 12 gate (8/8): all 15 scenarios across
  the 4 outcome classes, 15/15 vs oracles, human review changes outcome,
  0 unsafe auto-creates, audit reconciliation, all 11 prior gates PASS, and a
  regenerate-and-compare check so the pack can't drift from the artifacts

Also adds docs/testing/test-plan.md (methodology + DoD traceability) and
phase12-acceptance.md; updates README phase table + Build-Progress-Log.docx.
</commit_message>
<xml_diff>
--- a/docs/Build-Progress-Log.docx
+++ b/docs/Build-Progress-Log.docx
@@ -8690,6 +8690,148 @@
     <w:p>
       <w:r>
         <w:t xml:space="preserve">Testing + evidence pack: consolidate the per-phase acceptance records and demonstrate all 15 scenarios (happy / business-exception / system-exception / human-review).</w:t>
+      </w:r>
+    </w:p>
+    <w:p>
+      <w:pPr>
+        <w:pStyle w:val="Heading1"/>
+      </w:pPr>
+      <w:r>
+        <w:t xml:space="preserve">Phase 12 – Testing + Evidence Pack</w:t>
+      </w:r>
+    </w:p>
+    <w:p>
+      <w:r>
+        <w:t xml:space="preserve">Status: COMPLETE (2026-06-15). All 15 synthetic referral scenarios are tested end-to-end and demonstrated across the four outcome classes (happy / human-review / business-exception / system-exception). Every bot decision matches the independent Phase 3 oracle (15/15), human review changes the outcome in both directions, the core safety invariant holds (0 unsafe auto-creates), the run reconciles with the audit log, and all 11 prior phase acceptance gates are PASS. The evidence pack is generated from the real artifacts (no hand-typed figures) and machine-checked – validate_acceptance.py passes 8/8. Delivers Definition-of-Done item 7 (business vs system exceptions distinct) and consolidates the whole-project test evidence.</w:t>
+      </w:r>
+    </w:p>
+    <w:p>
+      <w:pPr>
+        <w:pStyle w:val="Heading3"/>
+      </w:pPr>
+      <w:r>
+        <w:t xml:space="preserve">What was built</w:t>
+      </w:r>
+    </w:p>
+    <w:p>
+      <w:pPr>
+        <w:pStyle w:val="ListParagraph"/>
+        <w:numPr>
+          <w:ilvl w:val="0"/>
+          <w:numId w:val="2"/>
+        </w:numPr>
+        <w:spacing w:after="80"/>
+      </w:pPr>
+      <w:r>
+        <w:rPr>
+          <w:b/>
+          <w:bCs/>
+        </w:rPr>
+        <w:t xml:space="preserve">services/testing/ </w:t>
+      </w:r>
+      <w:r>
+        <w:t xml:space="preserve">– evidence_model.py (the single source of truth: fuses the oracles, the bot’s real decisions and the post-review resolution into per-referral evidence rows, and scans each phaseN-acceptance.md for its PASS result), build_evidence_pack.py (generates docs/testing/evidence-pack.md), validate_acceptance.py (the gate, 8/8), and README.md.</w:t>
+      </w:r>
+    </w:p>
+    <w:p>
+      <w:pPr>
+        <w:pStyle w:val="ListParagraph"/>
+        <w:numPr>
+          <w:ilvl w:val="0"/>
+          <w:numId w:val="2"/>
+        </w:numPr>
+        <w:spacing w:after="80"/>
+      </w:pPr>
+      <w:r>
+        <w:rPr>
+          <w:b/>
+          <w:bCs/>
+        </w:rPr>
+        <w:t xml:space="preserve">docs/testing/ </w:t>
+      </w:r>
+      <w:r>
+        <w:t xml:space="preserve">– test-plan.md (the methodology: approach, the four outcome classes, scenario coverage, environment, entry/exit criteria, DoD traceability), the generated evidence-pack.md (consolidated build status, headline KPIs, and the full 15-scenario expected-vs-actual traceability matrix), and phase12-acceptance.md.</w:t>
+      </w:r>
+    </w:p>
+    <w:p>
+      <w:pPr>
+        <w:pStyle w:val="Heading3"/>
+      </w:pPr>
+      <w:r>
+        <w:t xml:space="preserve">How to run, the gate, and commit</w:t>
+      </w:r>
+    </w:p>
+    <w:p>
+      <w:pPr>
+        <w:pStyle w:val="ListParagraph"/>
+        <w:numPr>
+          <w:ilvl w:val="0"/>
+          <w:numId w:val="2"/>
+        </w:numPr>
+        <w:spacing w:after="80"/>
+      </w:pPr>
+      <w:r>
+        <w:rPr>
+          <w:b/>
+          <w:bCs/>
+        </w:rPr>
+        <w:t xml:space="preserve">Run: </w:t>
+      </w:r>
+      <w:r>
+        <w:t xml:space="preserve">python services/testing/build_evidence_pack.py (writes docs/testing/evidence-pack.md), then python services/testing/validate_acceptance.py (8/8). Depends on a completed Phase 8 + Phase 9 run being present in data/ (those outputs are gitignored; regenerate from a run).</w:t>
+      </w:r>
+    </w:p>
+    <w:p>
+      <w:pPr>
+        <w:pStyle w:val="ListParagraph"/>
+        <w:numPr>
+          <w:ilvl w:val="0"/>
+          <w:numId w:val="2"/>
+        </w:numPr>
+        <w:spacing w:after="80"/>
+      </w:pPr>
+      <w:r>
+        <w:rPr>
+          <w:b/>
+          <w:bCs/>
+        </w:rPr>
+        <w:t xml:space="preserve">Gate (machine-checked): </w:t>
+      </w:r>
+      <w:r>
+        <w:t xml:space="preserve">8/8 – 15 referrals present; 15/15 match the oracle; all four outcome classes (3/10/1/1); human review changes the outcome (6 approved-in, 4 rejected-out); 0 auto-created with a safety flag; every referral in the audit log; all 11 prior gates PASS. The standout check regenerates the committed evidence-pack.md and compares it byte-for-byte, so the documentation cannot drift from the artifacts.</w:t>
+      </w:r>
+    </w:p>
+    <w:p>
+      <w:pPr>
+        <w:pStyle w:val="ListParagraph"/>
+        <w:numPr>
+          <w:ilvl w:val="0"/>
+          <w:numId w:val="2"/>
+        </w:numPr>
+        <w:spacing w:after="80"/>
+      </w:pPr>
+      <w:r>
+        <w:rPr>
+          <w:b/>
+          <w:bCs/>
+        </w:rPr>
+        <w:t xml:space="preserve">Commit: </w:t>
+      </w:r>
+      <w:r>
+        <w:t xml:space="preserve">services/testing/ + docs/testing/{test-plan,evidence-pack,phase12-acceptance}.md + README key-documents/phase table + this log.</w:t>
+      </w:r>
+    </w:p>
+    <w:p>
+      <w:pPr>
+        <w:pStyle w:val="Heading3"/>
+      </w:pPr>
+      <w:r>
+        <w:t xml:space="preserve">Next – Phase 13</w:t>
+      </w:r>
+    </w:p>
+    <w:p>
+      <w:r>
+        <w:t xml:space="preserve">GitHub / CV / LinkedIn packaging: interview-ready README, demo script, STAR stories, and bullet points.</w:t>
       </w:r>
     </w:p>
     <w:p>

</xml_diff>

<commit_message>
Package the project for GitHub/CV/LinkedIn (Phase 13)
Interview-ready README (results, quick start, links), plus a CV/LinkedIn
interview pack: demo script, STAR stories, interview Q&A, copy-paste CV and
LinkedIn bullets. Machine-checked gate (validate_pack.py, 5/5) verifies the
deliverables, synthetic-data banner, complete phase table, link integrity, and
that headline figures match the generated evidence pack. All 13 phases done.
</commit_message>
<xml_diff>
--- a/docs/Build-Progress-Log.docx
+++ b/docs/Build-Progress-Log.docx
@@ -8832,6 +8832,148 @@
     <w:p>
       <w:r>
         <w:t xml:space="preserve">GitHub / CV / LinkedIn packaging: interview-ready README, demo script, STAR stories, and bullet points.</w:t>
+      </w:r>
+    </w:p>
+    <w:p>
+      <w:pPr>
+        <w:pStyle w:val="Heading1"/>
+      </w:pPr>
+      <w:r>
+        <w:t xml:space="preserve">Phase 13 – GitHub / CV / LinkedIn Packaging</w:t>
+      </w:r>
+    </w:p>
+    <w:p>
+      <w:r>
+        <w:t xml:space="preserve">Status: COMPLETE (2026-06-15). The project is packaged for a public GitHub repository and for CV / LinkedIn / interview use. The top-level README is now interview-ready (a Results-at-a-glance table, a Quick start, and links to the dashboard and the interview pack), and a dedicated interview pack ships a demo script, STAR stories, an interview Q&amp;A, and copy-paste CV/LinkedIn bullets. Every claim traces back to the generated evidence pack, and the packaging is machine-checked – validate_pack.py passes 5/5. Delivers Definition-of-Done item 11 (README, demo script and CV/LinkedIn assets are interview-ready) and completes the roadmap: all 13 phases are done.</w:t>
+      </w:r>
+    </w:p>
+    <w:p>
+      <w:pPr>
+        <w:pStyle w:val="Heading3"/>
+      </w:pPr>
+      <w:r>
+        <w:t xml:space="preserve">What was built</w:t>
+      </w:r>
+    </w:p>
+    <w:p>
+      <w:pPr>
+        <w:pStyle w:val="ListParagraph"/>
+        <w:numPr>
+          <w:ilvl w:val="0"/>
+          <w:numId w:val="2"/>
+        </w:numPr>
+        <w:spacing w:after="80"/>
+      </w:pPr>
+      <w:r>
+        <w:rPr>
+          <w:b/>
+          <w:bCs/>
+        </w:rPr>
+        <w:t xml:space="preserve">docs/cv-linkedin/ </w:t>
+      </w:r>
+      <w:r>
+        <w:t xml:space="preserve">– cv-linkedin-bullets.md (CV entries full/compact/one-liner, LinkedIn About + launch post, skills list, elevator pitch), star-stories.md (seven Situation-Task-Action-Result stories, each naming its evidence), interview-qa.md (likely interview questions with grounded answers and the file to open for proof), demo-script.md (an 8–10 minute live-demo / screen-recording walkthrough), a README index, and validate_pack.py (the Phase 13 gate, 5/5).</w:t>
+      </w:r>
+    </w:p>
+    <w:p>
+      <w:pPr>
+        <w:pStyle w:val="ListParagraph"/>
+        <w:numPr>
+          <w:ilvl w:val="0"/>
+          <w:numId w:val="2"/>
+        </w:numPr>
+        <w:spacing w:after="80"/>
+      </w:pPr>
+      <w:r>
+        <w:rPr>
+          <w:b/>
+          <w:bCs/>
+        </w:rPr>
+        <w:t xml:space="preserve">README.md + docs/testing/ </w:t>
+      </w:r>
+      <w:r>
+        <w:t xml:space="preserve">– top-level README updated (phase table marked all-13-complete, Results-at-a-glance and Quick start sections, interview-pack link), plus phase13-acceptance.md recording the gate result.</w:t>
+      </w:r>
+    </w:p>
+    <w:p>
+      <w:pPr>
+        <w:pStyle w:val="Heading3"/>
+      </w:pPr>
+      <w:r>
+        <w:t xml:space="preserve">How to run, the gate, and commit</w:t>
+      </w:r>
+    </w:p>
+    <w:p>
+      <w:pPr>
+        <w:pStyle w:val="ListParagraph"/>
+        <w:numPr>
+          <w:ilvl w:val="0"/>
+          <w:numId w:val="2"/>
+        </w:numPr>
+        <w:spacing w:after="80"/>
+      </w:pPr>
+      <w:r>
+        <w:rPr>
+          <w:b/>
+          <w:bCs/>
+        </w:rPr>
+        <w:t xml:space="preserve">Run: </w:t>
+      </w:r>
+      <w:r>
+        <w:t xml:space="preserve">python docs/cv-linkedin/validate_pack.py (5/5). Read-only over the docs; it creates nothing. The headline figures it checks are themselves generated by the Phase 10/12 pipeline.</w:t>
+      </w:r>
+    </w:p>
+    <w:p>
+      <w:pPr>
+        <w:pStyle w:val="ListParagraph"/>
+        <w:numPr>
+          <w:ilvl w:val="0"/>
+          <w:numId w:val="2"/>
+        </w:numPr>
+        <w:spacing w:after="80"/>
+      </w:pPr>
+      <w:r>
+        <w:rPr>
+          <w:b/>
+          <w:bCs/>
+        </w:rPr>
+        <w:t xml:space="preserve">Gate (machine-checked): </w:t>
+      </w:r>
+      <w:r>
+        <w:t xml:space="preserve">5/5 – all five deliverables present; the synthetic-data banner on every cv-linkedin doc; the README phase table complete (Phase 13 done, no pending rows); every relative link in the docs resolves; and the headline figures (15 referrals, 15/15 vs oracle, 9 created, 0 unsafe auto-creates) appear both in the generated evidence pack and in the CV-facing assets that quote them, so the portfolio cannot claim a number the evidence does not back.</w:t>
+      </w:r>
+    </w:p>
+    <w:p>
+      <w:pPr>
+        <w:pStyle w:val="ListParagraph"/>
+        <w:numPr>
+          <w:ilvl w:val="0"/>
+          <w:numId w:val="2"/>
+        </w:numPr>
+        <w:spacing w:after="80"/>
+      </w:pPr>
+      <w:r>
+        <w:rPr>
+          <w:b/>
+          <w:bCs/>
+        </w:rPr>
+        <w:t xml:space="preserve">Commit: </w:t>
+      </w:r>
+      <w:r>
+        <w:t xml:space="preserve">docs/cv-linkedin/ + docs/testing/phase13-acceptance.md + README (phase table / Results / Quick start / key-documents) + this log.</w:t>
+      </w:r>
+    </w:p>
+    <w:p>
+      <w:pPr>
+        <w:pStyle w:val="Heading3"/>
+      </w:pPr>
+      <w:r>
+        <w:t xml:space="preserve">Project complete</w:t>
+      </w:r>
+    </w:p>
+    <w:p>
+      <w:r>
+        <w:t xml:space="preserve">All 13 phases are done, each with a committed acceptance record and a passing gate. The whole-project Definition of Done (all 12 items) is met; see docs/testing/evidence-pack.md for the consolidated build status and docs/business/project-scope.md for the DoD.</w:t>
       </w:r>
     </w:p>
     <w:p>

</xml_diff>